<commit_message>
docs: add multi-port URLs and session-collision troubleshooting to manuals
User_Manual: new "Testing Multiple Roles at Once (Multi-Port Mode)"
section (single-port default vs. localhost:3000-3003 per role),
troubleshooting entry for the role-guard fix (user-facing framing,
not RLS internals), and the n8n workflow 01 trigger-source update
(orders INSERT -> payments success).

Mobile_App_User_Manual: new "Connecting to the Backend" section
clarifying EXPO_PUBLIC_API_BASE_URL/LAN IP and that the web multi-port
scheme is browser-only, not something mobile needs.

Both TOCs re-verified against actual rendered PDF pages per the
project's static-TOC convention.

Co-Authored-By: Claude Sonnet 5 <noreply@anthropic.com>
</commit_message>
<xml_diff>
--- a/docs/Mobile_App_User_Manual.docx
+++ b/docs/Mobile_App_User_Manual.docx
@@ -537,6 +537,25 @@
         <w:t xml:space="preserve">Each app is signed in as one role at a time. To use the app as a different role (for example, to also act as a delivery partner), sign out from within that portal — for the Customer App, this is the Sign out row on the Account tab (§3.8); for the Delivery Partner App, it's the Sign out link in the dashboard header — and pick the other role from the role picker screen shown at launch.</w:t>
       </w:r>
     </w:p>
+    <w:p>
+      <w:pPr>
+        <w:pStyle w:val="Heading2"/>
+      </w:pPr>
+      <w:r>
+        <w:t>2.5 Connecting to the Backend (Web vs. Mobile)</w:t>
+      </w:r>
+    </w:p>
+    <w:p>
+      <w:r>
+        <w:t>The mobile app always talks to one backend address at a time, configured at build time via the EXPO_PUBLIC_API_BASE_URL environment variable — typically your development machine's LAN IP address (for example http://192.168.1.42:3000) so a phone on the same Wi-Fi network can reach it, since "localhost" on a phone means the phone itself, not your computer.</w:t>
+      </w:r>
+    </w:p>
+    <w:p>
+      <w:r>
+        <w:t>This is different from the web app's optional multi-port testing mode (four ports, one per role, so a customer, vendor, delivery partner, and admin can all be signed in at once in the same browser — see the web User Manual, section 2.5). That multi-port scheme is a browser-only convenience for testing multiple roles side by side; the mobile app doesn't need it and isn't affected by it — it simply signs in as one role at a time (Customer or Delivery Partner, see section 2.4) against the single server address it was built with.</w:t>
+      </w:r>
+    </w:p>
+    <w:p/>
     <w:p>
       <w:pPr>
         <w:pStyle w:val="Heading1"/>
@@ -1941,7 +1960,7 @@
           </w:tcPr>
           <w:p>
             <w:r>
-              <w:t xml:space="preserve">This is a demo/development build that points at a specific local server address. If Home, Store Detail, or any other screen fails to load data, the development server it points to is most likely not running or the phone is not on the same network as it — this is expected for a local/dev deployment, not a bug to work around in the field. Contact whoever set up your build to confirm the server address.</w:t>
+              <w:t>This is a demo/development build that points at one specific server address (your development machine's LAN IP, set via EXPO_PUBLIC_API_BASE_URL — see section 2.5). If Home, Store Detail, or any other screen fails to load data, the development server is most likely not running, or the phone is not on the same Wi-Fi network as it — this is expected for a local/dev deployment, not a bug to work around in the field. Contact whoever set up your build to confirm the server address.</w:t>
             </w:r>
           </w:p>
         </w:tc>

</xml_diff>

<commit_message>
docs: refresh both user manuals for the Figma-kit redesign and follow-on fixes
Web manual (v2.0): all portal screenshots retaken from a production
build with one real order driven through every portal; adds a What's New
section, restart-signs-you-out note, My Profile / Reset password, and the
cart-conflict dialog. Mobile manual (v3.0): customer wireframes replaced
with frames from a real screen recording (personal email/address blurred);
Account and Delivery Partner sections still flagged as v2.0 wireframes.
Records the update process and gotchas in CLAUDE.md and MEMORY.md.

Co-Authored-By: Claude Sonnet 5.5 <noreply@anthropic.com>
</commit_message>
<xml_diff>
--- a/docs/Mobile_App_User_Manual.docx
+++ b/docs/Mobile_App_User_Manual.docx
@@ -67,7 +67,7 @@
           <w:sz w:val="22"/>
           <w:szCs w:val="22"/>
         </w:rPr>
-        <w:t xml:space="preserve">Version 2.0 — UberEats-style redesign</w:t>
+        <w:t>Version 3.0 — Figma-kit redesign, real screenshots</w:t>
       </w:r>
     </w:p>
     <w:p>
@@ -110,7 +110,7 @@
           <w:b/>
           <w:bCs/>
         </w:rPr>
-        <w:t xml:space="preserve">3</w:t>
+        <w:t>3</w:t>
       </w:r>
     </w:p>
     <w:p>
@@ -132,7 +132,7 @@
           <w:b/>
           <w:bCs/>
         </w:rPr>
-        <w:t xml:space="preserve">5</w:t>
+        <w:t>5</w:t>
       </w:r>
     </w:p>
     <w:p>
@@ -154,7 +154,7 @@
           <w:b/>
           <w:bCs/>
         </w:rPr>
-        <w:t xml:space="preserve">6</w:t>
+        <w:t>7</w:t>
       </w:r>
     </w:p>
     <w:p>
@@ -176,7 +176,7 @@
           <w:b/>
           <w:bCs/>
         </w:rPr>
-        <w:t xml:space="preserve">12</w:t>
+        <w:t>15</w:t>
       </w:r>
     </w:p>
     <w:p>
@@ -198,7 +198,7 @@
           <w:b/>
           <w:bCs/>
         </w:rPr>
-        <w:t xml:space="preserve">14</w:t>
+        <w:t>17</w:t>
       </w:r>
     </w:p>
     <w:p>
@@ -220,7 +220,7 @@
           <w:b/>
           <w:bCs/>
         </w:rPr>
-        <w:t xml:space="preserve">15</w:t>
+        <w:t>18</w:t>
       </w:r>
     </w:p>
     <w:p>
@@ -300,6 +300,14 @@
     </w:p>
     <w:p>
       <w:pPr>
+        <w:spacing w:after="160"/>
+      </w:pPr>
+      <w:r>
+        <w:t>Since version 2.0 the whole app was re-skinned with a new orange / navy / green look (pill-shaped buttons, rounded cards, colored section backgrounds) and the colors used behind white text were darkened so buttons and badges are easy to read. Signing in and Account changed too: the app now always starts signed out (each cold launch asks you to log in), and your name plus a Reset password option now appear in the Account tab (Customer) and the dashboard header (Delivery Partner). The Customer screenshots in Chapter 3 are real captures from a screen recording of the current build; the Account and Delivery Partner illustrations are still wireframes from version 2.0 and will be replaced once those screens are recorded.</w:t>
+      </w:r>
+    </w:p>
+    <w:p>
+      <w:pPr>
         <w:pStyle w:val="Heading2"/>
       </w:pPr>
       <w:r>
@@ -493,226 +501,36 @@
     </w:p>
     <w:p>
       <w:pPr>
-        <w:pStyle w:val="Heading2"/>
-      </w:pPr>
-      <w:r>
-        <w:t xml:space="preserve">2.3 Tab-Based Navigation (New)</w:t>
-      </w:r>
-    </w:p>
-    <w:p>
-      <w:pPr>
-        <w:spacing w:after="160"/>
-      </w:pPr>
-      <w:r>
-        <w:t xml:space="preserve">Once signed in as a Customer, the app opens into a bottom tab bar with three tabs: Home, Orders, and Account. This replaces the earlier build's single stack of screens with no persistent navigation. The tab bar stays visible across Home, the Orders list, and the Account screen; it is intentionally hidden on screens you're meant to focus on one task at a time — Store Detail, Cart, Checkout, and an individual order's tracking screen — which are reached by tapping into them and dismissed with a back gesture or an explicit close/back control on that screen.</w:t>
-      </w:r>
-    </w:p>
-    <w:p>
-      <w:pPr>
-        <w:spacing w:after="160"/>
-        <w:ind w:left="360"/>
-      </w:pPr>
-      <w:r>
-        <w:rPr>
-          <w:i/>
-          <w:iCs/>
-          <w:color w:val="6B6A5F"/>
-        </w:rPr>
-        <w:t xml:space="preserve">Note: The Delivery Partner App is unaffected by this change — it remains a single dashboard screen once signed in, as described in Chapter 4.</w:t>
-      </w:r>
-    </w:p>
-    <w:p>
-      <w:pPr>
-        <w:pStyle w:val="Heading2"/>
-      </w:pPr>
-      <w:r>
-        <w:t xml:space="preserve">2.4 Switching Roles or Accounts</w:t>
-      </w:r>
-    </w:p>
-    <w:p>
-      <w:pPr>
-        <w:spacing w:after="160"/>
-      </w:pPr>
-      <w:r>
-        <w:t xml:space="preserve">Each app is signed in as one role at a time. To use the app as a different role (for example, to also act as a delivery partner), sign out from within that portal — for the Customer App, this is the Sign out row on the Account tab (§3.8); for the Delivery Partner App, it's the Sign out link in the dashboard header — and pick the other role from the role picker screen shown at launch.</w:t>
-      </w:r>
-    </w:p>
-    <w:p>
-      <w:pPr>
-        <w:pStyle w:val="Heading2"/>
-      </w:pPr>
-      <w:r>
-        <w:t>2.5 Connecting to the Backend (Web vs. Mobile)</w:t>
-      </w:r>
-    </w:p>
-    <w:p>
-      <w:r>
-        <w:t>The mobile app always talks to one backend address at a time, configured at build time via the EXPO_PUBLIC_API_BASE_URL environment variable — typically your development machine's LAN IP address (for example http://192.168.1.42:3000) so a phone on the same Wi-Fi network can reach it, since "localhost" on a phone means the phone itself, not your computer.</w:t>
-      </w:r>
-    </w:p>
-    <w:p>
-      <w:r>
-        <w:t>This is different from the web app's optional multi-port testing mode (four ports, one per role, so a customer, vendor, delivery partner, and admin can all be signed in at once in the same browser — see the web User Manual, section 2.5). That multi-port scheme is a browser-only convenience for testing multiple roles side by side; the mobile app doesn't need it and isn't affected by it — it simply signs in as one role at a time (Customer or Delivery Partner, see section 2.4) against the single server address it was built with.</w:t>
-      </w:r>
-    </w:p>
-    <w:p/>
-    <w:p>
-      <w:pPr>
-        <w:pStyle w:val="Heading1"/>
-        <w:pageBreakBefore/>
-      </w:pPr>
-      <w:r>
-        <w:t xml:space="preserve">Chapter 3 — Customer App</w:t>
-      </w:r>
-    </w:p>
-    <w:p>
-      <w:pPr>
-        <w:spacing w:after="160"/>
-      </w:pPr>
-      <w:r>
-        <w:t xml:space="preserve">The Customer App is organized around three bottom tabs — Home, Orders, Account — plus four full-focus screens reached by tapping into them: Store Detail, Cart (a bottom sheet), Checkout, and an order's individual Tracking screen. This chapter covers each in the order you'd naturally move through them.</w:t>
-      </w:r>
-    </w:p>
-    <w:p>
-      <w:pPr>
-        <w:pStyle w:val="Heading2"/>
-      </w:pPr>
-      <w:r>
-        <w:t xml:space="preserve">3.1 Home</w:t>
-      </w:r>
-    </w:p>
-    <w:p>
-      <w:pPr>
-        <w:spacing w:after="160"/>
-      </w:pPr>
-      <w:r>
-        <w:t xml:space="preserve">Home is the Home tab's screen and opens on a pull-to-refresh scroll view with, from top to bottom:</w:t>
-      </w:r>
-    </w:p>
-    <w:p>
-      <w:pPr>
-        <w:pStyle w:val="ListParagraph"/>
-        <w:numPr>
-          <w:ilvl w:val="0"/>
-          <w:numId w:val="2"/>
-        </w:numPr>
-        <w:spacing w:after="100"/>
-      </w:pPr>
-      <w:r>
-        <w:t xml:space="preserve">An address pill (“Deliver now · Current location”) — tapping it currently shows a “Coming soon” alert; address selection isn't wired up in this build.</w:t>
-      </w:r>
-    </w:p>
-    <w:p>
-      <w:pPr>
-        <w:pStyle w:val="ListParagraph"/>
-        <w:numPr>
-          <w:ilvl w:val="0"/>
-          <w:numId w:val="2"/>
-        </w:numPr>
-        <w:spacing w:after="100"/>
-      </w:pPr>
-      <w:r>
-        <w:t xml:space="preserve">A search pill (“Search restaurants or dishes”) — typing filters the store list further down by store name, cuisine tag, or the name of any dish/product sold at that store, so searching for a specific dish surfaces every store that sells it, not just stores whose own name matches.</w:t>
-      </w:r>
-    </w:p>
-    <w:p>
-      <w:pPr>
-        <w:pStyle w:val="ListParagraph"/>
-        <w:numPr>
-          <w:ilvl w:val="0"/>
-          <w:numId w:val="2"/>
-        </w:numPr>
-        <w:spacing w:after="100"/>
-      </w:pPr>
-      <w:r>
-        <w:t xml:space="preserve">A horizontally scrolling row of category chips (circular icons, one per cuisine/category) — tapping one filters the store list to that category; tapping the same chip again clears the filter.</w:t>
-      </w:r>
-    </w:p>
-    <w:p>
-      <w:pPr>
-        <w:pStyle w:val="ListParagraph"/>
-        <w:numPr>
-          <w:ilvl w:val="0"/>
-          <w:numId w:val="2"/>
-        </w:numPr>
-        <w:spacing w:after="100"/>
-      </w:pPr>
-      <w:r>
-        <w:t xml:space="preserve">A promo carousel — swipeable banner cards for stores currently running a promotion, each showing the store's promo text over its banner photo. Only stores with an active promo appear here, and the row is hidden entirely when none do.</w:t>
-      </w:r>
-    </w:p>
-    <w:p>
-      <w:pPr>
-        <w:pStyle w:val="ListParagraph"/>
-        <w:numPr>
-          <w:ilvl w:val="0"/>
-          <w:numId w:val="2"/>
-        </w:numPr>
-        <w:spacing w:after="100"/>
-      </w:pPr>
-      <w:r>
-        <w:t xml:space="preserve">An “Order again” row — up to 10 stores you've ordered from before, most recent first, each with a Reorder button that jumps straight to that store's Store Detail screen. Hidden for a new account with no order history.</w:t>
-      </w:r>
-    </w:p>
-    <w:p>
-      <w:pPr>
-        <w:pStyle w:val="ListParagraph"/>
-        <w:numPr>
-          <w:ilvl w:val="0"/>
-          <w:numId w:val="2"/>
-        </w:numPr>
-        <w:spacing w:after="100"/>
-      </w:pPr>
-      <w:r>
-        <w:t xml:space="preserve">A “Restaurants near you” list — every open, non-suspended store as a photo-forward card: 16:9 banner image (or a plate emoji placeholder if none is set), a favorite heart in the photo's corner (local-only, see §1.3), a promo badge overlaid on the photo when applicable, the store's name, and a single metadata line (star rating · average prep time · delivery fee, e.g. “★4.5 · 25 min · ₹30 delivery”).</w:t>
-      </w:r>
-    </w:p>
-    <w:p>
-      <w:pPr>
-        <w:spacing w:after="160"/>
-      </w:pPr>
-      <w:r>
-        <w:t xml:space="preserve">Tapping a store card, a promo card, or a reorder card all open that store's Store Detail screen. Pulling down from the top of the list refreshes every section (stores, categories, promos, reorder row) in one action.</w:t>
-      </w:r>
-    </w:p>
-    <w:p>
-      <w:pPr>
         <w:spacing w:after="80" w:before="120"/>
         <w:jc w:val="center"/>
       </w:pPr>
       <w:r>
         <w:drawing>
-          <wp:inline distT="0" distB="0" distL="0" distR="0">
-            <wp:extent cx="2476500" cy="2901950"/>
-            <wp:effectExtent t="0" r="0" b="0" l="0"/>
-            <wp:docPr id="1" name="" descr="" title=""/>
+          <wp:inline xmlns:a="http://schemas.openxmlformats.org/drawingml/2006/main" xmlns:pic="http://schemas.openxmlformats.org/drawingml/2006/picture">
+            <wp:extent cx="2103120" cy="4558390"/>
+            <wp:docPr id="8" name="Picture 8"/>
             <wp:cNvGraphicFramePr>
-              <a:graphicFrameLocks xmlns:a="http://schemas.openxmlformats.org/drawingml/2006/main" noChangeAspect="1"/>
+              <a:graphicFrameLocks noChangeAspect="1"/>
             </wp:cNvGraphicFramePr>
-            <a:graphic xmlns:a="http://schemas.openxmlformats.org/drawingml/2006/main">
+            <a:graphic>
               <a:graphicData uri="http://schemas.openxmlformats.org/drawingml/2006/picture">
-                <pic:pic xmlns:pic="http://schemas.openxmlformats.org/drawingml/2006/picture">
+                <pic:pic>
                   <pic:nvPicPr>
-                    <pic:cNvPr id="0" name="" descr=""/>
-                    <pic:cNvPicPr>
-                      <a:picLocks noChangeAspect="1" noChangeArrowheads="1"/>
-                    </pic:cNvPicPr>
+                    <pic:cNvPr id="0" name="login.jpg"/>
+                    <pic:cNvPicPr/>
                   </pic:nvPicPr>
                   <pic:blipFill>
-                    <a:blip r:embed="rId7" cstate="none"/>
-                    <a:srcRect/>
+                    <a:blip r:embed="rId15"/>
                     <a:stretch>
                       <a:fillRect/>
                     </a:stretch>
                   </pic:blipFill>
-                  <pic:spPr bwMode="auto">
+                  <pic:spPr>
                     <a:xfrm>
                       <a:off x="0" y="0"/>
-                      <a:ext cx="2476500" cy="2901950"/>
+                      <a:ext cx="2103120" cy="4558390"/>
                     </a:xfrm>
-                    <a:prstGeom prst="rect">
-                      <a:avLst/>
-                    </a:prstGeom>
+                    <a:prstGeom prst="rect"/>
                   </pic:spPr>
                 </pic:pic>
               </a:graphicData>
@@ -734,7 +552,15 @@
           <w:sz w:val="18"/>
           <w:szCs w:val="18"/>
         </w:rPr>
-        <w:t xml:space="preserve">Wireframe — Home tab layout (address pill, search, category chips, promo carousel, reorder row, store cards).</w:t>
+        <w:t>Screenshot — Customer sign-in screen (email, password, Log In).</w:t>
+      </w:r>
+    </w:p>
+    <w:p>
+      <w:pPr>
+        <w:spacing w:after="160"/>
+      </w:pPr>
+      <w:r>
+        <w:t>Always signed out at launch: the app does not remember your last session. Every time you open it from scratch you land on the role picker and sign in again. Switching between apps and coming back does not sign you out.</w:t>
       </w:r>
     </w:p>
     <w:p>
@@ -742,86 +568,15 @@
         <w:pStyle w:val="Heading2"/>
       </w:pPr>
       <w:r>
-        <w:t xml:space="preserve">3.2 Store Detail</w:t>
-      </w:r>
-    </w:p>
-    <w:p>
-      <w:pPr>
-        <w:spacing w:after="160"/>
-      </w:pPr>
-      <w:r>
-        <w:t xml:space="preserve">The Store Detail screen opens with a full-width hero banner (the store's banner photo, or a plate emoji on a tinted background if none is set), with a back chip and a favorite-heart chip overlaid on its corners. Below the hero is the store's name, cuisine tags, rating, and average prep time, followed by a closed/suspended banner if the store currently can't take orders.</w:t>
-      </w:r>
-    </w:p>
-    <w:p>
-      <w:pPr>
-        <w:spacing w:after="160"/>
-      </w:pPr>
-      <w:r>
-        <w:t xml:space="preserve">Below that, a row of category pills (e.g. Starters, Mains, Desserts) sticks to the top of the screen as you scroll past it, so you can always see which section you're in and tap a pill to jump straight to it — tapping a pill both scrolls to that section and highlights the pill; the highlight does not yet auto-update purely from scroll position, so it only changes when you tap a pill directly (see the Known Limitations note below).</w:t>
-      </w:r>
-    </w:p>
-    <w:p>
-      <w:pPr>
-        <w:spacing w:after="160"/>
-      </w:pPr>
-      <w:r>
-        <w:t xml:space="preserve">The menu itself is grouped into sections matching the store's own category labels (uncategorized items fall into a trailing “Other” group). Each item row shows:</w:t>
-      </w:r>
-    </w:p>
-    <w:p>
-      <w:pPr>
-        <w:pStyle w:val="ListParagraph"/>
-        <w:numPr>
-          <w:ilvl w:val="0"/>
-          <w:numId w:val="2"/>
-        </w:numPr>
-        <w:spacing w:after="100"/>
-      </w:pPr>
-      <w:r>
-        <w:t xml:space="preserve">A veg/non-veg indicator dot, the item name, and its description (up to 2 lines).</w:t>
-      </w:r>
-    </w:p>
-    <w:p>
-      <w:pPr>
-        <w:pStyle w:val="ListParagraph"/>
-        <w:numPr>
-          <w:ilvl w:val="0"/>
-          <w:numId w:val="2"/>
-        </w:numPr>
-        <w:spacing w:after="100"/>
-      </w:pPr>
-      <w:r>
-        <w:t xml:space="preserve">Its price.</w:t>
-      </w:r>
-    </w:p>
-    <w:p>
-      <w:pPr>
-        <w:pStyle w:val="ListParagraph"/>
-        <w:numPr>
-          <w:ilvl w:val="0"/>
-          <w:numId w:val="2"/>
-        </w:numPr>
-        <w:spacing w:after="100"/>
-      </w:pPr>
-      <w:r>
-        <w:t xml:space="preserve">A thumbnail image with a circular “+” Quick Add button overlaid on its corner.</w:t>
-      </w:r>
-    </w:p>
-    <w:p>
-      <w:pPr>
-        <w:spacing w:after="160"/>
-      </w:pPr>
-      <w:r>
-        <w:t xml:space="preserve">Tapping an item with no configurable options adds it straight to your cart. Tapping an item that has size/add-on options (configured by the store owner) instead opens a bottom-sheet customization view, where you choose required and optional groups before adding it to your cart; a required group left with no valid options keeps Add-to-cart disabled rather than letting you submit an incomplete selection. Every item can also carry its own special-instructions note (e.g. “no onions”), entered in that same customization step.</w:t>
-      </w:r>
-    </w:p>
-    <w:p>
-      <w:pPr>
-        <w:spacing w:after="160"/>
-      </w:pPr>
-      <w:r>
-        <w:t xml:space="preserve">Adding an item from a different store than what's already in your cart prompts a native confirmation dialog to clear the current cart first — a cart can only ever hold items from one store at a time.</w:t>
+        <w:t xml:space="preserve">2.3 Tab-Based Navigation (New)</w:t>
+      </w:r>
+    </w:p>
+    <w:p>
+      <w:pPr>
+        <w:spacing w:after="160"/>
+      </w:pPr>
+      <w:r>
+        <w:t xml:space="preserve">Once signed in as a Customer, the app opens into a bottom tab bar with three tabs: Home, Orders, and Account. This replaces the earlier build's single stack of screens with no persistent navigation. The tab bar stays visible across Home, the Orders list, and the Account screen; it is intentionally hidden on screens you're meant to focus on one task at a time — Store Detail, Cart, Checkout, and an individual order's tracking screen — which are reached by tapping into them and dismissed with a back gesture or an explicit close/back control on that screen.</w:t>
       </w:r>
     </w:p>
     <w:p>
@@ -835,7 +590,161 @@
           <w:iCs/>
           <w:color w:val="6B6A5F"/>
         </w:rPr>
-        <w:t xml:space="preserve">Note: The pill-nav's active highlight only updates on tap, not on scroll — a minor known gap carried over from the web app's own scroll-spy nuance, not a functional bug (the pill row still scrolls correctly to every section).</w:t>
+        <w:t xml:space="preserve">Note: The Delivery Partner App is unaffected by this change — it remains a single dashboard screen once signed in, as described in Chapter 4.</w:t>
+      </w:r>
+    </w:p>
+    <w:p>
+      <w:pPr>
+        <w:pStyle w:val="Heading2"/>
+      </w:pPr>
+      <w:r>
+        <w:t xml:space="preserve">2.4 Switching Roles or Accounts</w:t>
+      </w:r>
+    </w:p>
+    <w:p>
+      <w:pPr>
+        <w:spacing w:after="160"/>
+      </w:pPr>
+      <w:r>
+        <w:t xml:space="preserve">Each app is signed in as one role at a time. To use the app as a different role (for example, to also act as a delivery partner), sign out from within that portal — for the Customer App, this is the Sign out row on the Account tab (§3.8); for the Delivery Partner App, it's the Sign out link in the dashboard header — and pick the other role from the role picker screen shown at launch.</w:t>
+      </w:r>
+    </w:p>
+    <w:p>
+      <w:pPr>
+        <w:pStyle w:val="Heading2"/>
+      </w:pPr>
+      <w:r>
+        <w:t>2.5 Connecting to the Backend (Web vs. Mobile)</w:t>
+      </w:r>
+    </w:p>
+    <w:p>
+      <w:r>
+        <w:t>The mobile app always talks to one backend address at a time, configured at build time via the EXPO_PUBLIC_API_BASE_URL environment variable — typically your development machine's LAN IP address (for example http://192.168.1.42:3000) so a phone on the same Wi-Fi network can reach it, since "localhost" on a phone means the phone itself, not your computer.</w:t>
+      </w:r>
+    </w:p>
+    <w:p>
+      <w:r>
+        <w:t>This is different from the web app's optional multi-port testing mode (four ports, one per role, so a customer, vendor, delivery partner, and admin can all be signed in at once in the same browser — see the web User Manual, section 2.5). That multi-port scheme is a browser-only convenience for testing multiple roles side by side; the mobile app doesn't need it and isn't affected by it — it simply signs in as one role at a time (Customer or Delivery Partner, see section 2.4) against the single server address it was built with.</w:t>
+      </w:r>
+    </w:p>
+    <w:p/>
+    <w:p>
+      <w:pPr>
+        <w:pStyle w:val="Heading1"/>
+        <w:pageBreakBefore/>
+      </w:pPr>
+      <w:r>
+        <w:t xml:space="preserve">Chapter 3 — Customer App</w:t>
+      </w:r>
+    </w:p>
+    <w:p>
+      <w:pPr>
+        <w:spacing w:after="160"/>
+      </w:pPr>
+      <w:r>
+        <w:t xml:space="preserve">The Customer App is organized around three bottom tabs — Home, Orders, Account — plus four full-focus screens reached by tapping into them: Store Detail, Cart (a bottom sheet), Checkout, and an order's individual Tracking screen. This chapter covers each in the order you'd naturally move through them.</w:t>
+      </w:r>
+    </w:p>
+    <w:p>
+      <w:pPr>
+        <w:pStyle w:val="Heading2"/>
+      </w:pPr>
+      <w:r>
+        <w:t xml:space="preserve">3.1 Home</w:t>
+      </w:r>
+    </w:p>
+    <w:p>
+      <w:pPr>
+        <w:spacing w:after="160"/>
+      </w:pPr>
+      <w:r>
+        <w:t xml:space="preserve">Home is the Home tab's screen and opens on a pull-to-refresh scroll view with, from top to bottom:</w:t>
+      </w:r>
+    </w:p>
+    <w:p>
+      <w:pPr>
+        <w:pStyle w:val="ListParagraph"/>
+        <w:numPr>
+          <w:ilvl w:val="0"/>
+          <w:numId w:val="2"/>
+        </w:numPr>
+        <w:spacing w:after="100"/>
+      </w:pPr>
+      <w:r>
+        <w:t xml:space="preserve">An address pill (“Deliver now · Current location”) — tapping it currently shows a “Coming soon” alert; address selection isn't wired up in this build.</w:t>
+      </w:r>
+    </w:p>
+    <w:p>
+      <w:pPr>
+        <w:pStyle w:val="ListParagraph"/>
+        <w:numPr>
+          <w:ilvl w:val="0"/>
+          <w:numId w:val="2"/>
+        </w:numPr>
+        <w:spacing w:after="100"/>
+      </w:pPr>
+      <w:r>
+        <w:t xml:space="preserve">A search pill (“Search restaurants or dishes”) — typing filters the store list further down by store name, cuisine tag, or the name of any dish/product sold at that store, so searching for a specific dish surfaces every store that sells it, not just stores whose own name matches.</w:t>
+      </w:r>
+    </w:p>
+    <w:p>
+      <w:pPr>
+        <w:pStyle w:val="ListParagraph"/>
+        <w:numPr>
+          <w:ilvl w:val="0"/>
+          <w:numId w:val="2"/>
+        </w:numPr>
+        <w:spacing w:after="100"/>
+      </w:pPr>
+      <w:r>
+        <w:t xml:space="preserve">A horizontally scrolling row of category chips (circular icons, one per cuisine/category) — tapping one filters the store list to that category; tapping the same chip again clears the filter.</w:t>
+      </w:r>
+    </w:p>
+    <w:p>
+      <w:pPr>
+        <w:pStyle w:val="ListParagraph"/>
+        <w:numPr>
+          <w:ilvl w:val="0"/>
+          <w:numId w:val="2"/>
+        </w:numPr>
+        <w:spacing w:after="100"/>
+      </w:pPr>
+      <w:r>
+        <w:t xml:space="preserve">A promo carousel — swipeable banner cards for stores currently running a promotion, each showing the store's promo text over its banner photo. Only stores with an active promo appear here, and the row is hidden entirely when none do.</w:t>
+      </w:r>
+    </w:p>
+    <w:p>
+      <w:pPr>
+        <w:pStyle w:val="ListParagraph"/>
+        <w:numPr>
+          <w:ilvl w:val="0"/>
+          <w:numId w:val="2"/>
+        </w:numPr>
+        <w:spacing w:after="100"/>
+      </w:pPr>
+      <w:r>
+        <w:t xml:space="preserve">An “Order again” row — up to 10 stores you've ordered from before, most recent first, each with a Reorder button that jumps straight to that store's Store Detail screen. Hidden for a new account with no order history.</w:t>
+      </w:r>
+    </w:p>
+    <w:p>
+      <w:pPr>
+        <w:pStyle w:val="ListParagraph"/>
+        <w:numPr>
+          <w:ilvl w:val="0"/>
+          <w:numId w:val="2"/>
+        </w:numPr>
+        <w:spacing w:after="100"/>
+      </w:pPr>
+      <w:r>
+        <w:t xml:space="preserve">A “Restaurants near you” list — every open, non-suspended store as a photo-forward card: 16:9 banner image (or a plate emoji placeholder if none is set), a favorite heart in the photo's corner (local-only, see §1.3), a promo badge overlaid on the photo when applicable, the store's name, and a single metadata line (star rating · average prep time · delivery fee, e.g. “★4.5 · 25 min · ₹30 delivery”).</w:t>
+      </w:r>
+    </w:p>
+    <w:p>
+      <w:pPr>
+        <w:spacing w:after="160"/>
+      </w:pPr>
+      <w:r>
+        <w:t xml:space="preserve">Tapping a store card, a promo card, or a reorder card all open that store's Store Detail screen. Pulling down from the top of the list refreshes every section (stores, categories, promos, reorder row) in one action.</w:t>
       </w:r>
     </w:p>
     <w:p>
@@ -845,37 +754,31 @@
       </w:pPr>
       <w:r>
         <w:drawing>
-          <wp:inline distT="0" distB="0" distL="0" distR="0">
-            <wp:extent cx="2476500" cy="2901950"/>
-            <wp:effectExtent t="0" r="0" b="0" l="0"/>
-            <wp:docPr id="2" name="" descr="" title=""/>
+          <wp:inline xmlns:a="http://schemas.openxmlformats.org/drawingml/2006/main" xmlns:pic="http://schemas.openxmlformats.org/drawingml/2006/picture">
+            <wp:extent cx="2103120" cy="4558390"/>
+            <wp:docPr id="9" name="Picture 9"/>
             <wp:cNvGraphicFramePr>
-              <a:graphicFrameLocks xmlns:a="http://schemas.openxmlformats.org/drawingml/2006/main" noChangeAspect="1"/>
+              <a:graphicFrameLocks noChangeAspect="1"/>
             </wp:cNvGraphicFramePr>
-            <a:graphic xmlns:a="http://schemas.openxmlformats.org/drawingml/2006/main">
+            <a:graphic>
               <a:graphicData uri="http://schemas.openxmlformats.org/drawingml/2006/picture">
-                <pic:pic xmlns:pic="http://schemas.openxmlformats.org/drawingml/2006/picture">
+                <pic:pic>
                   <pic:nvPicPr>
-                    <pic:cNvPr id="0" name="" descr=""/>
-                    <pic:cNvPicPr>
-                      <a:picLocks noChangeAspect="1" noChangeArrowheads="1"/>
-                    </pic:cNvPicPr>
+                    <pic:cNvPr id="0" name="home.jpg"/>
+                    <pic:cNvPicPr/>
                   </pic:nvPicPr>
                   <pic:blipFill>
-                    <a:blip r:embed="rId8" cstate="none"/>
-                    <a:srcRect/>
+                    <a:blip r:embed="rId16"/>
                     <a:stretch>
                       <a:fillRect/>
                     </a:stretch>
                   </pic:blipFill>
-                  <pic:spPr bwMode="auto">
+                  <pic:spPr>
                     <a:xfrm>
                       <a:off x="0" y="0"/>
-                      <a:ext cx="2476500" cy="2901950"/>
+                      <a:ext cx="2103120" cy="4558390"/>
                     </a:xfrm>
-                    <a:prstGeom prst="rect">
-                      <a:avLst/>
-                    </a:prstGeom>
+                    <a:prstGeom prst="rect"/>
                   </pic:spPr>
                 </pic:pic>
               </a:graphicData>
@@ -897,7 +800,7 @@
           <w:sz w:val="18"/>
           <w:szCs w:val="18"/>
         </w:rPr>
-        <w:t xml:space="preserve">Wireframe — Store Detail (hero banner, back/favorite chips, sticky category pill nav, menu item rows).</w:t>
+        <w:t>Screenshot — Home tab: search, category chips, Order again row, and store cards.</w:t>
       </w:r>
     </w:p>
     <w:p>
@@ -905,67 +808,86 @@
         <w:pStyle w:val="Heading2"/>
       </w:pPr>
       <w:r>
-        <w:t xml:space="preserve">3.3 Cart</w:t>
-      </w:r>
-    </w:p>
-    <w:p>
-      <w:pPr>
-        <w:spacing w:after="160"/>
-      </w:pPr>
-      <w:r>
-        <w:t xml:space="preserve">The cart opens as a bottom sheet over whichever screen you were on, not a separate full page — a dimmed backdrop covers the screen behind it, the sheet has a drag-handle bar at its top, and an ✕ close button returns you to where you were. Each line shows the item's thumbnail, name, any selected customization options, a quantity stepper (− / +), a Remove link, and a per-line note field. Below the line items:</w:t>
-      </w:r>
-    </w:p>
-    <w:p>
-      <w:pPr>
-        <w:pStyle w:val="ListParagraph"/>
-        <w:numPr>
-          <w:ilvl w:val="0"/>
-          <w:numId w:val="2"/>
-        </w:numPr>
-        <w:spacing w:after="100"/>
-      </w:pPr>
-      <w:r>
-        <w:t xml:space="preserve">An order note field for the whole order (e.g. gate code, “leave at door”) — separate from each line's own special-instructions note.</w:t>
-      </w:r>
-    </w:p>
-    <w:p>
-      <w:pPr>
-        <w:pStyle w:val="ListParagraph"/>
-        <w:numPr>
-          <w:ilvl w:val="0"/>
-          <w:numId w:val="2"/>
-        </w:numPr>
-        <w:spacing w:after="100"/>
-      </w:pPr>
-      <w:r>
-        <w:t xml:space="preserve">A Clear cart link.</w:t>
-      </w:r>
-    </w:p>
-    <w:p>
-      <w:pPr>
-        <w:pStyle w:val="ListParagraph"/>
-        <w:numPr>
-          <w:ilvl w:val="0"/>
-          <w:numId w:val="2"/>
-        </w:numPr>
-        <w:spacing w:after="100"/>
-      </w:pPr>
-      <w:r>
-        <w:t xml:space="preserve">A tip selector (15% / 18% / 20% / Other) with an explicit disclaimer underneath it — see the stub note below.</w:t>
-      </w:r>
-    </w:p>
-    <w:p>
-      <w:pPr>
-        <w:pStyle w:val="ListParagraph"/>
-        <w:numPr>
-          <w:ilvl w:val="0"/>
-          <w:numId w:val="2"/>
-        </w:numPr>
-        <w:spacing w:after="100"/>
-      </w:pPr>
-      <w:r>
-        <w:t xml:space="preserve">An order summary (Subtotal, Delivery fee, Total) and a Checkout button, pinned at the bottom of the sheet.</w:t>
+        <w:t xml:space="preserve">3.2 Store Detail</w:t>
+      </w:r>
+    </w:p>
+    <w:p>
+      <w:pPr>
+        <w:spacing w:after="160"/>
+      </w:pPr>
+      <w:r>
+        <w:t xml:space="preserve">The Store Detail screen opens with a full-width hero banner (the store's banner photo, or a plate emoji on a tinted background if none is set), with a back chip and a favorite-heart chip overlaid on its corners. Below the hero is the store's name, cuisine tags, rating, and average prep time, followed by a closed/suspended banner if the store currently can't take orders.</w:t>
+      </w:r>
+    </w:p>
+    <w:p>
+      <w:pPr>
+        <w:spacing w:after="160"/>
+      </w:pPr>
+      <w:r>
+        <w:t xml:space="preserve">Below that, a row of category pills (e.g. Starters, Mains, Desserts) sticks to the top of the screen as you scroll past it, so you can always see which section you're in and tap a pill to jump straight to it — tapping a pill both scrolls to that section and highlights the pill; the highlight does not yet auto-update purely from scroll position, so it only changes when you tap a pill directly (see the Known Limitations note below).</w:t>
+      </w:r>
+    </w:p>
+    <w:p>
+      <w:pPr>
+        <w:spacing w:after="160"/>
+      </w:pPr>
+      <w:r>
+        <w:t xml:space="preserve">The menu itself is grouped into sections matching the store's own category labels (uncategorized items fall into a trailing “Other” group). Each item row shows:</w:t>
+      </w:r>
+    </w:p>
+    <w:p>
+      <w:pPr>
+        <w:pStyle w:val="ListParagraph"/>
+        <w:numPr>
+          <w:ilvl w:val="0"/>
+          <w:numId w:val="2"/>
+        </w:numPr>
+        <w:spacing w:after="100"/>
+      </w:pPr>
+      <w:r>
+        <w:t xml:space="preserve">A veg/non-veg indicator dot, the item name, and its description (up to 2 lines).</w:t>
+      </w:r>
+    </w:p>
+    <w:p>
+      <w:pPr>
+        <w:pStyle w:val="ListParagraph"/>
+        <w:numPr>
+          <w:ilvl w:val="0"/>
+          <w:numId w:val="2"/>
+        </w:numPr>
+        <w:spacing w:after="100"/>
+      </w:pPr>
+      <w:r>
+        <w:t xml:space="preserve">Its price.</w:t>
+      </w:r>
+    </w:p>
+    <w:p>
+      <w:pPr>
+        <w:pStyle w:val="ListParagraph"/>
+        <w:numPr>
+          <w:ilvl w:val="0"/>
+          <w:numId w:val="2"/>
+        </w:numPr>
+        <w:spacing w:after="100"/>
+      </w:pPr>
+      <w:r>
+        <w:t xml:space="preserve">A thumbnail image with a circular “+” Quick Add button overlaid on its corner.</w:t>
+      </w:r>
+    </w:p>
+    <w:p>
+      <w:pPr>
+        <w:spacing w:after="160"/>
+      </w:pPr>
+      <w:r>
+        <w:t xml:space="preserve">Tapping an item with no configurable options adds it straight to your cart. Tapping an item that has size/add-on options (configured by the store owner) instead opens a bottom-sheet customization view, where you choose required and optional groups before adding it to your cart; a required group left with no valid options keeps Add-to-cart disabled rather than letting you submit an incomplete selection. Every item can also carry its own special-instructions note (e.g. “no onions”), entered in that same customization step.</w:t>
+      </w:r>
+    </w:p>
+    <w:p>
+      <w:pPr>
+        <w:spacing w:after="160"/>
+      </w:pPr>
+      <w:r>
+        <w:t xml:space="preserve">Adding an item from a different store than what's already in your cart prompts a native confirmation dialog to clear the current cart first — a cart can only ever hold items from one store at a time.</w:t>
       </w:r>
     </w:p>
     <w:p>
@@ -975,11 +897,11 @@
       </w:pPr>
       <w:r>
         <w:rPr>
-          <w:b/>
-          <w:bCs/>
-          <w:color w:val="B45309"/>
-        </w:rPr>
-        <w:t xml:space="preserve">Not fully wired up yet: the tip selector is UI-only. Choosing a tip percentage highlights that button but never changes your subtotal, delivery fee, or total, and no tip value is sent at checkout — there is no tip column in the backend yet. The app tells you this directly under the selector.</w:t>
+          <w:i/>
+          <w:iCs/>
+          <w:color w:val="6B6A5F"/>
+        </w:rPr>
+        <w:t xml:space="preserve">Note: The pill-nav's active highlight only updates on tap, not on scroll — a minor known gap carried over from the web app's own scroll-spy nuance, not a functional bug (the pill row still scrolls correctly to every section).</w:t>
       </w:r>
     </w:p>
     <w:p>
@@ -989,37 +911,31 @@
       </w:pPr>
       <w:r>
         <w:drawing>
-          <wp:inline distT="0" distB="0" distL="0" distR="0">
-            <wp:extent cx="2476500" cy="2901950"/>
-            <wp:effectExtent t="0" r="0" b="0" l="0"/>
-            <wp:docPr id="3" name="" descr="" title=""/>
+          <wp:inline xmlns:a="http://schemas.openxmlformats.org/drawingml/2006/main" xmlns:pic="http://schemas.openxmlformats.org/drawingml/2006/picture">
+            <wp:extent cx="2103120" cy="4558390"/>
+            <wp:docPr id="10" name="Picture 10"/>
             <wp:cNvGraphicFramePr>
-              <a:graphicFrameLocks xmlns:a="http://schemas.openxmlformats.org/drawingml/2006/main" noChangeAspect="1"/>
+              <a:graphicFrameLocks noChangeAspect="1"/>
             </wp:cNvGraphicFramePr>
-            <a:graphic xmlns:a="http://schemas.openxmlformats.org/drawingml/2006/main">
+            <a:graphic>
               <a:graphicData uri="http://schemas.openxmlformats.org/drawingml/2006/picture">
-                <pic:pic xmlns:pic="http://schemas.openxmlformats.org/drawingml/2006/picture">
+                <pic:pic>
                   <pic:nvPicPr>
-                    <pic:cNvPr id="0" name="" descr=""/>
-                    <pic:cNvPicPr>
-                      <a:picLocks noChangeAspect="1" noChangeArrowheads="1"/>
-                    </pic:cNvPicPr>
+                    <pic:cNvPr id="0" name="store.jpg"/>
+                    <pic:cNvPicPr/>
                   </pic:nvPicPr>
                   <pic:blipFill>
-                    <a:blip r:embed="rId9" cstate="none"/>
-                    <a:srcRect/>
+                    <a:blip r:embed="rId17"/>
                     <a:stretch>
                       <a:fillRect/>
                     </a:stretch>
                   </pic:blipFill>
-                  <pic:spPr bwMode="auto">
+                  <pic:spPr>
                     <a:xfrm>
                       <a:off x="0" y="0"/>
-                      <a:ext cx="2476500" cy="2901950"/>
+                      <a:ext cx="2103120" cy="4558390"/>
                     </a:xfrm>
-                    <a:prstGeom prst="rect">
-                      <a:avLst/>
-                    </a:prstGeom>
+                    <a:prstGeom prst="rect"/>
                   </pic:spPr>
                 </pic:pic>
               </a:graphicData>
@@ -1041,7 +957,7 @@
           <w:sz w:val="18"/>
           <w:szCs w:val="18"/>
         </w:rPr>
-        <w:t xml:space="preserve">Wireframe — Cart bottom sheet (drag handle, item rows with quantity steppers, order note, tip selector, pinned order summary and Checkout button).</w:t>
+        <w:t>Screenshot — Store Detail: hero photo, category pills, menu rows, and the floating cart pill.</w:t>
       </w:r>
     </w:p>
     <w:p>
@@ -1049,62 +965,81 @@
         <w:pStyle w:val="Heading2"/>
       </w:pPr>
       <w:r>
-        <w:t xml:space="preserve">3.4 Checkout</w:t>
-      </w:r>
-    </w:p>
-    <w:p>
-      <w:pPr>
-        <w:spacing w:after="160"/>
-      </w:pPr>
-      <w:r>
-        <w:t xml:space="preserve">Checkout is a single scrollable screen. A Contact details block (name and email, pre-filled from your account profile where available) sits at the top, followed by three collapsible rows — each shows a one-line summary when collapsed and expands in place to reveal its fields when tapped, with only one row open at a time:</w:t>
-      </w:r>
-    </w:p>
-    <w:p>
-      <w:pPr>
-        <w:pStyle w:val="ListParagraph"/>
-        <w:numPr>
-          <w:ilvl w:val="0"/>
-          <w:numId w:val="2"/>
-        </w:numPr>
-        <w:spacing w:after="100"/>
-      </w:pPr>
-      <w:r>
-        <w:t xml:space="preserve">Delivery address — Address line 1 (required), Address line 2 (optional), City, State, and Pincode. There is no map picker in this build; you type the address directly.</w:t>
-      </w:r>
-    </w:p>
-    <w:p>
-      <w:pPr>
-        <w:pStyle w:val="ListParagraph"/>
-        <w:numPr>
-          <w:ilvl w:val="0"/>
-          <w:numId w:val="2"/>
-        </w:numPr>
-        <w:spacing w:after="100"/>
-      </w:pPr>
-      <w:r>
-        <w:t xml:space="preserve">Delivery instructions — the same order-note text you may have already entered in the cart; editing it here updates the same value.</w:t>
-      </w:r>
-    </w:p>
-    <w:p>
-      <w:pPr>
-        <w:pStyle w:val="ListParagraph"/>
-        <w:numPr>
-          <w:ilvl w:val="0"/>
-          <w:numId w:val="2"/>
-        </w:numPr>
-        <w:spacing w:after="100"/>
-      </w:pPr>
-      <w:r>
-        <w:t xml:space="preserve">Payment method — Mock Card (16-digit card number, MM/YY expiry, cardholder name), Mock UPI (a UPI ID such as name@bank), or Cash on Delivery. All three are simulated — no real payment processor is contacted.</w:t>
-      </w:r>
-    </w:p>
-    <w:p>
-      <w:pPr>
-        <w:spacing w:after="160"/>
-      </w:pPr>
-      <w:r>
-        <w:t xml:space="preserve">Below the three rows, an Order summary block shows subtotal, the store's real delivery fee, and the total. A Place order button is pinned to the bottom of the screen (not part of the scrolling content) and stays disabled until every required field above is valid; while submitting, it shows a spinner in place of its label. After a successful submission, you're taken directly to that order's Tracking screen.</w:t>
+        <w:t xml:space="preserve">3.3 Cart</w:t>
+      </w:r>
+    </w:p>
+    <w:p>
+      <w:pPr>
+        <w:spacing w:after="160"/>
+      </w:pPr>
+      <w:r>
+        <w:t xml:space="preserve">The cart opens as a bottom sheet over whichever screen you were on, not a separate full page — a dimmed backdrop covers the screen behind it, the sheet has a drag-handle bar at its top, and an ✕ close button returns you to where you were. Each line shows the item's thumbnail, name, any selected customization options, a quantity stepper (− / +), a Remove link, and a per-line note field. Below the line items:</w:t>
+      </w:r>
+    </w:p>
+    <w:p>
+      <w:pPr>
+        <w:pStyle w:val="ListParagraph"/>
+        <w:numPr>
+          <w:ilvl w:val="0"/>
+          <w:numId w:val="2"/>
+        </w:numPr>
+        <w:spacing w:after="100"/>
+      </w:pPr>
+      <w:r>
+        <w:t xml:space="preserve">An order note field for the whole order (e.g. gate code, “leave at door”) — separate from each line's own special-instructions note.</w:t>
+      </w:r>
+    </w:p>
+    <w:p>
+      <w:pPr>
+        <w:pStyle w:val="ListParagraph"/>
+        <w:numPr>
+          <w:ilvl w:val="0"/>
+          <w:numId w:val="2"/>
+        </w:numPr>
+        <w:spacing w:after="100"/>
+      </w:pPr>
+      <w:r>
+        <w:t xml:space="preserve">A Clear cart link.</w:t>
+      </w:r>
+    </w:p>
+    <w:p>
+      <w:pPr>
+        <w:pStyle w:val="ListParagraph"/>
+        <w:numPr>
+          <w:ilvl w:val="0"/>
+          <w:numId w:val="2"/>
+        </w:numPr>
+        <w:spacing w:after="100"/>
+      </w:pPr>
+      <w:r>
+        <w:t xml:space="preserve">A tip selector (15% / 18% / 20% / Other) with an explicit disclaimer underneath it — see the stub note below.</w:t>
+      </w:r>
+    </w:p>
+    <w:p>
+      <w:pPr>
+        <w:pStyle w:val="ListParagraph"/>
+        <w:numPr>
+          <w:ilvl w:val="0"/>
+          <w:numId w:val="2"/>
+        </w:numPr>
+        <w:spacing w:after="100"/>
+      </w:pPr>
+      <w:r>
+        <w:t xml:space="preserve">An order summary (Subtotal, Delivery fee, Total) and a Checkout button, pinned at the bottom of the sheet.</w:t>
+      </w:r>
+    </w:p>
+    <w:p>
+      <w:pPr>
+        <w:spacing w:after="160"/>
+        <w:ind w:left="360"/>
+      </w:pPr>
+      <w:r>
+        <w:rPr>
+          <w:b/>
+          <w:bCs/>
+          <w:color w:val="B45309"/>
+        </w:rPr>
+        <w:t xml:space="preserve">Not fully wired up yet: the tip selector is UI-only. Choosing a tip percentage highlights that button but never changes your subtotal, delivery fee, or total, and no tip value is sent at checkout — there is no tip column in the backend yet. The app tells you this directly under the selector.</w:t>
       </w:r>
     </w:p>
     <w:p>
@@ -1114,37 +1049,31 @@
       </w:pPr>
       <w:r>
         <w:drawing>
-          <wp:inline distT="0" distB="0" distL="0" distR="0">
-            <wp:extent cx="2476500" cy="2901950"/>
-            <wp:effectExtent t="0" r="0" b="0" l="0"/>
-            <wp:docPr id="4" name="" descr="" title=""/>
+          <wp:inline xmlns:a="http://schemas.openxmlformats.org/drawingml/2006/main" xmlns:pic="http://schemas.openxmlformats.org/drawingml/2006/picture">
+            <wp:extent cx="2103120" cy="4558390"/>
+            <wp:docPr id="15" name="Picture 15"/>
             <wp:cNvGraphicFramePr>
-              <a:graphicFrameLocks xmlns:a="http://schemas.openxmlformats.org/drawingml/2006/main" noChangeAspect="1"/>
+              <a:graphicFrameLocks noChangeAspect="1"/>
             </wp:cNvGraphicFramePr>
-            <a:graphic xmlns:a="http://schemas.openxmlformats.org/drawingml/2006/main">
+            <a:graphic>
               <a:graphicData uri="http://schemas.openxmlformats.org/drawingml/2006/picture">
-                <pic:pic xmlns:pic="http://schemas.openxmlformats.org/drawingml/2006/picture">
+                <pic:pic>
                   <pic:nvPicPr>
-                    <pic:cNvPr id="0" name="" descr=""/>
-                    <pic:cNvPicPr>
-                      <a:picLocks noChangeAspect="1" noChangeArrowheads="1"/>
-                    </pic:cNvPicPr>
+                    <pic:cNvPr id="0" name="checkout.jpg"/>
+                    <pic:cNvPicPr/>
                   </pic:nvPicPr>
                   <pic:blipFill>
-                    <a:blip r:embed="rId10" cstate="none"/>
-                    <a:srcRect/>
+                    <a:blip r:embed="rId22"/>
                     <a:stretch>
                       <a:fillRect/>
                     </a:stretch>
                   </pic:blipFill>
-                  <pic:spPr bwMode="auto">
+                  <pic:spPr>
                     <a:xfrm>
                       <a:off x="0" y="0"/>
-                      <a:ext cx="2476500" cy="2901950"/>
+                      <a:ext cx="2103120" cy="4558390"/>
                     </a:xfrm>
-                    <a:prstGeom prst="rect">
-                      <a:avLst/>
-                    </a:prstGeom>
+                    <a:prstGeom prst="rect"/>
                   </pic:spPr>
                 </pic:pic>
               </a:graphicData>
@@ -1166,7 +1095,7 @@
           <w:sz w:val="18"/>
           <w:szCs w:val="18"/>
         </w:rPr>
-        <w:t xml:space="preserve">Wireframe — Checkout (collapsible address/instructions/payment rows, order summary, bottom-pinned Place order button).</w:t>
+        <w:t>Screenshot — Cart: item rows with quantity steppers, order note, tip selector, and pinned Checkout.</w:t>
       </w:r>
     </w:p>
     <w:p>
@@ -1174,61 +1103,62 @@
         <w:pStyle w:val="Heading2"/>
       </w:pPr>
       <w:r>
-        <w:t xml:space="preserve">3.5 Orders (tab)</w:t>
-      </w:r>
-    </w:p>
-    <w:p>
-      <w:pPr>
-        <w:spacing w:after="160"/>
-      </w:pPr>
-      <w:r>
-        <w:t xml:space="preserve">The Orders tab lists every order you've placed, most recent first, with its store, status, and total. Tapping an order opens its individual Tracking screen (§3.6). The tab bar stays visible on this list.</w:t>
-      </w:r>
-    </w:p>
-    <w:p>
-      <w:pPr>
-        <w:pStyle w:val="Heading2"/>
-      </w:pPr>
-      <w:r>
-        <w:t xml:space="preserve">3.6 Order Tracking</w:t>
-      </w:r>
-    </w:p>
-    <w:p>
-      <w:pPr>
-        <w:spacing w:after="160"/>
-      </w:pPr>
-      <w:r>
-        <w:t xml:space="preserve">An order's tracking screen shows a segmented status stepper — Placed, Preparing, On the way, Delivered — with completed steps checked and the connecting line filled up to your order's current step. If a store declines the order, or payment fails, a dedicated banner replaces the stepper (“Order cancelled” or “Restaurant rejected your order — payment refunded”) instead of showing a stepper stuck partway through.</w:t>
-      </w:r>
-    </w:p>
-    <w:p>
-      <w:pPr>
-        <w:spacing w:after="160"/>
-      </w:pPr>
-      <w:r>
-        <w:t xml:space="preserve">Once a delivery partner is assigned (status Assigned or Picked up), a courier card appears below the stepper with the partner's initials in an avatar circle and Call / Message icon buttons.</w:t>
-      </w:r>
-    </w:p>
-    <w:p>
-      <w:pPr>
-        <w:spacing w:after="160"/>
-        <w:ind w:left="360"/>
-      </w:pPr>
-      <w:r>
-        <w:rPr>
-          <w:b/>
-          <w:bCs/>
-          <w:color w:val="B45309"/>
-        </w:rPr>
-        <w:t xml:space="preserve">Not fully wired up yet: the courier card's Call and Message buttons. Both show an alert (“isn't wired up to a real backend yet”) rather than placing a call or opening a chat — there is no telephony or messaging integration in this build.</w:t>
-      </w:r>
-    </w:p>
-    <w:p>
-      <w:pPr>
-        <w:spacing w:after="160"/>
-      </w:pPr>
-      <w:r>
-        <w:t xml:space="preserve">While a partner is assigned and en route, a bordered box below the courier card shows their last-known coordinates as plain text (e.g. “12.9716, 77.5946”) with a timestamp, and an explicit “Live map coming soon” line — there is no Google Maps key configured, so this is a coordinate readout, not an interactive map. The whole tracking screen refreshes automatically every 3 seconds while it's open, and stops polling once the order reaches a final status (Delivered or Cancelled).</w:t>
+        <w:t xml:space="preserve">3.4 Checkout</w:t>
+      </w:r>
+    </w:p>
+    <w:p>
+      <w:pPr>
+        <w:spacing w:after="160"/>
+      </w:pPr>
+      <w:r>
+        <w:t xml:space="preserve">Checkout is a single scrollable screen. A Contact details block (name and email, pre-filled from your account profile where available) sits at the top, followed by three collapsible rows — each shows a one-line summary when collapsed and expands in place to reveal its fields when tapped, with only one row open at a time:</w:t>
+      </w:r>
+    </w:p>
+    <w:p>
+      <w:pPr>
+        <w:pStyle w:val="ListParagraph"/>
+        <w:numPr>
+          <w:ilvl w:val="0"/>
+          <w:numId w:val="2"/>
+        </w:numPr>
+        <w:spacing w:after="100"/>
+      </w:pPr>
+      <w:r>
+        <w:t xml:space="preserve">Delivery address — Address line 1 (required), Address line 2 (optional), City, State, and Pincode. There is no map picker in this build; you type the address directly.</w:t>
+      </w:r>
+    </w:p>
+    <w:p>
+      <w:pPr>
+        <w:pStyle w:val="ListParagraph"/>
+        <w:numPr>
+          <w:ilvl w:val="0"/>
+          <w:numId w:val="2"/>
+        </w:numPr>
+        <w:spacing w:after="100"/>
+      </w:pPr>
+      <w:r>
+        <w:t xml:space="preserve">Delivery instructions — the same order-note text you may have already entered in the cart; editing it here updates the same value.</w:t>
+      </w:r>
+    </w:p>
+    <w:p>
+      <w:pPr>
+        <w:pStyle w:val="ListParagraph"/>
+        <w:numPr>
+          <w:ilvl w:val="0"/>
+          <w:numId w:val="2"/>
+        </w:numPr>
+        <w:spacing w:after="100"/>
+      </w:pPr>
+      <w:r>
+        <w:t xml:space="preserve">Payment method — Mock Card (16-digit card number, MM/YY expiry, cardholder name), Mock UPI (a UPI ID such as name@bank), or Cash on Delivery. All three are simulated — no real payment processor is contacted.</w:t>
+      </w:r>
+    </w:p>
+    <w:p>
+      <w:pPr>
+        <w:spacing w:after="160"/>
+      </w:pPr>
+      <w:r>
+        <w:t xml:space="preserve">Below the three rows, an Order summary block shows subtotal, the store's real delivery fee, and the total. A Place order button is pinned to the bottom of the screen (not part of the scrolling content) and stays disabled until every required field above is valid; while submitting, it shows a spinner in place of its label. After a successful submission, you're taken directly to that order's Tracking screen.</w:t>
       </w:r>
     </w:p>
     <w:p>
@@ -1238,37 +1168,31 @@
       </w:pPr>
       <w:r>
         <w:drawing>
-          <wp:inline distT="0" distB="0" distL="0" distR="0">
-            <wp:extent cx="2476500" cy="2901950"/>
-            <wp:effectExtent t="0" r="0" b="0" l="0"/>
-            <wp:docPr id="5" name="" descr="" title=""/>
+          <wp:inline xmlns:a="http://schemas.openxmlformats.org/drawingml/2006/main" xmlns:pic="http://schemas.openxmlformats.org/drawingml/2006/picture">
+            <wp:extent cx="2103120" cy="4558390"/>
+            <wp:docPr id="12" name="Picture 12"/>
             <wp:cNvGraphicFramePr>
-              <a:graphicFrameLocks xmlns:a="http://schemas.openxmlformats.org/drawingml/2006/main" noChangeAspect="1"/>
+              <a:graphicFrameLocks noChangeAspect="1"/>
             </wp:cNvGraphicFramePr>
-            <a:graphic xmlns:a="http://schemas.openxmlformats.org/drawingml/2006/main">
+            <a:graphic>
               <a:graphicData uri="http://schemas.openxmlformats.org/drawingml/2006/picture">
-                <pic:pic xmlns:pic="http://schemas.openxmlformats.org/drawingml/2006/picture">
+                <pic:pic>
                   <pic:nvPicPr>
-                    <pic:cNvPr id="0" name="" descr=""/>
-                    <pic:cNvPicPr>
-                      <a:picLocks noChangeAspect="1" noChangeArrowheads="1"/>
-                    </pic:cNvPicPr>
+                    <pic:cNvPr id="0" name="checkout.jpg"/>
+                    <pic:cNvPicPr/>
                   </pic:nvPicPr>
                   <pic:blipFill>
-                    <a:blip r:embed="rId11" cstate="none"/>
-                    <a:srcRect/>
+                    <a:blip r:embed="rId19"/>
                     <a:stretch>
                       <a:fillRect/>
                     </a:stretch>
                   </pic:blipFill>
-                  <pic:spPr bwMode="auto">
+                  <pic:spPr>
                     <a:xfrm>
                       <a:off x="0" y="0"/>
-                      <a:ext cx="2476500" cy="2901950"/>
+                      <a:ext cx="2103120" cy="4558390"/>
                     </a:xfrm>
-                    <a:prstGeom prst="rect">
-                      <a:avLst/>
-                    </a:prstGeom>
+                    <a:prstGeom prst="rect"/>
                   </pic:spPr>
                 </pic:pic>
               </a:graphicData>
@@ -1290,7 +1214,7 @@
           <w:sz w:val="18"/>
           <w:szCs w:val="18"/>
         </w:rPr>
-        <w:t xml:space="preserve">Wireframe — Order Tracking (segmented status stepper, courier card with stub call/message, coordinate placeholder box).</w:t>
+        <w:t>Screenshot — Checkout: collapsible rows with the payment options open and Place order ready.</w:t>
       </w:r>
     </w:p>
     <w:p>
@@ -1298,6 +1222,180 @@
         <w:pStyle w:val="Heading2"/>
       </w:pPr>
       <w:r>
+        <w:t xml:space="preserve">3.5 Orders (tab)</w:t>
+      </w:r>
+    </w:p>
+    <w:p>
+      <w:pPr>
+        <w:spacing w:after="160"/>
+      </w:pPr>
+      <w:r>
+        <w:t xml:space="preserve">The Orders tab lists every order you've placed, most recent first, with its store, status, and total. Tapping an order opens its individual Tracking screen (§3.6). The tab bar stays visible on this list.</w:t>
+      </w:r>
+    </w:p>
+    <w:p>
+      <w:pPr>
+        <w:pStyle w:val="Heading2"/>
+      </w:pPr>
+      <w:r>
+        <w:t xml:space="preserve">3.6 Order Tracking</w:t>
+      </w:r>
+    </w:p>
+    <w:p>
+      <w:pPr>
+        <w:spacing w:after="160"/>
+      </w:pPr>
+      <w:r>
+        <w:t xml:space="preserve">An order's tracking screen shows a segmented status stepper — Placed, Preparing, On the way, Delivered — with completed steps checked and the connecting line filled up to your order's current step. If a store declines the order, or payment fails, a dedicated banner replaces the stepper (“Order cancelled” or “Restaurant rejected your order — payment refunded”) instead of showing a stepper stuck partway through.</w:t>
+      </w:r>
+    </w:p>
+    <w:p>
+      <w:pPr>
+        <w:spacing w:after="160"/>
+      </w:pPr>
+      <w:r>
+        <w:t xml:space="preserve">Once a delivery partner is assigned (status Assigned or Picked up), a courier card appears below the stepper with the partner's initials in an avatar circle and Call / Message icon buttons.</w:t>
+      </w:r>
+    </w:p>
+    <w:p>
+      <w:pPr>
+        <w:spacing w:after="160"/>
+        <w:ind w:left="360"/>
+      </w:pPr>
+      <w:r>
+        <w:rPr>
+          <w:b/>
+          <w:bCs/>
+          <w:color w:val="B45309"/>
+        </w:rPr>
+        <w:t xml:space="preserve">Not fully wired up yet: the courier card's Call and Message buttons. Both show an alert (“isn't wired up to a real backend yet”) rather than placing a call or opening a chat — there is no telephony or messaging integration in this build.</w:t>
+      </w:r>
+    </w:p>
+    <w:p>
+      <w:pPr>
+        <w:spacing w:after="160"/>
+      </w:pPr>
+      <w:r>
+        <w:t xml:space="preserve">While a partner is assigned and en route, a bordered box below the courier card shows their last-known coordinates as plain text (e.g. “12.9716, 77.5946”) with a timestamp, and an explicit “Live map coming soon” line — there is no Google Maps key configured, so this is a coordinate readout, not an interactive map. The whole tracking screen refreshes automatically every 3 seconds while it's open, and stops polling once the order reaches a final status (Delivered or Cancelled).</w:t>
+      </w:r>
+    </w:p>
+    <w:p>
+      <w:pPr>
+        <w:spacing w:after="80" w:before="120"/>
+        <w:jc w:val="center"/>
+      </w:pPr>
+      <w:r>
+        <w:drawing>
+          <wp:inline xmlns:a="http://schemas.openxmlformats.org/drawingml/2006/main" xmlns:pic="http://schemas.openxmlformats.org/drawingml/2006/picture">
+            <wp:extent cx="2103120" cy="4558390"/>
+            <wp:docPr id="13" name="Picture 13"/>
+            <wp:cNvGraphicFramePr>
+              <a:graphicFrameLocks noChangeAspect="1"/>
+            </wp:cNvGraphicFramePr>
+            <a:graphic>
+              <a:graphicData uri="http://schemas.openxmlformats.org/drawingml/2006/picture">
+                <pic:pic>
+                  <pic:nvPicPr>
+                    <pic:cNvPr id="0" name="track.jpg"/>
+                    <pic:cNvPicPr/>
+                  </pic:nvPicPr>
+                  <pic:blipFill>
+                    <a:blip r:embed="rId20"/>
+                    <a:stretch>
+                      <a:fillRect/>
+                    </a:stretch>
+                  </pic:blipFill>
+                  <pic:spPr>
+                    <a:xfrm>
+                      <a:off x="0" y="0"/>
+                      <a:ext cx="2103120" cy="4558390"/>
+                    </a:xfrm>
+                    <a:prstGeom prst="rect"/>
+                  </pic:spPr>
+                </pic:pic>
+              </a:graphicData>
+            </a:graphic>
+          </wp:inline>
+        </w:drawing>
+      </w:r>
+    </w:p>
+    <w:p>
+      <w:pPr>
+        <w:spacing w:after="240"/>
+        <w:jc w:val="center"/>
+      </w:pPr>
+      <w:r>
+        <w:rPr>
+          <w:i/>
+          <w:iCs/>
+          <w:color w:val="6B6A5F"/>
+          <w:sz w:val="18"/>
+          <w:szCs w:val="18"/>
+        </w:rPr>
+        <w:t>Screenshot — Order Tracking: status stepper, courier card, and coordinate readout.</w:t>
+      </w:r>
+    </w:p>
+    <w:p>
+      <w:pPr>
+        <w:spacing w:after="80" w:before="120"/>
+        <w:jc w:val="center"/>
+      </w:pPr>
+      <w:r>
+        <w:drawing>
+          <wp:inline xmlns:a="http://schemas.openxmlformats.org/drawingml/2006/main" xmlns:pic="http://schemas.openxmlformats.org/drawingml/2006/picture">
+            <wp:extent cx="2103120" cy="4558390"/>
+            <wp:docPr id="14" name="Picture 14"/>
+            <wp:cNvGraphicFramePr>
+              <a:graphicFrameLocks noChangeAspect="1"/>
+            </wp:cNvGraphicFramePr>
+            <a:graphic>
+              <a:graphicData uri="http://schemas.openxmlformats.org/drawingml/2006/picture">
+                <pic:pic>
+                  <pic:nvPicPr>
+                    <pic:cNvPr id="0" name="delivered.jpg"/>
+                    <pic:cNvPicPr/>
+                  </pic:nvPicPr>
+                  <pic:blipFill>
+                    <a:blip r:embed="rId21"/>
+                    <a:stretch>
+                      <a:fillRect/>
+                    </a:stretch>
+                  </pic:blipFill>
+                  <pic:spPr>
+                    <a:xfrm>
+                      <a:off x="0" y="0"/>
+                      <a:ext cx="2103120" cy="4558390"/>
+                    </a:xfrm>
+                    <a:prstGeom prst="rect"/>
+                  </pic:spPr>
+                </pic:pic>
+              </a:graphicData>
+            </a:graphic>
+          </wp:inline>
+        </w:drawing>
+      </w:r>
+    </w:p>
+    <w:p>
+      <w:pPr>
+        <w:spacing w:after="240"/>
+        <w:jc w:val="center"/>
+      </w:pPr>
+      <w:r>
+        <w:rPr>
+          <w:i/>
+          <w:iCs/>
+          <w:color w:val="6B6A5F"/>
+          <w:sz w:val="18"/>
+          <w:szCs w:val="18"/>
+        </w:rPr>
+        <w:t>Screenshot — Order Tracking once the order reaches Delivered (all four steps checked).</w:t>
+      </w:r>
+    </w:p>
+    <w:p>
+      <w:pPr>
+        <w:pStyle w:val="Heading2"/>
+      </w:pPr>
+      <w:r>
         <w:t xml:space="preserve">3.7 Account (tab, new)</w:t>
       </w:r>
     </w:p>
@@ -1306,7 +1404,7 @@
         <w:spacing w:after="160"/>
       </w:pPr>
       <w:r>
-        <w:t xml:space="preserve">The Account tab replaces the earlier build's separate top-level navigation to account-related screens with a single list. It has three rows:</w:t>
+        <w:t>The Account tab replaces the earlier build's separate top-level navigation to account-related screens with a single screen. At the top is a profile card showing your name and email, with a Reset password link underneath: tapping it sends a password-reset email to your account address, and the link changes to “Reset email sent” once the server accepts it. Below the card are three rows:</w:t>
       </w:r>
     </w:p>
     <w:p>
@@ -1407,7 +1505,7 @@
           <w:sz w:val="18"/>
           <w:szCs w:val="18"/>
         </w:rPr>
-        <w:t xml:space="preserve">Wireframe — Account tab (Wallet, Help, Sign out list rows).</w:t>
+        <w:t>Wireframe — Account tab (Wallet, Help, Sign out list rows) (illustrative wireframe from v2.0; real screenshot not yet captured).</w:t>
       </w:r>
     </w:p>
     <w:p>
@@ -1500,7 +1598,7 @@
         <w:spacing w:after="160"/>
       </w:pPr>
       <w:r>
-        <w:t xml:space="preserve">The Delivery Partner App is a single-screen dashboard once you're signed in, mirroring the web delivery portal's dashboard. This chapter's content is unchanged by the Customer App's redesign — the delivery dashboard was reviewed against the current source during this update and confirmed still accurate.</w:t>
+        <w:t>The Delivery Partner App is a single-screen dashboard once you're signed in, mirroring the web delivery portal's dashboard. The dashboard header now shows your name with a Reset password link (same behavior as the Customer Account tab, see §3.7); the rest of the workflow below is unchanged.</w:t>
       </w:r>
     </w:p>
     <w:p>
@@ -1658,7 +1756,7 @@
           <w:sz w:val="18"/>
           <w:szCs w:val="18"/>
         </w:rPr>
-        <w:t xml:space="preserve">Wireframe — Delivery Partner dashboard (online toggle, available orders with Claim, your deliveries with status-advance and View address).</w:t>
+        <w:t>Wireframe — Delivery Partner dashboard (online toggle, available orders with Claim, your deliveries with status-advance and View address) (illustrative wireframe from v2.0; real screenshot not yet captured).</w:t>
       </w:r>
     </w:p>
     <w:p>

</xml_diff>

<commit_message>
docs: mobile manual text updated for order visibility; figures pending recording
Orders tab rows, six-step order detail, Phone field, delivery Active
dashboard / Accept / History, status wording and Appendix A rewritten from
the mobile source. Changed screens keep their old figure with a flagged
caption; new screens have placeholder captions until the phone recording.
PDF is regenerated in the figures task.

Co-Authored-By: Claude Sonnet 5.5 <noreply@anthropic.com>
</commit_message>
<xml_diff>
--- a/docs/Mobile_App_User_Manual.docx
+++ b/docs/Mobile_App_User_Manual.docx
@@ -271,7 +271,7 @@
         <w:spacing w:after="100"/>
       </w:pPr>
       <w:r>
-        <w:t xml:space="preserve">Delivery Partner App — go online, claim ready orders, and work them through to delivery.</w:t>
+        <w:t>Delivery Partner App — go online, accept ready orders, and work them through to delivery, with a History screen for finished jobs.</w:t>
       </w:r>
     </w:p>
     <w:p>
@@ -303,7 +303,15 @@
         <w:spacing w:after="160"/>
       </w:pPr>
       <w:r>
-        <w:t>Since version 2.0 the whole app was re-skinned with a new orange / navy / green look (pill-shaped buttons, rounded cards, colored section backgrounds) and the colors used behind white text were darkened so buttons and badges are easy to read. Signing in and Account changed too: the app now always starts signed out (each cold launch asks you to log in), and your name plus a Reset password option now appear in the Account tab (Customer) and the dashboard header (Delivery Partner). The Customer screenshots in Chapter 3 are real captures from a screen recording of the current build; the Account and Delivery Partner illustrations are still wireframes from version 2.0 and will be replaced once those screens are recorded.</w:t>
+        <w:t>Since version 2.0 the whole app was re-skinned with a new orange / navy / green look (pill-shaped buttons, rounded cards, colored section backgrounds) and the colors used behind white text were darkened so buttons and badges are easy to read. Signing in and Account changed too: the app now always starts signed out (each cold launch asks you to log in), and your name plus a Reset password option now appear in the Account tab (Customer) and the dashboard header (Delivery Partner). The Home, Store Detail, Cart and Checkout screenshots in Chapter 3 are real captures from a screen recording; the Account and Delivery Partner illustrations are still wireframes from version 2.0. Figures whose caption ends with "[Figure pending ...]" show a screen that changed in this version and are being replaced with screenshots of the updated app.</w:t>
+      </w:r>
+    </w:p>
+    <w:p>
+      <w:pPr>
+        <w:spacing w:after="160"/>
+      </w:pPr>
+      <w:r>
+        <w:t>What's new for version 4.0 (order visibility): (1) Checkout now asks for a required Phone number. (2) The Orders tab shows richer rows — store, a colored status pill, date and time, up to three item thumbnails with an item count, and the total. (3) The order screen is now a full order detail: a six-step tracker (Placed, Accepted, Preparing, Ready, On the way, Delivered) with a single "Step N of 6" caption, a Deliver-to card, an Items card with photos, totals and payment, and a timeline of times. (4) Status wording changed: the old single "Out for delivery" is now two statuses, Partner assigned (a delivery partner accepted the order) and On the way (the order was picked up); status colors now match the web portals. (5) The Delivery Partner dashboard now shows only active work — Your active deliveries with the full drop-off details, then Available orders with an Accept button — and a new History screen lists finished deliveries. The old View address button and the "Claim" wording are gone. (6) Customers also receive an email when the restaurant accepts an order and when it is delivered.</w:t>
       </w:r>
     </w:p>
     <w:p>
@@ -319,7 +327,7 @@
         <w:spacing w:after="160"/>
       </w:pPr>
       <w:r>
-        <w:t xml:space="preserve">Everything that matters to an end user — your account, your cart, your order history, your store's menu, live order status — is shared with the web app because both talk to the same backend. What differs is purely presentational: the mobile app is a native phone interface (tab/stack navigation, native inputs, pull-to-refresh, bottom sheets) instead of a browser page, and a small number of features that depend on hardware not available in this build (see the notes on maps and location below) are simplified the same way they are on the web.</w:t>
+        <w:t>Everything that matters to an end user — your account, your cart, your order history, your store's menu, live order status (the same six steps and the same status colors) — is shared with the web app because both talk to the same backend. What differs is purely presentational: the mobile app is a native phone interface (tab/stack navigation, native inputs, pull-to-refresh, bottom sheets) instead of a browser page, and a small number of features that depend on hardware not available in this build (see the notes on maps and location below) are simplified the same way they are on the web.</w:t>
       </w:r>
     </w:p>
     <w:p>
@@ -440,6 +448,19 @@
       </w:pPr>
       <w:r>
         <w:t xml:space="preserve">Order-tracking's Call and Message buttons are demo stubs. Tapping either on the courier card shows an alert saying it isn't wired up to a real backend yet — there is no telephony or chat integration.</w:t>
+      </w:r>
+    </w:p>
+    <w:p>
+      <w:pPr>
+        <w:pStyle w:val="ListParagraph"/>
+        <w:numPr>
+          <w:ilvl w:val="0"/>
+          <w:numId w:val="2"/>
+        </w:numPr>
+        <w:spacing w:after="100"/>
+      </w:pPr>
+      <w:r>
+        <w:t>Screens new in this version were built from the source code and checked by type-check, automated tests and code review; the screenshots marked as pending are being replaced with captures from a screen recording of the real app, so a caption ending "[Figure pending ...]" means the picture is not yet final.</w:t>
       </w:r>
     </w:p>
     <w:p>
@@ -590,7 +611,7 @@
           <w:iCs/>
           <w:color w:val="6B6A5F"/>
         </w:rPr>
-        <w:t xml:space="preserve">Note: The Delivery Partner App is unaffected by this change — it remains a single dashboard screen once signed in, as described in Chapter 4.</w:t>
+        <w:t>Note: The Delivery Partner App has no tab bar — it opens on a single dashboard once signed in, with a History link in its header that opens a second screen (see Chapter 4).</w:t>
       </w:r>
     </w:p>
     <w:p>
@@ -1111,7 +1132,15 @@
         <w:spacing w:after="160"/>
       </w:pPr>
       <w:r>
-        <w:t xml:space="preserve">Checkout is a single scrollable screen. A Contact details block (name and email, pre-filled from your account profile where available) sits at the top, followed by three collapsible rows — each shows a one-line summary when collapsed and expands in place to reveal its fields when tapped, with only one row open at a time:</w:t>
+        <w:t>Checkout is a single scrollable screen. A Contact details block (Name, Email and Phone; name and email are pre-filled from your account profile where available) sits at the top, followed by three collapsible rows — each shows a one-line summary when collapsed and expands in place to reveal its fields when tapped, with only one row open at a time:</w:t>
+      </w:r>
+    </w:p>
+    <w:p>
+      <w:pPr>
+        <w:spacing w:after="160"/>
+      </w:pPr>
+      <w:r>
+        <w:t>Phone is required. Enter an Indian 10-digit mobile number that starts with 6, 7, 8 or 9; you may type it with an optional +91, 91 or 0 in front. It is saved as +91 followed by the 10 digits, so the delivery partner can call you and so it appears on your order. If the number is not valid, an error message appears under the field and Place order stays disabled; the server checks the number again when the order is placed.</w:t>
       </w:r>
     </w:p>
     <w:p>
@@ -1230,7 +1259,23 @@
         <w:spacing w:after="160"/>
       </w:pPr>
       <w:r>
-        <w:t xml:space="preserve">The Orders tab lists every order you've placed, most recent first, with its store, status, and total. Tapping an order opens its individual Tracking screen (§3.6). The tab bar stays visible on this list.</w:t>
+        <w:t>The Orders tab (heading "Your orders") lists every order you've placed, most recent first. Each row shows the store name, a colored status pill (for example Placed, Preparing, On the way, Delivered), the date and time the order was placed, up to three small item photos with an item count such as "2 items", and the order total. Tapping a row opens that order's detail screen (§3.6). If you have no orders the tab says "No orders yet." The list reloads each time you return to the tab, so a new order appears without restarting the app. The tab bar stays visible on this list.</w:t>
+      </w:r>
+    </w:p>
+    <w:p>
+      <w:pPr>
+        <w:spacing w:after="240"/>
+        <w:jc w:val="center"/>
+      </w:pPr>
+      <w:r>
+        <w:rPr>
+          <w:i/>
+          <w:iCs/>
+          <w:color w:val="6B6A5F"/>
+          <w:sz w:val="18"/>
+          <w:szCs w:val="18"/>
+        </w:rPr>
+        <w:t>Screenshot — Orders tab: order rows with store, status pill, date, item thumbnails and total. [Figure pending: screenshot from the updated app]</w:t>
       </w:r>
     </w:p>
     <w:p>
@@ -1238,23 +1283,31 @@
         <w:pStyle w:val="Heading2"/>
       </w:pPr>
       <w:r>
-        <w:t xml:space="preserve">3.6 Order Tracking</w:t>
-      </w:r>
-    </w:p>
-    <w:p>
-      <w:pPr>
-        <w:spacing w:after="160"/>
-      </w:pPr>
-      <w:r>
-        <w:t xml:space="preserve">An order's tracking screen shows a segmented status stepper — Placed, Preparing, On the way, Delivered — with completed steps checked and the connecting line filled up to your order's current step. If a store declines the order, or payment fails, a dedicated banner replaces the stepper (“Order cancelled” or “Restaurant rejected your order — payment refunded”) instead of showing a stepper stuck partway through.</w:t>
-      </w:r>
-    </w:p>
-    <w:p>
-      <w:pPr>
-        <w:spacing w:after="160"/>
-      </w:pPr>
-      <w:r>
-        <w:t xml:space="preserve">Once a delivery partner is assigned (status Assigned or Picked up), a courier card appears below the stepper with the partner's initials in an avatar circle and Call / Message icon buttons.</w:t>
+        <w:t>3.6 Order Detail and Tracking</w:t>
+      </w:r>
+    </w:p>
+    <w:p>
+      <w:pPr>
+        <w:spacing w:after="160"/>
+      </w:pPr>
+      <w:r>
+        <w:t>Tapping an order opens its detail screen. At the top is the heading "Order #" followed by the first eight characters of the order id, with the status pill beside it, then the store name and the time the order was placed, and a one-line status message (for example "Restaurant is preparing your order"). Below that is the order tracker: six numbered circles joined by lines — Placed, Accepted, Preparing, Ready, On the way, Delivered — with finished steps checked and the line filled up to the current step. Because six labels do not fit a phone's width, the tracker shows a single caption under the circles instead, such as "Step 3 of 6 · Preparing". The two delivery statuses share step 5: Partner assigned and On the way both show "Step 5 of 6 · On the way" (the status pill and message tell them apart). If the restaurant rejects the order, or the order is cancelled, a red banner ("Restaurant rejected your order — payment refunded" or "Order cancelled") replaces the tracker. If payment failed, the screen shows "Payment failed. Your order was not placed — please try checking out again." instead of the tracker.</w:t>
+      </w:r>
+    </w:p>
+    <w:p>
+      <w:pPr>
+        <w:spacing w:after="160"/>
+      </w:pPr>
+      <w:r>
+        <w:t>Below the tracker the screen shows: a Deliver to card (your name, email and phone — the phone is a tap-to-call link when it is a normal +91 number, otherwise plain text — then your delivery address and, if you entered one, the delivery note, or "No delivery address on file"); an Items card with each item's photo, quantity, chosen options, any special instructions and line total; a totals block (Subtotal, Delivery fee, Total, and Payment, for example "Paid · Cash on delivery"); and a timeline of times for the stages the order has reached (Placed, Accepted, Picked up, Delivered).</w:t>
+      </w:r>
+    </w:p>
+    <w:p>
+      <w:pPr>
+        <w:spacing w:after="160"/>
+      </w:pPr>
+      <w:r>
+        <w:t>Once a delivery partner is assigned (status Partner assigned or On the way), a courier card appears below the tracker with a "Delivery partner" label (the partner's name is not shown), an initials circle and Call / Message icon buttons.</w:t>
       </w:r>
     </w:p>
     <w:p>
@@ -1276,7 +1329,7 @@
         <w:spacing w:after="160"/>
       </w:pPr>
       <w:r>
-        <w:t xml:space="preserve">While a partner is assigned and en route, a bordered box below the courier card shows their last-known coordinates as plain text (e.g. “12.9716, 77.5946”) with a timestamp, and an explicit “Live map coming soon” line — there is no Google Maps key configured, so this is a coordinate readout, not an interactive map. The whole tracking screen refreshes automatically every 3 seconds while it's open, and stops polling once the order reaches a final status (Delivered or Cancelled).</w:t>
+        <w:t>While a partner is assigned or on the way, a bordered box below the courier card shows their last-known coordinates as plain text (e.g. “12.9716, 77.5946”) with a timestamp, and an explicit “Live map coming soon” line — there is no Google Maps key configured, so this is a coordinate readout, not an interactive map. The whole detail screen refreshes automatically every 3 seconds while it's open, and stops refreshing once the order reaches a final status (Delivered, Cancelled or Rejected).</w:t>
       </w:r>
     </w:p>
     <w:p>
@@ -1332,7 +1385,7 @@
           <w:sz w:val="18"/>
           <w:szCs w:val="18"/>
         </w:rPr>
-        <w:t>Screenshot — Order Tracking: status stepper, courier card, and coordinate readout.</w:t>
+        <w:t>Screenshot — Order Tracking: status stepper, courier card, and coordinate readout (older four-step tracker). [Figure pending: replacement screenshot from the updated app]</w:t>
       </w:r>
     </w:p>
     <w:p>
@@ -1388,7 +1441,23 @@
           <w:sz w:val="18"/>
           <w:szCs w:val="18"/>
         </w:rPr>
-        <w:t>Screenshot — Order Tracking once the order reaches Delivered (all four steps checked).</w:t>
+        <w:t>Screenshot — Order Tracking once the order reaches Delivered (older screen, four steps checked). [Figure pending: replacement screenshot from the updated app]</w:t>
+      </w:r>
+    </w:p>
+    <w:p>
+      <w:pPr>
+        <w:spacing w:after="240"/>
+        <w:jc w:val="center"/>
+      </w:pPr>
+      <w:r>
+        <w:rPr>
+          <w:i/>
+          <w:iCs/>
+          <w:color w:val="6B6A5F"/>
+          <w:sz w:val="18"/>
+          <w:szCs w:val="18"/>
+        </w:rPr>
+        <w:t>Screenshot — Order detail: six-step tracker with "Step N of 6" caption, Deliver to card, Items card and totals. [Figure pending: screenshot from the updated app]</w:t>
       </w:r>
     </w:p>
     <w:p>
@@ -1573,7 +1642,7 @@
         <w:spacing w:after="100"/>
       </w:pPr>
       <w:r>
-        <w:t xml:space="preserve">A plain order-status text line → the segmented stepper described in §3.6.</w:t>
+        <w:t>A plain order-status text line → the six-step order tracker described in §3.6, inside a full order detail screen.</w:t>
       </w:r>
     </w:p>
     <w:p>
@@ -1598,7 +1667,7 @@
         <w:spacing w:after="160"/>
       </w:pPr>
       <w:r>
-        <w:t>The Delivery Partner App is a single-screen dashboard once you're signed in, mirroring the web delivery portal's dashboard. The dashboard header now shows your name with a Reset password link (same behavior as the Customer Account tab, see §3.7); the rest of the workflow below is unchanged.</w:t>
+        <w:t>The Delivery Partner App opens on a dashboard once you're signed in, mirroring the web delivery portal's dashboard, with a second History screen reached from a History link in the header. The header also shows your name with a Reset password link (same behavior as the Customer Account tab, see §3.7). The dashboard shows only active work: your active deliveries first, then orders available to accept.</w:t>
       </w:r>
     </w:p>
     <w:p>
@@ -1630,7 +1699,7 @@
         <w:spacing w:after="160"/>
       </w:pPr>
       <w:r>
-        <w:t xml:space="preserve">At the top of the dashboard is a large Online/Offline toggle. Tap it to switch status; while toggling, a loading indicator shows in place of the label. You only appear in the available-orders pool, and only receive location-ping/list updates, while toggled Online.</w:t>
+        <w:t>At the top of the dashboard is a large Online/Offline toggle. Tap it to switch status; while toggling, a loading indicator shows in place of the label. While you are Offline the Available orders section only says "Go online to see available orders."; you only see available orders, and only send location pings, while toggled Online.</w:t>
       </w:r>
     </w:p>
     <w:p>
@@ -1646,7 +1715,23 @@
         <w:spacing w:after="160"/>
       </w:pPr>
       <w:r>
-        <w:t xml:space="preserve">The Available orders section lists every order that has reached Ready status and has not yet been claimed by another partner, each showing a short order id, the store name, and the total. Tap Claim on an order to take it — once claimed, it moves to Your deliveries and is no longer visible to other partners. This list refreshes automatically every 10 seconds while you're online.</w:t>
+        <w:t>The Available orders section lists orders that have reached Ready status and that no partner has accepted yet. Each card shows the store name and pickup address, the items in the order (with photos), the order amount, and an Accept button. To protect the customer's privacy, the customer's name, phone number and address are not shown here — the card says "Customer details appear after you accept." Tap Accept to take the order: it moves into Your active deliveries and is no longer visible to other partners. With nothing available the section says "None right now." The list refreshes automatically every 10 seconds while you're online.</w:t>
+      </w:r>
+    </w:p>
+    <w:p>
+      <w:pPr>
+        <w:spacing w:after="240"/>
+        <w:jc w:val="center"/>
+      </w:pPr>
+      <w:r>
+        <w:rPr>
+          <w:i/>
+          <w:iCs/>
+          <w:color w:val="6B6A5F"/>
+          <w:sz w:val="18"/>
+          <w:szCs w:val="18"/>
+        </w:rPr>
+        <w:t>Screenshot — Delivery dashboard: an Available order card (pickup store and address, items, amount, Accept). [Figure pending: screenshot from the updated app]</w:t>
       </w:r>
     </w:p>
     <w:p>
@@ -1662,7 +1747,7 @@
         <w:spacing w:after="160"/>
       </w:pPr>
       <w:r>
-        <w:t xml:space="preserve">The Your deliveries section lists orders you've claimed, along with the current status and an action button that advances the order to its next status — Mark picked up for an order you've collected from the store, then Mark delivered once you've handed it to the customer. Each button reflects the correct next step for that order's current status; there is no way to skip a step or move an order backward.</w:t>
+        <w:t>The Your active deliveries section lists the orders you have accepted that are not finished yet (status Partner assigned or On the way); with none it says "No active deliveries." Each card shows the order number, a status pill, the amount, the Pickup store and its address, the Drop-off details (see §4.5), and the items with photos. A single action button advances the order: Mark picked up while the order is Partner assigned, then Mark delivered once it is On the way. Each button reflects the correct next step; there is no way to skip a step or move an order backward. A delivered order leaves this list and moves to History.</w:t>
       </w:r>
     </w:p>
     <w:p>
@@ -1670,15 +1755,55 @@
         <w:pStyle w:val="Heading2"/>
       </w:pPr>
       <w:r>
-        <w:t xml:space="preserve">4.5 Viewing the Delivery Address</w:t>
-      </w:r>
-    </w:p>
-    <w:p>
-      <w:pPr>
-        <w:spacing w:after="160"/>
-      </w:pPr>
-      <w:r>
-        <w:t xml:space="preserve">For any order you've claimed (Assigned or Picked up status), a View address button reveals that order's delivery address inline on its card as plain text. This build has no Google Maps key configured, matching the Customer App's own coordinate-only tracking view.</w:t>
+        <w:t>4.5 Drop-off Details and History</w:t>
+      </w:r>
+    </w:p>
+    <w:p>
+      <w:pPr>
+        <w:spacing w:after="160"/>
+      </w:pPr>
+      <w:r>
+        <w:t>Once you have accepted an order, its active card shows the drop-off details: the recipient's name, their phone number (tap it to call when it is a normal +91 number), the full delivery address and the delivery note, if there is one. You can see a customer's phone and address only while the order is Partner assigned or On the way for you; the old View address button no longer exists because the details are shown directly on the card. This build has no Google Maps key configured, matching the Customer App's own coordinate-only tracking view.</w:t>
+      </w:r>
+    </w:p>
+    <w:p>
+      <w:pPr>
+        <w:spacing w:after="160"/>
+      </w:pPr>
+      <w:r>
+        <w:t>The History link in the dashboard header opens the History screen: your finished orders, newest first, up to your 50 most recent. Each card shows the pickup store, who the order was delivered to, when it happened and a short summary of the items — no phone number or address is shown for finished orders. A Refresh button reloads the list and a Back to dashboard link returns you to the dashboard; with nothing finished yet it says "No completed deliveries yet."</w:t>
+      </w:r>
+    </w:p>
+    <w:p>
+      <w:pPr>
+        <w:spacing w:after="240"/>
+        <w:jc w:val="center"/>
+      </w:pPr>
+      <w:r>
+        <w:rPr>
+          <w:i/>
+          <w:iCs/>
+          <w:color w:val="6B6A5F"/>
+          <w:sz w:val="18"/>
+          <w:szCs w:val="18"/>
+        </w:rPr>
+        <w:t>Screenshot — Delivery dashboard: Your active deliveries card with drop-off details and Mark picked up / Mark delivered. [Figure pending: screenshot from the updated app]</w:t>
+      </w:r>
+    </w:p>
+    <w:p>
+      <w:pPr>
+        <w:spacing w:after="240"/>
+        <w:jc w:val="center"/>
+      </w:pPr>
+      <w:r>
+        <w:rPr>
+          <w:i/>
+          <w:iCs/>
+          <w:color w:val="6B6A5F"/>
+          <w:sz w:val="18"/>
+          <w:szCs w:val="18"/>
+        </w:rPr>
+        <w:t>Screenshot — Delivery History screen: finished deliveries with pickup store, delivered-to name, time and items summary. [Figure pending: screenshot from the updated app]</w:t>
       </w:r>
     </w:p>
     <w:p>
@@ -1756,7 +1881,7 @@
           <w:sz w:val="18"/>
           <w:szCs w:val="18"/>
         </w:rPr>
-        <w:t>Wireframe — Delivery Partner dashboard (online toggle, available orders with Claim, your deliveries with status-advance and View address) (illustrative wireframe from v2.0; real screenshot not yet captured).</w:t>
+        <w:t>Wireframe — Delivery Partner dashboard (online toggle, available orders with Claim, your deliveries with status-advance and View address) (older v2.0 wireframe showing the previous buttons). [Figure pending: replacement screenshot from the updated app]</w:t>
       </w:r>
     </w:p>
     <w:p>
@@ -1928,7 +2053,7 @@
           </w:tcPr>
           <w:p>
             <w:r>
-              <w:t xml:space="preserve">After placing an order you land on its tracking screen, which shows a live status stepper (Placed, Preparing, On the way, Delivered) that refreshes automatically. You can also find current and past orders under the Orders tab.</w:t>
+              <w:t>After placing an order you land on its detail screen, which shows a six-step tracker (Placed, Accepted, Preparing, Ready, On the way, Delivered) with a "Step N of 6" caption, plus your items, delivery details and totals. It refreshes automatically every 3 seconds. You can also find current and past orders under the Orders tab.</w:t>
             </w:r>
           </w:p>
         </w:tc>
@@ -2032,7 +2157,7 @@
           </w:tcPr>
           <w:p>
             <w:r>
-              <w:t xml:space="preserve">Those buttons are demo stubs — there's no telephony or chat integration in this build. The pop-up is expected, not an error.</w:t>
+              <w:t>Those buttons on the courier card are demo stubs — there's no telephony or chat integration in this build. The pop-up is expected, not an error. (Your own phone number on the order, if it is a normal +91 number, is a real tap-to-call link.)</w:t>
             </w:r>
           </w:p>
         </w:tc>
@@ -2089,6 +2214,84 @@
           </w:p>
         </w:tc>
       </w:tr>
+      <w:tr>
+        <w:tc>
+          <w:tcPr>
+            <w:tcW w:type="dxa" w:w="3200"/>
+          </w:tcPr>
+          <w:p>
+            <w:r>
+              <w:rPr>
+                <w:b/>
+                <w:bCs/>
+              </w:rPr>
+              <w:t>Will I get an email about my order?</w:t>
+            </w:r>
+          </w:p>
+        </w:tc>
+        <w:tc>
+          <w:tcPr>
+            <w:tcW w:type="dxa" w:w="5800"/>
+          </w:tcPr>
+          <w:p>
+            <w:r>
+              <w:t>Yes. An email is sent to the email address you entered at checkout when the restaurant accepts your order and again when the order is delivered.</w:t>
+            </w:r>
+          </w:p>
+        </w:tc>
+      </w:tr>
+      <w:tr>
+        <w:tc>
+          <w:tcPr>
+            <w:tcW w:type="dxa" w:w="3200"/>
+          </w:tcPr>
+          <w:p>
+            <w:r>
+              <w:rPr>
+                <w:b/>
+                <w:bCs/>
+              </w:rPr>
+              <w:t>Why does checkout ask for my phone number?</w:t>
+            </w:r>
+          </w:p>
+        </w:tc>
+        <w:tc>
+          <w:tcPr>
+            <w:tcW w:type="dxa" w:w="5800"/>
+          </w:tcPr>
+          <w:p>
+            <w:r>
+              <w:t>A valid Indian 10-digit mobile number is required so the delivery partner can reach you. It is shown on your order and, to the delivery partner, only while your order is assigned to them or on the way.</w:t>
+            </w:r>
+          </w:p>
+        </w:tc>
+      </w:tr>
+      <w:tr>
+        <w:tc>
+          <w:tcPr>
+            <w:tcW w:type="dxa" w:w="3200"/>
+          </w:tcPr>
+          <w:p>
+            <w:r>
+              <w:rPr>
+                <w:b/>
+                <w:bCs/>
+              </w:rPr>
+              <w:t>What can a delivery partner see about me?</w:t>
+            </w:r>
+          </w:p>
+        </w:tc>
+        <w:tc>
+          <w:tcPr>
+            <w:tcW w:type="dxa" w:w="5800"/>
+          </w:tcPr>
+          <w:p>
+            <w:r>
+              <w:t>Partners who have not accepted your order see only the store, items and amount. After a partner accepts, they see your name, phone, address and delivery note until the order is delivered; finished orders in their History show only who it was delivered to.</w:t>
+            </w:r>
+          </w:p>
+        </w:tc>
+      </w:tr>
     </w:tbl>
     <w:p>
       <w:pPr>
@@ -2104,7 +2307,7 @@
         <w:spacing w:after="160"/>
       </w:pPr>
       <w:r>
-        <w:t xml:space="preserve">Every order moves through a fixed status chain. The table below lists every possible status and what it means; this applies identically to orders viewed in the Customer App and the Delivery Partner App, since both read the same underlying order record.</w:t>
+        <w:t>Every order moves through a fixed status chain. The table below lists every possible status, the label shown in the app, and the step of the six-step tracker it maps to (Placed 1, Accepted 2, Preparing 3, Ready 4, On the way 5, Delivered 6). This applies identically to orders viewed in the Customer App and the Delivery Partner App, since both read the same underlying order record, and the status colors match the web portals.</w:t>
       </w:r>
     </w:p>
     <w:tbl>
@@ -2171,7 +2374,7 @@
                 <w:b/>
                 <w:bCs/>
               </w:rPr>
-              <w:t xml:space="preserve">placed</w:t>
+              <w:t>placed (label: Placed)</w:t>
             </w:r>
           </w:p>
         </w:tc>
@@ -2181,7 +2384,7 @@
           </w:tcPr>
           <w:p>
             <w:r>
-              <w:t xml:space="preserve">The customer has submitted the order and payment is being resolved.</w:t>
+              <w:t>Tracker step 1 of 6. The customer has submitted the order and payment is being resolved; waiting for the restaurant.</w:t>
             </w:r>
           </w:p>
         </w:tc>
@@ -2197,7 +2400,7 @@
                 <w:b/>
                 <w:bCs/>
               </w:rPr>
-              <w:t xml:space="preserve">accepted</w:t>
+              <w:t>accepted (label: Accepted)</w:t>
             </w:r>
           </w:p>
         </w:tc>
@@ -2207,7 +2410,7 @@
           </w:tcPr>
           <w:p>
             <w:r>
-              <w:t xml:space="preserve">The store has accepted the order and will begin preparing it.</w:t>
+              <w:t>Tracker step 2 of 6. The store has accepted the order and will begin preparing it.</w:t>
             </w:r>
           </w:p>
         </w:tc>
@@ -2223,7 +2426,7 @@
                 <w:b/>
                 <w:bCs/>
               </w:rPr>
-              <w:t xml:space="preserve">preparing</w:t>
+              <w:t>preparing (label: Preparing)</w:t>
             </w:r>
           </w:p>
         </w:tc>
@@ -2233,7 +2436,7 @@
           </w:tcPr>
           <w:p>
             <w:r>
-              <w:t xml:space="preserve">The store is actively preparing the order.</w:t>
+              <w:t>Tracker step 3 of 6. The store is actively preparing the order.</w:t>
             </w:r>
           </w:p>
         </w:tc>
@@ -2249,7 +2452,7 @@
                 <w:b/>
                 <w:bCs/>
               </w:rPr>
-              <w:t xml:space="preserve">ready</w:t>
+              <w:t>ready (label: Ready)</w:t>
             </w:r>
           </w:p>
         </w:tc>
@@ -2259,7 +2462,7 @@
           </w:tcPr>
           <w:p>
             <w:r>
-              <w:t xml:space="preserve">The order is ready for pickup; it now appears in delivery partners' Available Orders list.</w:t>
+              <w:t>Tracker step 4 of 6. The order is ready for pickup; it now appears in online delivery partners' Available orders list.</w:t>
             </w:r>
           </w:p>
         </w:tc>
@@ -2275,7 +2478,7 @@
                 <w:b/>
                 <w:bCs/>
               </w:rPr>
-              <w:t xml:space="preserve">assigned</w:t>
+              <w:t>assigned (label: Partner assigned)</w:t>
             </w:r>
           </w:p>
         </w:tc>
@@ -2285,7 +2488,7 @@
           </w:tcPr>
           <w:p>
             <w:r>
-              <w:t xml:space="preserve">A delivery partner has claimed the order and is on the way to the store.</w:t>
+              <w:t>Tracker step 5 of 6. A delivery partner has accepted the order and is on the way to the store.</w:t>
             </w:r>
           </w:p>
         </w:tc>
@@ -2301,7 +2504,7 @@
                 <w:b/>
                 <w:bCs/>
               </w:rPr>
-              <w:t xml:space="preserve">picked_up</w:t>
+              <w:t>picked_up (label: On the way)</w:t>
             </w:r>
           </w:p>
         </w:tc>
@@ -2311,7 +2514,7 @@
           </w:tcPr>
           <w:p>
             <w:r>
-              <w:t xml:space="preserve">The delivery partner has collected the order and is on the way to the customer.</w:t>
+              <w:t>Tracker step 5 of 6. The delivery partner has collected the order and is on the way to the customer.</w:t>
             </w:r>
           </w:p>
         </w:tc>
@@ -2327,7 +2530,7 @@
                 <w:b/>
                 <w:bCs/>
               </w:rPr>
-              <w:t xml:space="preserve">delivered</w:t>
+              <w:t>delivered (label: Delivered)</w:t>
             </w:r>
           </w:p>
         </w:tc>
@@ -2337,7 +2540,7 @@
           </w:tcPr>
           <w:p>
             <w:r>
-              <w:t xml:space="preserve">The order has been handed to the customer. Final state.</w:t>
+              <w:t>Tracker step 6 of 6. The order has been handed to the customer. Final state.</w:t>
             </w:r>
           </w:p>
         </w:tc>
@@ -2353,7 +2556,7 @@
                 <w:b/>
                 <w:bCs/>
               </w:rPr>
-              <w:t xml:space="preserve">cancelled</w:t>
+              <w:t>cancelled (label: Cancelled)</w:t>
             </w:r>
           </w:p>
         </w:tc>
@@ -2363,7 +2566,33 @@
           </w:tcPr>
           <w:p>
             <w:r>
-              <w:t xml:space="preserve">The order was cancelled — either the store declined it before accepting, or payment failed. Final state.</w:t>
+              <w:t>No tracker step; a red banner is shown instead. The order was cancelled, for example because payment failed. Final state.</w:t>
+            </w:r>
+          </w:p>
+        </w:tc>
+      </w:tr>
+      <w:tr>
+        <w:tc>
+          <w:tcPr>
+            <w:tcW w:type="dxa" w:w="2200"/>
+          </w:tcPr>
+          <w:p>
+            <w:r>
+              <w:rPr>
+                <w:b/>
+                <w:bCs/>
+              </w:rPr>
+              <w:t>rejected (label: Rejected)</w:t>
+            </w:r>
+          </w:p>
+        </w:tc>
+        <w:tc>
+          <w:tcPr>
+            <w:tcW w:type="dxa" w:w="6800"/>
+          </w:tcPr>
+          <w:p>
+            <w:r>
+              <w:t>No tracker step; a red banner is shown instead. The restaurant rejected the order and payment is refunded. Final state.</w:t>
             </w:r>
           </w:p>
         </w:tc>

</xml_diff>

<commit_message>
docs: refresh mobile user manual (v4.0) with sign-up, order tracker, orders and delivery screens; update CLAUDE/MEMORY/README for sub-project D
Customer figures come from a real phone recording with personal data blurred;
the three Delivery figures are labeled wireframes (Delivery was not recorded).
Also records the auto-assignment finding (workflow 04 assigns the nearest
online partner) and fixes stale legacy-endpoint / "View address" notes.

Co-Authored-By: Claude Sonnet 5.5 <noreply@anthropic.com>
</commit_message>
<xml_diff>
--- a/docs/Mobile_App_User_Manual.docx
+++ b/docs/Mobile_App_User_Manual.docx
@@ -67,7 +67,7 @@
           <w:sz w:val="22"/>
           <w:szCs w:val="22"/>
         </w:rPr>
-        <w:t>Version 3.0 — Figma-kit redesign, real screenshots</w:t>
+        <w:t>Version 4.0 — Order visibility, mobile sign-up, real screenshots</w:t>
       </w:r>
     </w:p>
     <w:p>
@@ -79,7 +79,7 @@
           <w:sz w:val="22"/>
           <w:szCs w:val="22"/>
         </w:rPr>
-        <w:t xml:space="preserve">September 2026</w:t>
+        <w:t>October 2026</w:t>
       </w:r>
     </w:p>
     <w:p>
@@ -154,7 +154,7 @@
           <w:b/>
           <w:bCs/>
         </w:rPr>
-        <w:t>7</w:t>
+        <w:t>8</w:t>
       </w:r>
     </w:p>
     <w:p>
@@ -176,7 +176,7 @@
           <w:b/>
           <w:bCs/>
         </w:rPr>
-        <w:t>15</w:t>
+        <w:t>19</w:t>
       </w:r>
     </w:p>
     <w:p>
@@ -198,7 +198,7 @@
           <w:b/>
           <w:bCs/>
         </w:rPr>
-        <w:t>17</w:t>
+        <w:t>23</w:t>
       </w:r>
     </w:p>
     <w:p>
@@ -220,7 +220,7 @@
           <w:b/>
           <w:bCs/>
         </w:rPr>
-        <w:t>18</w:t>
+        <w:t>25</w:t>
       </w:r>
     </w:p>
     <w:p>
@@ -303,15 +303,15 @@
         <w:spacing w:after="160"/>
       </w:pPr>
       <w:r>
-        <w:t>Since version 2.0 the whole app was re-skinned with a new orange / navy / green look (pill-shaped buttons, rounded cards, colored section backgrounds) and the colors used behind white text were darkened so buttons and badges are easy to read. Signing in and Account changed too: the app now always starts signed out (each cold launch asks you to log in), and your name plus a Reset password option now appear in the Account tab (Customer) and the dashboard header (Delivery Partner). The Home, Store Detail, Cart and Checkout screenshots in Chapter 3 are real captures from a screen recording; the Account and Delivery Partner illustrations are still wireframes from version 2.0. Figures whose caption ends with "[Figure pending ...]" show a screen that changed in this version and are being replaced with screenshots of the updated app.</w:t>
-      </w:r>
-    </w:p>
-    <w:p>
-      <w:pPr>
-        <w:spacing w:after="160"/>
-      </w:pPr>
-      <w:r>
-        <w:t>What's new for version 4.0 (order visibility): (1) Checkout now asks for a required Phone number. (2) The Orders tab shows richer rows — store, a colored status pill, date and time, up to three item thumbnails with an item count, and the total. (3) The order screen is now a full order detail: a six-step tracker (Placed, Accepted, Preparing, Ready, On the way, Delivered) with a single "Step N of 6" caption, a Deliver-to card, an Items card with photos, totals and payment, and a timeline of times. (4) Status wording changed: the old single "Out for delivery" is now two statuses, Partner assigned (a delivery partner accepted the order) and On the way (the order was picked up); status colors now match the web portals. (5) The Delivery Partner dashboard now shows only active work — Your active deliveries with the full drop-off details, then Available orders with an Accept button — and a new History screen lists finished deliveries. The old View address button and the "Claim" wording are gone. (6) Customers also receive an email when the restaurant accepts an order and when it is delivered.</w:t>
+        <w:t>Since version 2.0 the whole app was re-skinned with a new orange / navy / green look (pill-shaped buttons, rounded cards, colored section backgrounds) and the colors used behind white text were darkened so buttons and badges are easy to read. Signing in and Account changed too: the app now always starts signed out (each cold launch asks you to log in), and your name plus a Reset password option now appear in the Account tab (Customer) and the dashboard header (Delivery Partner). The Customer App screenshots in Chapter 3 (sign-up, Home, Store Detail, Cart, Checkout, Orders, order detail and Account) are real captures from a screen recording of the app on a phone, with personal details blurred. The Delivery Partner figures in Chapter 4 are wireframes drawn from the app's source code with demo data, because the Delivery screens have not yet been recorded on a device.</w:t>
+      </w:r>
+    </w:p>
+    <w:p>
+      <w:pPr>
+        <w:spacing w:after="160"/>
+      </w:pPr>
+      <w:r>
+        <w:t>What's new for version 4.0 (order visibility): (1) Checkout now asks for a required Phone number. (2) The Orders tab shows richer rows — store, a colored status pill, date and time, up to three item thumbnails with an item count, and the total. (3) The order screen is now a full order detail: a six-step tracker (Placed, Accepted, Preparing, Ready, On the way, Delivered) with a single "Step N of 6" caption, a Deliver-to card, an Items card with photos, totals and payment, and a timeline of times. (4) Status wording changed: the old single "Out for delivery" is now two statuses, Partner assigned (a delivery partner accepted the order) and On the way (the order was picked up); status colors now match the web portals. (5) The Delivery Partner dashboard now shows only active work — Your active deliveries with the full drop-off details, then Available orders with an Accept button — and a new History screen lists finished deliveries. The old View address button and the "Claim" wording are gone. (6) Customers also receive an email when the restaurant accepts an order and when it is delivered. (7) You can now create a Customer account inside the app: the customer sign-in screen has a Log in / Sign up toggle (full name, email, password of at least 6 characters), and after sign-up you are signed in automatically.</w:t>
       </w:r>
     </w:p>
     <w:p>
@@ -460,7 +460,7 @@
         <w:spacing w:after="100"/>
       </w:pPr>
       <w:r>
-        <w:t>Screens new in this version were built from the source code and checked by type-check, automated tests and code review; the screenshots marked as pending are being replaced with captures from a screen recording of the real app, so a caption ending "[Figure pending ...]" means the picture is not yet final.</w:t>
+        <w:t>Screenshots of the Customer App are captures from a screen recording of the real app running on a phone, with personal details blurred (the round blue gear button in them is the Expo developer menu of the test build, not part of the app). The three Delivery Partner figures in Chapter 4 are wireframes drawn from the app's source code with demo data — the Delivery screens have not yet been recorded on a device. Everything new in this version was also checked by type-check, automated tests and code review.</w:t>
       </w:r>
     </w:p>
     <w:p>
@@ -509,7 +509,7 @@
         <w:spacing w:after="160"/>
       </w:pPr>
       <w:r>
-        <w:t xml:space="preserve">Enter the email and password for your existing Fresh &amp; Quick account and tap Log In. There is no separate account-creation screen inside the mobile app in this build — if you don't yet have an account, sign up once through the Fresh &amp; Quick web app in a browser, then come back and sign in here with the same email and password. Once you have an account, it works on both web and mobile interchangeably.</w:t>
+        <w:t>Enter the email and password for your Fresh &amp; Quick account and tap Log In. If you do not have an account yet, tap "Need an account? Sign up" under the form: the screen changes to Customer Sign Up, where you enter your full name, your email and a password of at least 6 characters, then tap Sign Up. When the account is created you are signed in automatically and land on Home. Accounts made in the app and accounts made on the web app are the same — the same email and password work on both. (Only the Customer App has sign-up; delivery partner accounts are created by an administrator.) On the sign-up screen, "Have an account? Log in" switches back.</w:t>
       </w:r>
     </w:p>
     <w:p>
@@ -578,6 +578,62 @@
     </w:p>
     <w:p>
       <w:pPr>
+        <w:spacing w:after="80" w:before="120"/>
+        <w:jc w:val="center"/>
+      </w:pPr>
+      <w:r>
+        <w:drawing>
+          <wp:inline xmlns:a="http://schemas.openxmlformats.org/drawingml/2006/main" xmlns:pic="http://schemas.openxmlformats.org/drawingml/2006/picture">
+            <wp:extent cx="2103120" cy="4558390"/>
+            <wp:docPr id="9001" name="Figure 9001"/>
+            <wp:cNvGraphicFramePr>
+              <a:graphicFrameLocks noChangeAspect="1"/>
+            </wp:cNvGraphicFramePr>
+            <a:graphic>
+              <a:graphicData uri="http://schemas.openxmlformats.org/drawingml/2006/picture">
+                <pic:pic>
+                  <pic:nvPicPr>
+                    <pic:cNvPr id="9001" name="signup.png"/>
+                    <pic:cNvPicPr/>
+                  </pic:nvPicPr>
+                  <pic:blipFill>
+                    <a:blip r:embed="rId7"/>
+                    <a:stretch>
+                      <a:fillRect/>
+                    </a:stretch>
+                  </pic:blipFill>
+                  <pic:spPr>
+                    <a:xfrm>
+                      <a:off x="0" y="0"/>
+                      <a:ext cx="2103120" cy="4558390"/>
+                    </a:xfrm>
+                    <a:prstGeom prst="rect"/>
+                  </pic:spPr>
+                </pic:pic>
+              </a:graphicData>
+            </a:graphic>
+          </wp:inline>
+        </w:drawing>
+      </w:r>
+    </w:p>
+    <w:p>
+      <w:pPr>
+        <w:spacing w:after="240"/>
+        <w:jc w:val="center"/>
+      </w:pPr>
+      <w:r>
+        <w:rPr>
+          <w:i/>
+          <w:iCs/>
+          <w:color w:val="6B6A5F"/>
+          <w:sz w:val="18"/>
+          <w:szCs w:val="18"/>
+        </w:rPr>
+        <w:t>Screenshot — Customer sign-up screen (full name, email, password, Sign Up). Personal details blurred.</w:t>
+      </w:r>
+    </w:p>
+    <w:p>
+      <w:pPr>
         <w:spacing w:after="160"/>
       </w:pPr>
       <w:r>
@@ -1264,76 +1320,6 @@
     </w:p>
     <w:p>
       <w:pPr>
-        <w:spacing w:after="240"/>
-        <w:jc w:val="center"/>
-      </w:pPr>
-      <w:r>
-        <w:rPr>
-          <w:i/>
-          <w:iCs/>
-          <w:color w:val="6B6A5F"/>
-          <w:sz w:val="18"/>
-          <w:szCs w:val="18"/>
-        </w:rPr>
-        <w:t>Screenshot — Orders tab: order rows with store, status pill, date, item thumbnails and total. [Figure pending: screenshot from the updated app]</w:t>
-      </w:r>
-    </w:p>
-    <w:p>
-      <w:pPr>
-        <w:pStyle w:val="Heading2"/>
-      </w:pPr>
-      <w:r>
-        <w:t>3.6 Order Detail and Tracking</w:t>
-      </w:r>
-    </w:p>
-    <w:p>
-      <w:pPr>
-        <w:spacing w:after="160"/>
-      </w:pPr>
-      <w:r>
-        <w:t>Tapping an order opens its detail screen. At the top is the heading "Order #" followed by the first eight characters of the order id, with the status pill beside it, then the store name and the time the order was placed, and a one-line status message (for example "Restaurant is preparing your order"). Below that is the order tracker: six numbered circles joined by lines — Placed, Accepted, Preparing, Ready, On the way, Delivered — with finished steps checked and the line filled up to the current step. Because six labels do not fit a phone's width, the tracker shows a single caption under the circles instead, such as "Step 3 of 6 · Preparing". The two delivery statuses share step 5: Partner assigned and On the way both show "Step 5 of 6 · On the way" (the status pill and message tell them apart). If the restaurant rejects the order, or the order is cancelled, a red banner ("Restaurant rejected your order — payment refunded" or "Order cancelled") replaces the tracker. If payment failed, the screen shows "Payment failed. Your order was not placed — please try checking out again." instead of the tracker.</w:t>
-      </w:r>
-    </w:p>
-    <w:p>
-      <w:pPr>
-        <w:spacing w:after="160"/>
-      </w:pPr>
-      <w:r>
-        <w:t>Below the tracker the screen shows: a Deliver to card (your name, email and phone — the phone is a tap-to-call link when it is a normal +91 number, otherwise plain text — then your delivery address and, if you entered one, the delivery note, or "No delivery address on file"); an Items card with each item's photo, quantity, chosen options, any special instructions and line total; a totals block (Subtotal, Delivery fee, Total, and Payment, for example "Paid · Cash on delivery"); and a timeline of times for the stages the order has reached (Placed, Accepted, Picked up, Delivered).</w:t>
-      </w:r>
-    </w:p>
-    <w:p>
-      <w:pPr>
-        <w:spacing w:after="160"/>
-      </w:pPr>
-      <w:r>
-        <w:t>Once a delivery partner is assigned (status Partner assigned or On the way), a courier card appears below the tracker with a "Delivery partner" label (the partner's name is not shown), an initials circle and Call / Message icon buttons.</w:t>
-      </w:r>
-    </w:p>
-    <w:p>
-      <w:pPr>
-        <w:spacing w:after="160"/>
-        <w:ind w:left="360"/>
-      </w:pPr>
-      <w:r>
-        <w:rPr>
-          <w:b/>
-          <w:bCs/>
-          <w:color w:val="B45309"/>
-        </w:rPr>
-        <w:t xml:space="preserve">Not fully wired up yet: the courier card's Call and Message buttons. Both show an alert (“isn't wired up to a real backend yet”) rather than placing a call or opening a chat — there is no telephony or messaging integration in this build.</w:t>
-      </w:r>
-    </w:p>
-    <w:p>
-      <w:pPr>
-        <w:spacing w:after="160"/>
-      </w:pPr>
-      <w:r>
-        <w:t>While a partner is assigned or on the way, a bordered box below the courier card shows their last-known coordinates as plain text (e.g. “12.9716, 77.5946”) with a timestamp, and an explicit “Live map coming soon” line — there is no Google Maps key configured, so this is a coordinate readout, not an interactive map. The whole detail screen refreshes automatically every 3 seconds while it's open, and stops refreshing once the order reaches a final status (Delivered, Cancelled or Rejected).</w:t>
-      </w:r>
-    </w:p>
-    <w:p>
-      <w:pPr>
         <w:spacing w:after="80" w:before="120"/>
         <w:jc w:val="center"/>
       </w:pPr>
@@ -1341,7 +1327,7 @@
         <w:drawing>
           <wp:inline xmlns:a="http://schemas.openxmlformats.org/drawingml/2006/main" xmlns:pic="http://schemas.openxmlformats.org/drawingml/2006/picture">
             <wp:extent cx="2103120" cy="4558390"/>
-            <wp:docPr id="13" name="Picture 13"/>
+            <wp:docPr id="9002" name="Figure 9002"/>
             <wp:cNvGraphicFramePr>
               <a:graphicFrameLocks noChangeAspect="1"/>
             </wp:cNvGraphicFramePr>
@@ -1349,11 +1335,11 @@
               <a:graphicData uri="http://schemas.openxmlformats.org/drawingml/2006/picture">
                 <pic:pic>
                   <pic:nvPicPr>
-                    <pic:cNvPr id="0" name="track.jpg"/>
+                    <pic:cNvPr id="9002" name="orders.png"/>
                     <pic:cNvPicPr/>
                   </pic:nvPicPr>
                   <pic:blipFill>
-                    <a:blip r:embed="rId20"/>
+                    <a:blip r:embed="rId8"/>
                     <a:stretch>
                       <a:fillRect/>
                     </a:stretch>
@@ -1385,7 +1371,173 @@
           <w:sz w:val="18"/>
           <w:szCs w:val="18"/>
         </w:rPr>
-        <w:t>Screenshot — Order Tracking: status stepper, courier card, and coordinate readout (older four-step tracker). [Figure pending: replacement screenshot from the updated app]</w:t>
+        <w:t>Screenshot — Orders tab: each order row shows the store, date and time, a colored status pill, up to three item thumbnails with an item count, and the total.</w:t>
+      </w:r>
+    </w:p>
+    <w:p>
+      <w:pPr>
+        <w:pStyle w:val="Heading2"/>
+      </w:pPr>
+      <w:r>
+        <w:t>3.6 Order Detail and Tracking</w:t>
+      </w:r>
+    </w:p>
+    <w:p>
+      <w:pPr>
+        <w:spacing w:after="160"/>
+      </w:pPr>
+      <w:r>
+        <w:t>Tapping an order opens its detail screen. At the top is the heading "Order #" followed by the first eight characters of the order id, with the status pill beside it, then the store name and the time the order was placed, and a one-line status message (for example "Restaurant is preparing your order"). Below that is the order tracker: six numbered circles joined by lines — Placed, Accepted, Preparing, Ready, On the way, Delivered — with finished steps checked and the line filled up to the current step. Because six labels do not fit a phone's width, the tracker shows a single caption under the circles instead, such as "Step 3 of 6 · Preparing". The two delivery statuses share step 5: Partner assigned and On the way both show "Step 5 of 6 · On the way" (the status pill and message tell them apart). If the restaurant rejects the order, or the order is cancelled, a red banner ("Restaurant rejected your order — payment refunded" or "Order cancelled") replaces the tracker. If payment failed, the screen shows "Payment failed. Your order was not placed — please try checking out again." instead of the tracker.</w:t>
+      </w:r>
+    </w:p>
+    <w:p>
+      <w:pPr>
+        <w:spacing w:after="160"/>
+      </w:pPr>
+      <w:r>
+        <w:t>Below the tracker the screen shows: a Deliver to card (your name, email and phone — the phone is a tap-to-call link when it is a normal +91 number, otherwise plain text — then your delivery address and, if you entered one, the delivery note, or "No delivery address on file"); an Items card with each item's photo, quantity, chosen options, any special instructions and line total; a totals block (Subtotal, Delivery fee, Total, and Payment, for example "Paid · Cash on delivery"); and a timeline of times for the stages the order has reached (Placed, Accepted, Picked up, Delivered).</w:t>
+      </w:r>
+    </w:p>
+    <w:p>
+      <w:pPr>
+        <w:spacing w:after="160"/>
+      </w:pPr>
+      <w:r>
+        <w:t>Once a delivery partner is assigned (status Partner assigned or On the way), a courier card appears below the tracker with a "Delivery partner" label (the partner's name is not shown), an initials circle and Call / Message icon buttons.</w:t>
+      </w:r>
+    </w:p>
+    <w:p>
+      <w:pPr>
+        <w:spacing w:after="160"/>
+        <w:ind w:left="360"/>
+      </w:pPr>
+      <w:r>
+        <w:rPr>
+          <w:b/>
+          <w:bCs/>
+          <w:color w:val="B45309"/>
+        </w:rPr>
+        <w:t xml:space="preserve">Not fully wired up yet: the courier card's Call and Message buttons. Both show an alert (“isn't wired up to a real backend yet”) rather than placing a call or opening a chat — there is no telephony or messaging integration in this build.</w:t>
+      </w:r>
+    </w:p>
+    <w:p>
+      <w:pPr>
+        <w:spacing w:after="160"/>
+      </w:pPr>
+      <w:r>
+        <w:t>While a partner is assigned or on the way, a bordered box below the courier card shows their last-known coordinates as plain text (e.g. “12.9716, 77.5946”) with a timestamp, and an explicit “Live map coming soon” line — there is no Google Maps key configured, so this is a coordinate readout, not an interactive map. The whole detail screen refreshes automatically every 3 seconds while it's open, and stops refreshing once the order reaches a final status (Delivered, Cancelled or Rejected).</w:t>
+      </w:r>
+    </w:p>
+    <w:p>
+      <w:pPr>
+        <w:spacing w:after="80" w:before="120"/>
+        <w:jc w:val="center"/>
+      </w:pPr>
+      <w:r>
+        <w:drawing>
+          <wp:inline xmlns:a="http://schemas.openxmlformats.org/drawingml/2006/main" xmlns:pic="http://schemas.openxmlformats.org/drawingml/2006/picture">
+            <wp:extent cx="2103120" cy="4558390"/>
+            <wp:docPr id="9003" name="Figure 9003"/>
+            <wp:cNvGraphicFramePr>
+              <a:graphicFrameLocks noChangeAspect="1"/>
+            </wp:cNvGraphicFramePr>
+            <a:graphic>
+              <a:graphicData uri="http://schemas.openxmlformats.org/drawingml/2006/picture">
+                <pic:pic>
+                  <pic:nvPicPr>
+                    <pic:cNvPr id="9003" name="detail_placed.png"/>
+                    <pic:cNvPicPr/>
+                  </pic:nvPicPr>
+                  <pic:blipFill>
+                    <a:blip r:embed="rId11"/>
+                    <a:stretch>
+                      <a:fillRect/>
+                    </a:stretch>
+                  </pic:blipFill>
+                  <pic:spPr>
+                    <a:xfrm>
+                      <a:off x="0" y="0"/>
+                      <a:ext cx="2103120" cy="4558390"/>
+                    </a:xfrm>
+                    <a:prstGeom prst="rect"/>
+                  </pic:spPr>
+                </pic:pic>
+              </a:graphicData>
+            </a:graphic>
+          </wp:inline>
+        </w:drawing>
+      </w:r>
+    </w:p>
+    <w:p>
+      <w:pPr>
+        <w:spacing w:after="240"/>
+        <w:jc w:val="center"/>
+      </w:pPr>
+      <w:r>
+        <w:rPr>
+          <w:i/>
+          <w:iCs/>
+          <w:color w:val="6B6A5F"/>
+          <w:sz w:val="18"/>
+          <w:szCs w:val="18"/>
+        </w:rPr>
+        <w:t>Screenshot — Order detail just after placing: "Step 1 of 6 · Placed", the Deliver to card (blurred here), the Items card with photos, and totals.</w:t>
+      </w:r>
+    </w:p>
+    <w:p>
+      <w:pPr>
+        <w:spacing w:after="80" w:before="120"/>
+        <w:jc w:val="center"/>
+      </w:pPr>
+      <w:r>
+        <w:drawing>
+          <wp:inline xmlns:a="http://schemas.openxmlformats.org/drawingml/2006/main" xmlns:pic="http://schemas.openxmlformats.org/drawingml/2006/picture">
+            <wp:extent cx="2103120" cy="4558390"/>
+            <wp:docPr id="13" name="Picture 13"/>
+            <wp:cNvGraphicFramePr>
+              <a:graphicFrameLocks noChangeAspect="1"/>
+            </wp:cNvGraphicFramePr>
+            <a:graphic>
+              <a:graphicData uri="http://schemas.openxmlformats.org/drawingml/2006/picture">
+                <pic:pic>
+                  <pic:nvPicPr>
+                    <pic:cNvPr id="0" name="track.jpg"/>
+                    <pic:cNvPicPr/>
+                  </pic:nvPicPr>
+                  <pic:blipFill>
+                    <a:blip r:embed="rId9"/>
+                    <a:stretch>
+                      <a:fillRect/>
+                    </a:stretch>
+                  </pic:blipFill>
+                  <pic:spPr>
+                    <a:xfrm>
+                      <a:off x="0" y="0"/>
+                      <a:ext cx="2103120" cy="4558390"/>
+                    </a:xfrm>
+                    <a:prstGeom prst="rect"/>
+                  </pic:spPr>
+                </pic:pic>
+              </a:graphicData>
+            </a:graphic>
+          </wp:inline>
+        </w:drawing>
+      </w:r>
+    </w:p>
+    <w:p>
+      <w:pPr>
+        <w:spacing w:after="240"/>
+        <w:jc w:val="center"/>
+      </w:pPr>
+      <w:r>
+        <w:rPr>
+          <w:i/>
+          <w:iCs/>
+          <w:color w:val="6B6A5F"/>
+          <w:sz w:val="18"/>
+          <w:szCs w:val="18"/>
+        </w:rPr>
+        <w:t>Screenshot — Order detail with a delivery partner assigned: six-step tracker at "Step 5 of 6 · On the way", courier card, and coordinate readout. Personal details blurred.</w:t>
       </w:r>
     </w:p>
     <w:p>
@@ -1406,6 +1558,472 @@
                 <pic:pic>
                   <pic:nvPicPr>
                     <pic:cNvPr id="0" name="delivered.jpg"/>
+                    <pic:cNvPicPr/>
+                  </pic:nvPicPr>
+                  <pic:blipFill>
+                    <a:blip r:embed="rId10"/>
+                    <a:stretch>
+                      <a:fillRect/>
+                    </a:stretch>
+                  </pic:blipFill>
+                  <pic:spPr>
+                    <a:xfrm>
+                      <a:off x="0" y="0"/>
+                      <a:ext cx="2103120" cy="4558390"/>
+                    </a:xfrm>
+                    <a:prstGeom prst="rect"/>
+                  </pic:spPr>
+                </pic:pic>
+              </a:graphicData>
+            </a:graphic>
+          </wp:inline>
+        </w:drawing>
+      </w:r>
+    </w:p>
+    <w:p>
+      <w:pPr>
+        <w:spacing w:after="240"/>
+        <w:jc w:val="center"/>
+      </w:pPr>
+      <w:r>
+        <w:rPr>
+          <w:i/>
+          <w:iCs/>
+          <w:color w:val="6B6A5F"/>
+          <w:sz w:val="18"/>
+          <w:szCs w:val="18"/>
+        </w:rPr>
+        <w:t>Screenshot — Order detail once delivered: all six steps checked ("Step 6 of 6 · Delivered"). Personal details blurred.</w:t>
+      </w:r>
+    </w:p>
+    <w:p>
+      <w:pPr>
+        <w:spacing w:after="80" w:before="120"/>
+        <w:jc w:val="center"/>
+      </w:pPr>
+      <w:r>
+        <w:drawing>
+          <wp:inline xmlns:a="http://schemas.openxmlformats.org/drawingml/2006/main" xmlns:pic="http://schemas.openxmlformats.org/drawingml/2006/picture">
+            <wp:extent cx="2103120" cy="4558390"/>
+            <wp:docPr id="9004" name="Figure 9004"/>
+            <wp:cNvGraphicFramePr>
+              <a:graphicFrameLocks noChangeAspect="1"/>
+            </wp:cNvGraphicFramePr>
+            <a:graphic>
+              <a:graphicData uri="http://schemas.openxmlformats.org/drawingml/2006/picture">
+                <pic:pic>
+                  <pic:nvPicPr>
+                    <pic:cNvPr id="9004" name="detail_times.png"/>
+                    <pic:cNvPicPr/>
+                  </pic:nvPicPr>
+                  <pic:blipFill>
+                    <a:blip r:embed="rId18"/>
+                    <a:stretch>
+                      <a:fillRect/>
+                    </a:stretch>
+                  </pic:blipFill>
+                  <pic:spPr>
+                    <a:xfrm>
+                      <a:off x="0" y="0"/>
+                      <a:ext cx="2103120" cy="4558390"/>
+                    </a:xfrm>
+                    <a:prstGeom prst="rect"/>
+                  </pic:spPr>
+                </pic:pic>
+              </a:graphicData>
+            </a:graphic>
+          </wp:inline>
+        </w:drawing>
+      </w:r>
+    </w:p>
+    <w:p>
+      <w:pPr>
+        <w:spacing w:after="240"/>
+        <w:jc w:val="center"/>
+      </w:pPr>
+      <w:r>
+        <w:rPr>
+          <w:i/>
+          <w:iCs/>
+          <w:color w:val="6B6A5F"/>
+          <w:sz w:val="18"/>
+          <w:szCs w:val="18"/>
+        </w:rPr>
+        <w:t>Screenshot — Order detail scrolled down: items, totals and payment, and the timeline of times (Placed, Accepted, Picked up, Delivered). Personal details blurred.</w:t>
+      </w:r>
+    </w:p>
+    <w:p>
+      <w:pPr>
+        <w:pStyle w:val="Heading2"/>
+      </w:pPr>
+      <w:r>
+        <w:t xml:space="preserve">3.7 Account (tab, new)</w:t>
+      </w:r>
+    </w:p>
+    <w:p>
+      <w:pPr>
+        <w:spacing w:after="160"/>
+      </w:pPr>
+      <w:r>
+        <w:t>The Account tab replaces the earlier build's separate top-level navigation to account-related screens with a single screen. At the top is a profile card showing your name and email, with a Reset password link underneath: tapping it sends a password-reset email to your account address, and the link changes to “Reset email sent” once the server accepts it. Below the card are three rows:</w:t>
+      </w:r>
+    </w:p>
+    <w:p>
+      <w:pPr>
+        <w:pStyle w:val="ListParagraph"/>
+        <w:numPr>
+          <w:ilvl w:val="0"/>
+          <w:numId w:val="2"/>
+        </w:numPr>
+        <w:spacing w:after="100"/>
+      </w:pPr>
+      <w:r>
+        <w:t xml:space="preserve">Wallet — opens a read-only reference screen listing the payment methods available at checkout (Mock Card, Mock UPI, Cash on Delivery). No real card or bank details are ever stored or shown here, since this app uses mock payments only.</w:t>
+      </w:r>
+    </w:p>
+    <w:p>
+      <w:pPr>
+        <w:pStyle w:val="ListParagraph"/>
+        <w:numPr>
+          <w:ilvl w:val="0"/>
+          <w:numId w:val="2"/>
+        </w:numPr>
+        <w:spacing w:after="100"/>
+      </w:pPr>
+      <w:r>
+        <w:t xml:space="preserve">Help — opens a static FAQ screen covering finding stores, placing and tracking orders, cancellation, and payment methods — the same content as Chapter 5 of this manual.</w:t>
+      </w:r>
+    </w:p>
+    <w:p>
+      <w:pPr>
+        <w:pStyle w:val="ListParagraph"/>
+        <w:numPr>
+          <w:ilvl w:val="0"/>
+          <w:numId w:val="2"/>
+        </w:numPr>
+        <w:spacing w:after="100"/>
+      </w:pPr>
+      <w:r>
+        <w:t xml:space="preserve">Sign out — confirms with a native dialog, then signs you out and returns you to the role picker.</w:t>
+      </w:r>
+    </w:p>
+    <w:p>
+      <w:pPr>
+        <w:spacing w:after="80" w:before="120"/>
+        <w:jc w:val="center"/>
+      </w:pPr>
+      <w:r>
+        <w:drawing>
+          <wp:inline distT="0" distB="0" distL="0" distR="0">
+            <wp:extent cx="2476500" cy="2901950"/>
+            <wp:effectExtent t="0" r="0" b="0" l="0"/>
+            <wp:docPr id="6" name="" descr="" title=""/>
+            <wp:cNvGraphicFramePr>
+              <a:graphicFrameLocks xmlns:a="http://schemas.openxmlformats.org/drawingml/2006/main" noChangeAspect="1"/>
+            </wp:cNvGraphicFramePr>
+            <a:graphic xmlns:a="http://schemas.openxmlformats.org/drawingml/2006/main">
+              <a:graphicData uri="http://schemas.openxmlformats.org/drawingml/2006/picture">
+                <pic:pic xmlns:pic="http://schemas.openxmlformats.org/drawingml/2006/picture">
+                  <pic:nvPicPr>
+                    <pic:cNvPr id="0" name="" descr=""/>
+                    <pic:cNvPicPr>
+                      <a:picLocks noChangeAspect="1" noChangeArrowheads="1"/>
+                    </pic:cNvPicPr>
+                  </pic:nvPicPr>
+                  <pic:blipFill>
+                    <a:blip r:embed="rId20" cstate="none"/>
+                    <a:srcRect/>
+                    <a:stretch>
+                      <a:fillRect/>
+                    </a:stretch>
+                  </pic:blipFill>
+                  <pic:spPr bwMode="auto">
+                    <a:xfrm>
+                      <a:off x="0" y="0"/>
+                      <a:ext cx="2476500" cy="2901950"/>
+                    </a:xfrm>
+                    <a:prstGeom prst="rect">
+                      <a:avLst/>
+                    </a:prstGeom>
+                  </pic:spPr>
+                </pic:pic>
+              </a:graphicData>
+            </a:graphic>
+          </wp:inline>
+        </w:drawing>
+      </w:r>
+    </w:p>
+    <w:p>
+      <w:pPr>
+        <w:spacing w:after="240"/>
+        <w:jc w:val="center"/>
+      </w:pPr>
+      <w:r>
+        <w:rPr>
+          <w:i/>
+          <w:iCs/>
+          <w:color w:val="6B6A5F"/>
+          <w:sz w:val="18"/>
+          <w:szCs w:val="18"/>
+        </w:rPr>
+        <w:t>Screenshot — Account tab: your name and email (blurred here), Reset password, Wallet, Help and Sign out.</w:t>
+      </w:r>
+    </w:p>
+    <w:p>
+      <w:pPr>
+        <w:pStyle w:val="Heading2"/>
+      </w:pPr>
+      <w:r>
+        <w:t xml:space="preserve">3.8 Where Things Moved From the Previous Build</w:t>
+      </w:r>
+    </w:p>
+    <w:p>
+      <w:pPr>
+        <w:spacing w:after="160"/>
+      </w:pPr>
+      <w:r>
+        <w:t xml:space="preserve">If you used the app before this redesign, here's a quick map from old to new:</w:t>
+      </w:r>
+    </w:p>
+    <w:p>
+      <w:pPr>
+        <w:pStyle w:val="ListParagraph"/>
+        <w:numPr>
+          <w:ilvl w:val="0"/>
+          <w:numId w:val="2"/>
+        </w:numPr>
+        <w:spacing w:after="100"/>
+      </w:pPr>
+      <w:r>
+        <w:t xml:space="preserve">Home, Cart, Checkout as separate always-visible nav links → Home is now a tab; Cart is a bottom sheet reached via the floating cart pill (see below) or the Checkout screen's back button; Checkout is reached from the cart.</w:t>
+      </w:r>
+    </w:p>
+    <w:p>
+      <w:pPr>
+        <w:pStyle w:val="ListParagraph"/>
+        <w:numPr>
+          <w:ilvl w:val="0"/>
+          <w:numId w:val="2"/>
+        </w:numPr>
+        <w:spacing w:after="100"/>
+      </w:pPr>
+      <w:r>
+        <w:t xml:space="preserve">A single long checkout form → the same fields, now grouped into three tap-to-expand rows plus a separate contact-details block, with the submit button pinned to the bottom of the screen instead of scrolling with the form.</w:t>
+      </w:r>
+    </w:p>
+    <w:p>
+      <w:pPr>
+        <w:pStyle w:val="ListParagraph"/>
+        <w:numPr>
+          <w:ilvl w:val="0"/>
+          <w:numId w:val="2"/>
+        </w:numPr>
+        <w:spacing w:after="100"/>
+      </w:pPr>
+      <w:r>
+        <w:t xml:space="preserve">Wallet and Help as their own reachable screens → both now live one tap deeper, under the Account tab.</w:t>
+      </w:r>
+    </w:p>
+    <w:p>
+      <w:pPr>
+        <w:pStyle w:val="ListParagraph"/>
+        <w:numPr>
+          <w:ilvl w:val="0"/>
+          <w:numId w:val="2"/>
+        </w:numPr>
+        <w:spacing w:after="100"/>
+      </w:pPr>
+      <w:r>
+        <w:t>A plain order-status text line → the six-step order tracker described in §3.6, inside a full order detail screen.</w:t>
+      </w:r>
+    </w:p>
+    <w:p>
+      <w:pPr>
+        <w:spacing w:after="160"/>
+      </w:pPr>
+      <w:r>
+        <w:t xml:space="preserve">One more piece of new chrome: whenever your cart has at least one item, a floating pill (“N items · View cart · ₹total”) appears above the tab bar on the Home and Store Detail screens — tapping it opens the cart bottom sheet directly. It's hidden on the Cart, Checkout, Account, and Orders screens themselves.</w:t>
+      </w:r>
+    </w:p>
+    <w:p>
+      <w:pPr>
+        <w:pStyle w:val="Heading1"/>
+        <w:pageBreakBefore/>
+      </w:pPr>
+      <w:r>
+        <w:t xml:space="preserve">Chapter 4 — Delivery Partner App</w:t>
+      </w:r>
+    </w:p>
+    <w:p>
+      <w:pPr>
+        <w:spacing w:after="160"/>
+      </w:pPr>
+      <w:r>
+        <w:t>The Delivery Partner App opens on a dashboard once you're signed in, mirroring the web delivery portal's dashboard, with a second History screen reached from a History link in the header. The header also shows your name with a Reset password link (same behavior as the Customer Account tab, see §3.7). The dashboard shows only active work: your active deliveries first, then orders available to accept.</w:t>
+      </w:r>
+    </w:p>
+    <w:p>
+      <w:pPr>
+        <w:pStyle w:val="Heading2"/>
+      </w:pPr>
+      <w:r>
+        <w:t xml:space="preserve">4.1 Signing In</w:t>
+      </w:r>
+    </w:p>
+    <w:p>
+      <w:pPr>
+        <w:spacing w:after="160"/>
+      </w:pPr>
+      <w:r>
+        <w:t xml:space="preserve">From the role picker, choose Delivery Partner and sign in with your delivery partner account's email and password.</w:t>
+      </w:r>
+    </w:p>
+    <w:p>
+      <w:pPr>
+        <w:pStyle w:val="Heading2"/>
+      </w:pPr>
+      <w:r>
+        <w:t xml:space="preserve">4.2 Going Online and Offline</w:t>
+      </w:r>
+    </w:p>
+    <w:p>
+      <w:pPr>
+        <w:spacing w:after="160"/>
+      </w:pPr>
+      <w:r>
+        <w:t>At the top of the dashboard is a large Online/Offline toggle. Tap it to switch status; while toggling, a loading indicator shows in place of the label. While you are Offline the Available orders section only says "Go online to see available orders."; you only see available orders, and only send location pings, while toggled Online.</w:t>
+      </w:r>
+    </w:p>
+    <w:p>
+      <w:pPr>
+        <w:pStyle w:val="Heading2"/>
+      </w:pPr>
+      <w:r>
+        <w:t xml:space="preserve">4.3 Available Orders</w:t>
+      </w:r>
+    </w:p>
+    <w:p>
+      <w:pPr>
+        <w:spacing w:after="160"/>
+      </w:pPr>
+      <w:r>
+        <w:t>The Available orders section lists orders that have reached Ready status and that no partner has accepted yet. Each card shows the store name and pickup address, the items in the order (with photos), the order amount, and an Accept button. To protect the customer's privacy, the customer's name, phone number and address are not shown here — the card says "Customer details appear after you accept." Tap Accept to take the order: it moves into Your active deliveries and is no longer visible to other partners. With nothing available the section says "None right now." The list refreshes automatically every 10 seconds while you're online.</w:t>
+      </w:r>
+    </w:p>
+    <w:p>
+      <w:pPr>
+        <w:spacing w:after="80" w:before="120"/>
+        <w:jc w:val="center"/>
+      </w:pPr>
+      <w:r>
+        <w:drawing>
+          <wp:inline xmlns:a="http://schemas.openxmlformats.org/drawingml/2006/main" xmlns:pic="http://schemas.openxmlformats.org/drawingml/2006/picture">
+            <wp:extent cx="2103120" cy="4558390"/>
+            <wp:docPr id="9005" name="Figure 9005"/>
+            <wp:cNvGraphicFramePr>
+              <a:graphicFrameLocks noChangeAspect="1"/>
+            </wp:cNvGraphicFramePr>
+            <a:graphic>
+              <a:graphicData uri="http://schemas.openxmlformats.org/drawingml/2006/picture">
+                <pic:pic>
+                  <pic:nvPicPr>
+                    <pic:cNvPr id="9005" name="wf_delivery_available.png"/>
+                    <pic:cNvPicPr/>
+                  </pic:nvPicPr>
+                  <pic:blipFill>
+                    <a:blip r:embed="rId12"/>
+                    <a:stretch>
+                      <a:fillRect/>
+                    </a:stretch>
+                  </pic:blipFill>
+                  <pic:spPr>
+                    <a:xfrm>
+                      <a:off x="0" y="0"/>
+                      <a:ext cx="2103120" cy="4558390"/>
+                    </a:xfrm>
+                    <a:prstGeom prst="rect"/>
+                  </pic:spPr>
+                </pic:pic>
+              </a:graphicData>
+            </a:graphic>
+          </wp:inline>
+        </w:drawing>
+      </w:r>
+    </w:p>
+    <w:p>
+      <w:pPr>
+        <w:spacing w:after="240"/>
+        <w:jc w:val="center"/>
+      </w:pPr>
+      <w:r>
+        <w:rPr>
+          <w:i/>
+          <w:iCs/>
+          <w:color w:val="6B6A5F"/>
+          <w:sz w:val="18"/>
+          <w:szCs w:val="18"/>
+        </w:rPr>
+        <w:t>Wireframe — Delivery dashboard with an Available order card (pickup store and address, items, Accept). Drawn from the app's source with demo data; not yet captured on a device.</w:t>
+      </w:r>
+    </w:p>
+    <w:p>
+      <w:pPr>
+        <w:pStyle w:val="Heading2"/>
+      </w:pPr>
+      <w:r>
+        <w:t xml:space="preserve">4.4 Your Deliveries and Advancing Status</w:t>
+      </w:r>
+    </w:p>
+    <w:p>
+      <w:pPr>
+        <w:spacing w:after="160"/>
+      </w:pPr>
+      <w:r>
+        <w:t>The Your active deliveries section lists the orders you have accepted that are not finished yet (status Partner assigned or On the way); with none it says "No active deliveries." Each card shows the order number, a status pill, the amount, the Pickup store and its address, the Drop-off details (see §4.5), and the items with photos. A single action button advances the order: Mark picked up while the order is Partner assigned, then Mark delivered once it is On the way. Each button reflects the correct next step; there is no way to skip a step or move an order backward. A delivered order leaves this list and moves to History.</w:t>
+      </w:r>
+    </w:p>
+    <w:p>
+      <w:pPr>
+        <w:pStyle w:val="Heading2"/>
+      </w:pPr>
+      <w:r>
+        <w:t>4.5 Drop-off Details and History</w:t>
+      </w:r>
+    </w:p>
+    <w:p>
+      <w:pPr>
+        <w:spacing w:after="160"/>
+      </w:pPr>
+      <w:r>
+        <w:t>Once you have accepted an order, its active card shows the drop-off details: the recipient's name, their phone number (tap it to call when it is a normal +91 number), the full delivery address and the delivery note, if there is one. You can see a customer's phone and address only while the order is Partner assigned or On the way for you; the old View address button no longer exists because the details are shown directly on the card. This build has no Google Maps key configured, matching the Customer App's own coordinate-only tracking view.</w:t>
+      </w:r>
+    </w:p>
+    <w:p>
+      <w:pPr>
+        <w:spacing w:after="160"/>
+      </w:pPr>
+      <w:r>
+        <w:t>The History link in the dashboard header opens the History screen: your finished orders, newest first, up to your 50 most recent. Each card shows the pickup store, who the order was delivered to, when it happened and a short summary of the items — no phone number or address is shown for finished orders. A Refresh button reloads the list and a Back to dashboard link returns you to the dashboard; with nothing finished yet it says "No completed deliveries yet."</w:t>
+      </w:r>
+    </w:p>
+    <w:p>
+      <w:pPr>
+        <w:spacing w:after="80" w:before="120"/>
+        <w:jc w:val="center"/>
+      </w:pPr>
+      <w:r>
+        <w:drawing>
+          <wp:inline xmlns:a="http://schemas.openxmlformats.org/drawingml/2006/main" xmlns:pic="http://schemas.openxmlformats.org/drawingml/2006/picture">
+            <wp:extent cx="2103120" cy="4558390"/>
+            <wp:docPr id="9006" name="Figure 9006"/>
+            <wp:cNvGraphicFramePr>
+              <a:graphicFrameLocks noChangeAspect="1"/>
+            </wp:cNvGraphicFramePr>
+            <a:graphic>
+              <a:graphicData uri="http://schemas.openxmlformats.org/drawingml/2006/picture">
+                <pic:pic>
+                  <pic:nvPicPr>
+                    <pic:cNvPr id="9006" name="wf_delivery_active.png"/>
                     <pic:cNvPicPr/>
                   </pic:nvPicPr>
                   <pic:blipFill>
@@ -1441,78 +2059,7 @@
           <w:sz w:val="18"/>
           <w:szCs w:val="18"/>
         </w:rPr>
-        <w:t>Screenshot — Order Tracking once the order reaches Delivered (older screen, four steps checked). [Figure pending: replacement screenshot from the updated app]</w:t>
-      </w:r>
-    </w:p>
-    <w:p>
-      <w:pPr>
-        <w:spacing w:after="240"/>
-        <w:jc w:val="center"/>
-      </w:pPr>
-      <w:r>
-        <w:rPr>
-          <w:i/>
-          <w:iCs/>
-          <w:color w:val="6B6A5F"/>
-          <w:sz w:val="18"/>
-          <w:szCs w:val="18"/>
-        </w:rPr>
-        <w:t>Screenshot — Order detail: six-step tracker with "Step N of 6" caption, Deliver to card, Items card and totals. [Figure pending: screenshot from the updated app]</w:t>
-      </w:r>
-    </w:p>
-    <w:p>
-      <w:pPr>
-        <w:pStyle w:val="Heading2"/>
-      </w:pPr>
-      <w:r>
-        <w:t xml:space="preserve">3.7 Account (tab, new)</w:t>
-      </w:r>
-    </w:p>
-    <w:p>
-      <w:pPr>
-        <w:spacing w:after="160"/>
-      </w:pPr>
-      <w:r>
-        <w:t>The Account tab replaces the earlier build's separate top-level navigation to account-related screens with a single screen. At the top is a profile card showing your name and email, with a Reset password link underneath: tapping it sends a password-reset email to your account address, and the link changes to “Reset email sent” once the server accepts it. Below the card are three rows:</w:t>
-      </w:r>
-    </w:p>
-    <w:p>
-      <w:pPr>
-        <w:pStyle w:val="ListParagraph"/>
-        <w:numPr>
-          <w:ilvl w:val="0"/>
-          <w:numId w:val="2"/>
-        </w:numPr>
-        <w:spacing w:after="100"/>
-      </w:pPr>
-      <w:r>
-        <w:t xml:space="preserve">Wallet — opens a read-only reference screen listing the payment methods available at checkout (Mock Card, Mock UPI, Cash on Delivery). No real card or bank details are ever stored or shown here, since this app uses mock payments only.</w:t>
-      </w:r>
-    </w:p>
-    <w:p>
-      <w:pPr>
-        <w:pStyle w:val="ListParagraph"/>
-        <w:numPr>
-          <w:ilvl w:val="0"/>
-          <w:numId w:val="2"/>
-        </w:numPr>
-        <w:spacing w:after="100"/>
-      </w:pPr>
-      <w:r>
-        <w:t xml:space="preserve">Help — opens a static FAQ screen covering finding stores, placing and tracking orders, cancellation, and payment methods — the same content as Chapter 5 of this manual.</w:t>
-      </w:r>
-    </w:p>
-    <w:p>
-      <w:pPr>
-        <w:pStyle w:val="ListParagraph"/>
-        <w:numPr>
-          <w:ilvl w:val="0"/>
-          <w:numId w:val="2"/>
-        </w:numPr>
-        <w:spacing w:after="100"/>
-      </w:pPr>
-      <w:r>
-        <w:t xml:space="preserve">Sign out — confirms with a native dialog, then signs you out and returns you to the role picker.</w:t>
+        <w:t>Wireframe — Delivery dashboard with a Your active deliveries card (drop-off details and Mark picked up). Drawn from the app's source with demo data; not yet captured on a device.</w:t>
       </w:r>
     </w:p>
     <w:p>
@@ -1522,37 +2069,31 @@
       </w:pPr>
       <w:r>
         <w:drawing>
-          <wp:inline distT="0" distB="0" distL="0" distR="0">
-            <wp:extent cx="2476500" cy="2901950"/>
-            <wp:effectExtent t="0" r="0" b="0" l="0"/>
-            <wp:docPr id="6" name="" descr="" title=""/>
+          <wp:inline xmlns:a="http://schemas.openxmlformats.org/drawingml/2006/main" xmlns:pic="http://schemas.openxmlformats.org/drawingml/2006/picture">
+            <wp:extent cx="2103120" cy="4558390"/>
+            <wp:docPr id="9007" name="Figure 9007"/>
             <wp:cNvGraphicFramePr>
-              <a:graphicFrameLocks xmlns:a="http://schemas.openxmlformats.org/drawingml/2006/main" noChangeAspect="1"/>
+              <a:graphicFrameLocks noChangeAspect="1"/>
             </wp:cNvGraphicFramePr>
-            <a:graphic xmlns:a="http://schemas.openxmlformats.org/drawingml/2006/main">
+            <a:graphic>
               <a:graphicData uri="http://schemas.openxmlformats.org/drawingml/2006/picture">
-                <pic:pic xmlns:pic="http://schemas.openxmlformats.org/drawingml/2006/picture">
+                <pic:pic>
                   <pic:nvPicPr>
-                    <pic:cNvPr id="0" name="" descr=""/>
-                    <pic:cNvPicPr>
-                      <a:picLocks noChangeAspect="1" noChangeArrowheads="1"/>
-                    </pic:cNvPicPr>
+                    <pic:cNvPr id="9007" name="wf_delivery_history.png"/>
+                    <pic:cNvPicPr/>
                   </pic:nvPicPr>
                   <pic:blipFill>
-                    <a:blip r:embed="rId12" cstate="none"/>
-                    <a:srcRect/>
+                    <a:blip r:embed="rId23"/>
                     <a:stretch>
                       <a:fillRect/>
                     </a:stretch>
                   </pic:blipFill>
-                  <pic:spPr bwMode="auto">
+                  <pic:spPr>
                     <a:xfrm>
                       <a:off x="0" y="0"/>
-                      <a:ext cx="2476500" cy="2901950"/>
+                      <a:ext cx="2103120" cy="4558390"/>
                     </a:xfrm>
-                    <a:prstGeom prst="rect">
-                      <a:avLst/>
-                    </a:prstGeom>
+                    <a:prstGeom prst="rect"/>
                   </pic:spPr>
                 </pic:pic>
               </a:graphicData>
@@ -1574,7 +2115,7 @@
           <w:sz w:val="18"/>
           <w:szCs w:val="18"/>
         </w:rPr>
-        <w:t>Wireframe — Account tab (Wallet, Help, Sign out list rows) (illustrative wireframe from v2.0; real screenshot not yet captured).</w:t>
+        <w:t>Wireframe — Delivery History screen (pickup store, delivered-to name, time and items summary). Drawn from the app's source with demo data; not yet captured on a device.</w:t>
       </w:r>
     </w:p>
     <w:p>
@@ -1582,235 +2123,6 @@
         <w:pStyle w:val="Heading2"/>
       </w:pPr>
       <w:r>
-        <w:t xml:space="preserve">3.8 Where Things Moved From the Previous Build</w:t>
-      </w:r>
-    </w:p>
-    <w:p>
-      <w:pPr>
-        <w:spacing w:after="160"/>
-      </w:pPr>
-      <w:r>
-        <w:t xml:space="preserve">If you used the app before this redesign, here's a quick map from old to new:</w:t>
-      </w:r>
-    </w:p>
-    <w:p>
-      <w:pPr>
-        <w:pStyle w:val="ListParagraph"/>
-        <w:numPr>
-          <w:ilvl w:val="0"/>
-          <w:numId w:val="2"/>
-        </w:numPr>
-        <w:spacing w:after="100"/>
-      </w:pPr>
-      <w:r>
-        <w:t xml:space="preserve">Home, Cart, Checkout as separate always-visible nav links → Home is now a tab; Cart is a bottom sheet reached via the floating cart pill (see below) or the Checkout screen's back button; Checkout is reached from the cart.</w:t>
-      </w:r>
-    </w:p>
-    <w:p>
-      <w:pPr>
-        <w:pStyle w:val="ListParagraph"/>
-        <w:numPr>
-          <w:ilvl w:val="0"/>
-          <w:numId w:val="2"/>
-        </w:numPr>
-        <w:spacing w:after="100"/>
-      </w:pPr>
-      <w:r>
-        <w:t xml:space="preserve">A single long checkout form → the same fields, now grouped into three tap-to-expand rows plus a separate contact-details block, with the submit button pinned to the bottom of the screen instead of scrolling with the form.</w:t>
-      </w:r>
-    </w:p>
-    <w:p>
-      <w:pPr>
-        <w:pStyle w:val="ListParagraph"/>
-        <w:numPr>
-          <w:ilvl w:val="0"/>
-          <w:numId w:val="2"/>
-        </w:numPr>
-        <w:spacing w:after="100"/>
-      </w:pPr>
-      <w:r>
-        <w:t xml:space="preserve">Wallet and Help as their own reachable screens → both now live one tap deeper, under the Account tab.</w:t>
-      </w:r>
-    </w:p>
-    <w:p>
-      <w:pPr>
-        <w:pStyle w:val="ListParagraph"/>
-        <w:numPr>
-          <w:ilvl w:val="0"/>
-          <w:numId w:val="2"/>
-        </w:numPr>
-        <w:spacing w:after="100"/>
-      </w:pPr>
-      <w:r>
-        <w:t>A plain order-status text line → the six-step order tracker described in §3.6, inside a full order detail screen.</w:t>
-      </w:r>
-    </w:p>
-    <w:p>
-      <w:pPr>
-        <w:spacing w:after="160"/>
-      </w:pPr>
-      <w:r>
-        <w:t xml:space="preserve">One more piece of new chrome: whenever your cart has at least one item, a floating pill (“N items · View cart · ₹total”) appears above the tab bar on the Home and Store Detail screens — tapping it opens the cart bottom sheet directly. It's hidden on the Cart, Checkout, Account, and Orders screens themselves.</w:t>
-      </w:r>
-    </w:p>
-    <w:p>
-      <w:pPr>
-        <w:pStyle w:val="Heading1"/>
-        <w:pageBreakBefore/>
-      </w:pPr>
-      <w:r>
-        <w:t xml:space="preserve">Chapter 4 — Delivery Partner App</w:t>
-      </w:r>
-    </w:p>
-    <w:p>
-      <w:pPr>
-        <w:spacing w:after="160"/>
-      </w:pPr>
-      <w:r>
-        <w:t>The Delivery Partner App opens on a dashboard once you're signed in, mirroring the web delivery portal's dashboard, with a second History screen reached from a History link in the header. The header also shows your name with a Reset password link (same behavior as the Customer Account tab, see §3.7). The dashboard shows only active work: your active deliveries first, then orders available to accept.</w:t>
-      </w:r>
-    </w:p>
-    <w:p>
-      <w:pPr>
-        <w:pStyle w:val="Heading2"/>
-      </w:pPr>
-      <w:r>
-        <w:t xml:space="preserve">4.1 Signing In</w:t>
-      </w:r>
-    </w:p>
-    <w:p>
-      <w:pPr>
-        <w:spacing w:after="160"/>
-      </w:pPr>
-      <w:r>
-        <w:t xml:space="preserve">From the role picker, choose Delivery Partner and sign in with your delivery partner account's email and password.</w:t>
-      </w:r>
-    </w:p>
-    <w:p>
-      <w:pPr>
-        <w:pStyle w:val="Heading2"/>
-      </w:pPr>
-      <w:r>
-        <w:t xml:space="preserve">4.2 Going Online and Offline</w:t>
-      </w:r>
-    </w:p>
-    <w:p>
-      <w:pPr>
-        <w:spacing w:after="160"/>
-      </w:pPr>
-      <w:r>
-        <w:t>At the top of the dashboard is a large Online/Offline toggle. Tap it to switch status; while toggling, a loading indicator shows in place of the label. While you are Offline the Available orders section only says "Go online to see available orders."; you only see available orders, and only send location pings, while toggled Online.</w:t>
-      </w:r>
-    </w:p>
-    <w:p>
-      <w:pPr>
-        <w:pStyle w:val="Heading2"/>
-      </w:pPr>
-      <w:r>
-        <w:t xml:space="preserve">4.3 Available Orders</w:t>
-      </w:r>
-    </w:p>
-    <w:p>
-      <w:pPr>
-        <w:spacing w:after="160"/>
-      </w:pPr>
-      <w:r>
-        <w:t>The Available orders section lists orders that have reached Ready status and that no partner has accepted yet. Each card shows the store name and pickup address, the items in the order (with photos), the order amount, and an Accept button. To protect the customer's privacy, the customer's name, phone number and address are not shown here — the card says "Customer details appear after you accept." Tap Accept to take the order: it moves into Your active deliveries and is no longer visible to other partners. With nothing available the section says "None right now." The list refreshes automatically every 10 seconds while you're online.</w:t>
-      </w:r>
-    </w:p>
-    <w:p>
-      <w:pPr>
-        <w:spacing w:after="240"/>
-        <w:jc w:val="center"/>
-      </w:pPr>
-      <w:r>
-        <w:rPr>
-          <w:i/>
-          <w:iCs/>
-          <w:color w:val="6B6A5F"/>
-          <w:sz w:val="18"/>
-          <w:szCs w:val="18"/>
-        </w:rPr>
-        <w:t>Screenshot — Delivery dashboard: an Available order card (pickup store and address, items, amount, Accept). [Figure pending: screenshot from the updated app]</w:t>
-      </w:r>
-    </w:p>
-    <w:p>
-      <w:pPr>
-        <w:pStyle w:val="Heading2"/>
-      </w:pPr>
-      <w:r>
-        <w:t xml:space="preserve">4.4 Your Deliveries and Advancing Status</w:t>
-      </w:r>
-    </w:p>
-    <w:p>
-      <w:pPr>
-        <w:spacing w:after="160"/>
-      </w:pPr>
-      <w:r>
-        <w:t>The Your active deliveries section lists the orders you have accepted that are not finished yet (status Partner assigned or On the way); with none it says "No active deliveries." Each card shows the order number, a status pill, the amount, the Pickup store and its address, the Drop-off details (see §4.5), and the items with photos. A single action button advances the order: Mark picked up while the order is Partner assigned, then Mark delivered once it is On the way. Each button reflects the correct next step; there is no way to skip a step or move an order backward. A delivered order leaves this list and moves to History.</w:t>
-      </w:r>
-    </w:p>
-    <w:p>
-      <w:pPr>
-        <w:pStyle w:val="Heading2"/>
-      </w:pPr>
-      <w:r>
-        <w:t>4.5 Drop-off Details and History</w:t>
-      </w:r>
-    </w:p>
-    <w:p>
-      <w:pPr>
-        <w:spacing w:after="160"/>
-      </w:pPr>
-      <w:r>
-        <w:t>Once you have accepted an order, its active card shows the drop-off details: the recipient's name, their phone number (tap it to call when it is a normal +91 number), the full delivery address and the delivery note, if there is one. You can see a customer's phone and address only while the order is Partner assigned or On the way for you; the old View address button no longer exists because the details are shown directly on the card. This build has no Google Maps key configured, matching the Customer App's own coordinate-only tracking view.</w:t>
-      </w:r>
-    </w:p>
-    <w:p>
-      <w:pPr>
-        <w:spacing w:after="160"/>
-      </w:pPr>
-      <w:r>
-        <w:t>The History link in the dashboard header opens the History screen: your finished orders, newest first, up to your 50 most recent. Each card shows the pickup store, who the order was delivered to, when it happened and a short summary of the items — no phone number or address is shown for finished orders. A Refresh button reloads the list and a Back to dashboard link returns you to the dashboard; with nothing finished yet it says "No completed deliveries yet."</w:t>
-      </w:r>
-    </w:p>
-    <w:p>
-      <w:pPr>
-        <w:spacing w:after="240"/>
-        <w:jc w:val="center"/>
-      </w:pPr>
-      <w:r>
-        <w:rPr>
-          <w:i/>
-          <w:iCs/>
-          <w:color w:val="6B6A5F"/>
-          <w:sz w:val="18"/>
-          <w:szCs w:val="18"/>
-        </w:rPr>
-        <w:t>Screenshot — Delivery dashboard: Your active deliveries card with drop-off details and Mark picked up / Mark delivered. [Figure pending: screenshot from the updated app]</w:t>
-      </w:r>
-    </w:p>
-    <w:p>
-      <w:pPr>
-        <w:spacing w:after="240"/>
-        <w:jc w:val="center"/>
-      </w:pPr>
-      <w:r>
-        <w:rPr>
-          <w:i/>
-          <w:iCs/>
-          <w:color w:val="6B6A5F"/>
-          <w:sz w:val="18"/>
-          <w:szCs w:val="18"/>
-        </w:rPr>
-        <w:t>Screenshot — Delivery History screen: finished deliveries with pickup store, delivered-to name, time and items summary. [Figure pending: screenshot from the updated app]</w:t>
-      </w:r>
-    </w:p>
-    <w:p>
-      <w:pPr>
-        <w:pStyle w:val="Heading2"/>
-      </w:pPr>
-      <w:r>
         <w:t xml:space="preserve">4.6 Location Sharing</w:t>
       </w:r>
     </w:p>
@@ -1820,68 +2132,6 @@
       </w:pPr>
       <w:r>
         <w:t xml:space="preserve">While you're toggled Online, the app asks for permission to use your device's foreground location and, once granted, sends a location ping to the server roughly every 15 seconds so the platform has a rough sense of where online partners are. This only happens while the app is open in the foreground and you're online — the app does not track or share your location in the background or while offline, and a missed ping (for example, if location is briefly unavailable) is not shown as an error; it's simply skipped until the next successful reading.</w:t>
-      </w:r>
-    </w:p>
-    <w:p>
-      <w:pPr>
-        <w:spacing w:after="80" w:before="120"/>
-        <w:jc w:val="center"/>
-      </w:pPr>
-      <w:r>
-        <w:drawing>
-          <wp:inline distT="0" distB="0" distL="0" distR="0">
-            <wp:extent cx="2476500" cy="2901950"/>
-            <wp:effectExtent t="0" r="0" b="0" l="0"/>
-            <wp:docPr id="7" name="" descr="" title=""/>
-            <wp:cNvGraphicFramePr>
-              <a:graphicFrameLocks xmlns:a="http://schemas.openxmlformats.org/drawingml/2006/main" noChangeAspect="1"/>
-            </wp:cNvGraphicFramePr>
-            <a:graphic xmlns:a="http://schemas.openxmlformats.org/drawingml/2006/main">
-              <a:graphicData uri="http://schemas.openxmlformats.org/drawingml/2006/picture">
-                <pic:pic xmlns:pic="http://schemas.openxmlformats.org/drawingml/2006/picture">
-                  <pic:nvPicPr>
-                    <pic:cNvPr id="0" name="" descr=""/>
-                    <pic:cNvPicPr>
-                      <a:picLocks noChangeAspect="1" noChangeArrowheads="1"/>
-                    </pic:cNvPicPr>
-                  </pic:nvPicPr>
-                  <pic:blipFill>
-                    <a:blip r:embed="rId13" cstate="none"/>
-                    <a:srcRect/>
-                    <a:stretch>
-                      <a:fillRect/>
-                    </a:stretch>
-                  </pic:blipFill>
-                  <pic:spPr bwMode="auto">
-                    <a:xfrm>
-                      <a:off x="0" y="0"/>
-                      <a:ext cx="2476500" cy="2901950"/>
-                    </a:xfrm>
-                    <a:prstGeom prst="rect">
-                      <a:avLst/>
-                    </a:prstGeom>
-                  </pic:spPr>
-                </pic:pic>
-              </a:graphicData>
-            </a:graphic>
-          </wp:inline>
-        </w:drawing>
-      </w:r>
-    </w:p>
-    <w:p>
-      <w:pPr>
-        <w:spacing w:after="240"/>
-        <w:jc w:val="center"/>
-      </w:pPr>
-      <w:r>
-        <w:rPr>
-          <w:i/>
-          <w:iCs/>
-          <w:color w:val="6B6A5F"/>
-          <w:sz w:val="18"/>
-          <w:szCs w:val="18"/>
-        </w:rPr>
-        <w:t>Wireframe — Delivery Partner dashboard (online toggle, available orders with Claim, your deliveries with status-advance and View address) (older v2.0 wireframe showing the previous buttons). [Figure pending: replacement screenshot from the updated app]</w:t>
       </w:r>
     </w:p>
     <w:p>
@@ -2288,6 +2538,32 @@
           <w:p>
             <w:r>
               <w:t>Partners who have not accepted your order see only the store, items and amount. After a partner accepts, they see your name, phone, address and delivery note until the order is delivered; finished orders in their History show only who it was delivered to.</w:t>
+            </w:r>
+          </w:p>
+        </w:tc>
+      </w:tr>
+      <w:tr>
+        <w:tc>
+          <w:tcPr>
+            <w:tcW w:type="dxa" w:w="3200"/>
+          </w:tcPr>
+          <w:p>
+            <w:r>
+              <w:rPr>
+                <w:b/>
+                <w:bCs/>
+              </w:rPr>
+              <w:t>How do I create an account?</w:t>
+            </w:r>
+          </w:p>
+        </w:tc>
+        <w:tc>
+          <w:tcPr>
+            <w:tcW w:type="dxa" w:w="5800"/>
+          </w:tcPr>
+          <w:p>
+            <w:r>
+              <w:t>On the Customer sign-in screen tap "Need an account? Sign up", enter your full name, email and a password of at least 6 characters, and tap Sign Up. You are signed in automatically. The same account also works on the web app. Delivery partner accounts cannot be created in the app — an administrator adds them.</w:t>
             </w:r>
           </w:p>
         </w:tc>

</xml_diff>

<commit_message>
docs: mobile manual — real Delivery screenshots from phone recording; note auto-assignment in §4.3
Replaces the Delivery wireframes with captures from a second phone recording
(recipient name/phone blurred), adds the On the way figure, keeps only the
Available-order card as a labeled wireframe, explains that workflow 04
auto-assigns ready orders, renumbers the static TOC (26 pp), and updates
CLAUDE.md/MEMORY.md accordingly.

Co-Authored-By: Claude Sonnet 5.5 <noreply@anthropic.com>
</commit_message>
<xml_diff>
--- a/docs/Mobile_App_User_Manual.docx
+++ b/docs/Mobile_App_User_Manual.docx
@@ -198,7 +198,7 @@
           <w:b/>
           <w:bCs/>
         </w:rPr>
-        <w:t>23</w:t>
+        <w:t>24</w:t>
       </w:r>
     </w:p>
     <w:p>
@@ -220,7 +220,7 @@
           <w:b/>
           <w:bCs/>
         </w:rPr>
-        <w:t>25</w:t>
+        <w:t>26</w:t>
       </w:r>
     </w:p>
     <w:p>
@@ -303,7 +303,7 @@
         <w:spacing w:after="160"/>
       </w:pPr>
       <w:r>
-        <w:t>Since version 2.0 the whole app was re-skinned with a new orange / navy / green look (pill-shaped buttons, rounded cards, colored section backgrounds) and the colors used behind white text were darkened so buttons and badges are easy to read. Signing in and Account changed too: the app now always starts signed out (each cold launch asks you to log in), and your name plus a Reset password option now appear in the Account tab (Customer) and the dashboard header (Delivery Partner). The Customer App screenshots in Chapter 3 (sign-up, Home, Store Detail, Cart, Checkout, Orders, order detail and Account) are real captures from a screen recording of the app on a phone, with personal details blurred. The Delivery Partner figures in Chapter 4 are wireframes drawn from the app's source code with demo data, because the Delivery screens have not yet been recorded on a device.</w:t>
+        <w:t>Since version 2.0 the whole app was re-skinned with a new orange / navy / green look (pill-shaped buttons, rounded cards, colored section backgrounds) and the colors used behind white text were darkened so buttons and badges are easy to read. Signing in and Account changed too: the app now always starts signed out (each cold launch asks you to log in), and your name plus a Reset password option now appear in the Account tab (Customer) and the dashboard header (Delivery Partner). The Customer App and Delivery Partner screenshots in Chapters 3 and 4 (sign-up, Home, Store Detail, Cart, Checkout, Orders, order detail, Account, the Delivery dashboard cards and History) are real captures from screen recordings of the app on a phone, with personal details blurred. The one exception is the Available order card in section 4.3, which is a wireframe drawn from the app's source code with demo data (an order is normally auto-assigned before it can be photographed in that list).</w:t>
       </w:r>
     </w:p>
     <w:p>
@@ -460,7 +460,7 @@
         <w:spacing w:after="100"/>
       </w:pPr>
       <w:r>
-        <w:t>Screenshots of the Customer App are captures from a screen recording of the real app running on a phone, with personal details blurred (the round blue gear button in them is the Expo developer menu of the test build, not part of the app). The three Delivery Partner figures in Chapter 4 are wireframes drawn from the app's source code with demo data — the Delivery screens have not yet been recorded on a device. Everything new in this version was also checked by type-check, automated tests and code review.</w:t>
+        <w:t>Screenshots are captures from screen recordings of the real app running on a phone, with personal details blurred (the round blue gear button in them is the Expo developer menu of the test build, not part of the app). The Available order figure in section 4.3 is a wireframe drawn from the source code with demo data. Everything new in this version was also checked by type-check, automated tests and code review.</w:t>
       </w:r>
     </w:p>
     <w:p>
@@ -1907,7 +1907,7 @@
         <w:spacing w:after="160"/>
       </w:pPr>
       <w:r>
-        <w:t>The Available orders section lists orders that have reached Ready status and that no partner has accepted yet. Each card shows the store name and pickup address, the items in the order (with photos), the order amount, and an Accept button. To protect the customer's privacy, the customer's name, phone number and address are not shown here — the card says "Customer details appear after you accept." Tap Accept to take the order: it moves into Your active deliveries and is no longer visible to other partners. With nothing available the section says "None right now." The list refreshes automatically every 10 seconds while you're online.</w:t>
+        <w:t>The Available orders section lists orders that have reached Ready status and that no partner has accepted yet. Each card shows the store name and pickup address, the items in the order (with photos), the order amount, and an Accept button. To protect the customer's privacy, the customer's name, phone number and address are not shown here — the card says "Customer details appear after you accept." Tap Accept to take the order: it moves into Your active deliveries and is no longer visible to other partners. With nothing available the section says "None right now." The list refreshes automatically every 10 seconds while you're online. Note: when the n8n automation is running, a ready order is assigned automatically within about 10 seconds to the nearest online partner (by last-known location), so it usually appears straight under Your active deliveries instead of waiting here; the Available list only holds an order when no online partner has a location.</w:t>
       </w:r>
     </w:p>
     <w:p>
@@ -1963,7 +1963,7 @@
           <w:sz w:val="18"/>
           <w:szCs w:val="18"/>
         </w:rPr>
-        <w:t>Wireframe — Delivery dashboard with an Available order card (pickup store and address, items, Accept). Drawn from the app's source with demo data; not yet captured on a device.</w:t>
+        <w:t>Wireframe — Delivery dashboard with an Available order card (pickup store and address, items, Accept). Drawn from the app's source with demo data: this card could not be captured on the phone because, in this build, a ready order is auto-assigned to a partner within seconds (see below).</w:t>
       </w:r>
     </w:p>
     <w:p>
@@ -2024,6 +2024,62 @@
                 <pic:pic>
                   <pic:nvPicPr>
                     <pic:cNvPr id="9006" name="wf_delivery_active.png"/>
+                    <pic:cNvPicPr/>
+                  </pic:nvPicPr>
+                  <pic:blipFill>
+                    <a:blip r:embed="rId13"/>
+                    <a:stretch>
+                      <a:fillRect/>
+                    </a:stretch>
+                  </pic:blipFill>
+                  <pic:spPr>
+                    <a:xfrm>
+                      <a:off x="0" y="0"/>
+                      <a:ext cx="2103120" cy="4558390"/>
+                    </a:xfrm>
+                    <a:prstGeom prst="rect"/>
+                  </pic:spPr>
+                </pic:pic>
+              </a:graphicData>
+            </a:graphic>
+          </wp:inline>
+        </w:drawing>
+      </w:r>
+    </w:p>
+    <w:p>
+      <w:pPr>
+        <w:spacing w:after="240"/>
+        <w:jc w:val="center"/>
+      </w:pPr>
+      <w:r>
+        <w:rPr>
+          <w:i/>
+          <w:iCs/>
+          <w:color w:val="6B6A5F"/>
+          <w:sz w:val="18"/>
+          <w:szCs w:val="18"/>
+        </w:rPr>
+        <w:t>Screenshot — Delivery dashboard with a Your active deliveries card (status Partner assigned): pickup store, drop-off details (recipient name and phone blurred here), items, and the Mark picked up button. Available orders shows "None right now." because the order was assigned to this partner automatically.</w:t>
+      </w:r>
+    </w:p>
+    <w:p>
+      <w:pPr>
+        <w:spacing w:after="80" w:before="120"/>
+        <w:jc w:val="center"/>
+      </w:pPr>
+      <w:r>
+        <w:drawing>
+          <wp:inline xmlns:a="http://schemas.openxmlformats.org/drawingml/2006/main" xmlns:pic="http://schemas.openxmlformats.org/drawingml/2006/picture">
+            <wp:extent cx="2103120" cy="4558390"/>
+            <wp:docPr id="9101" name="Figure 9101"/>
+            <wp:cNvGraphicFramePr>
+              <a:graphicFrameLocks noChangeAspect="1"/>
+            </wp:cNvGraphicFramePr>
+            <a:graphic>
+              <a:graphicData uri="http://schemas.openxmlformats.org/drawingml/2006/picture">
+                <pic:pic>
+                  <pic:nvPicPr>
+                    <pic:cNvPr id="9101" name="wf_delivery_active.png"/>
                     <pic:cNvPicPr/>
                   </pic:nvPicPr>
                   <pic:blipFill>
@@ -2059,7 +2115,7 @@
           <w:sz w:val="18"/>
           <w:szCs w:val="18"/>
         </w:rPr>
-        <w:t>Wireframe — Delivery dashboard with a Your active deliveries card (drop-off details and Mark picked up). Drawn from the app's source with demo data; not yet captured on a device.</w:t>
+        <w:t>Screenshot — The same card after Mark picked up: status On the way, with the Mark delivered button (shown dimmed while the update is being sent). Recipient name and phone blurred.</w:t>
       </w:r>
     </w:p>
     <w:p>
@@ -2083,7 +2139,7 @@
                     <pic:cNvPicPr/>
                   </pic:nvPicPr>
                   <pic:blipFill>
-                    <a:blip r:embed="rId23"/>
+                    <a:blip r:embed="rId24"/>
                     <a:stretch>
                       <a:fillRect/>
                     </a:stretch>
@@ -2115,7 +2171,7 @@
           <w:sz w:val="18"/>
           <w:szCs w:val="18"/>
         </w:rPr>
-        <w:t>Wireframe — Delivery History screen (pickup store, delivered-to name, time and items summary). Drawn from the app's source with demo data; not yet captured on a device.</w:t>
+        <w:t>Screenshot — Delivery History screen: finished deliveries with pickup store, delivered-to name (blurred here), time and items summary.</w:t>
       </w:r>
     </w:p>
     <w:p>
@@ -2738,7 +2794,7 @@
           </w:tcPr>
           <w:p>
             <w:r>
-              <w:t>Tracker step 4 of 6. The order is ready for pickup; it now appears in online delivery partners' Available orders list.</w:t>
+              <w:t>Tracker step 4 of 6. The order is ready for pickup; it now appears in online delivery partners' Available orders list (or is assigned automatically within seconds when the automation is running).</w:t>
             </w:r>
           </w:p>
         </w:tc>

</xml_diff>

<commit_message>
docs: manuals v3.1/v4.1 for customer-completed delivery; all-roles script wrappers
Refresh both user manuals (courier animation, partner Mark picked up only),
make start/stop-all-roles.ps1 run the npm commands verbatim, record Gmail
nodes re-enabled and the fresh-DB reset in CLAUDE.md and MEMORY.md.

Co-Authored-By: Claude Sonnet 5.5 <noreply@anthropic.com>
</commit_message>
<xml_diff>
--- a/docs/Mobile_App_User_Manual.docx
+++ b/docs/Mobile_App_User_Manual.docx
@@ -67,7 +67,7 @@
           <w:sz w:val="22"/>
           <w:szCs w:val="22"/>
         </w:rPr>
-        <w:t>Version 4.0 — Order visibility, mobile sign-up, real screenshots</w:t>
+        <w:t>Version 4.1 — Customer-completed delivery</w:t>
       </w:r>
     </w:p>
     <w:p>
@@ -79,7 +79,7 @@
           <w:sz w:val="22"/>
           <w:szCs w:val="22"/>
         </w:rPr>
-        <w:t>October 2026</w:t>
+        <w:t>2 October 2026</w:t>
       </w:r>
     </w:p>
     <w:p>
@@ -132,7 +132,7 @@
           <w:b/>
           <w:bCs/>
         </w:rPr>
-        <w:t>5</w:t>
+        <w:t>6</w:t>
       </w:r>
     </w:p>
     <w:p>
@@ -154,7 +154,7 @@
           <w:b/>
           <w:bCs/>
         </w:rPr>
-        <w:t>8</w:t>
+        <w:t>9</w:t>
       </w:r>
     </w:p>
     <w:p>
@@ -176,7 +176,7 @@
           <w:b/>
           <w:bCs/>
         </w:rPr>
-        <w:t>19</w:t>
+        <w:t>20</w:t>
       </w:r>
     </w:p>
     <w:p>
@@ -198,7 +198,7 @@
           <w:b/>
           <w:bCs/>
         </w:rPr>
-        <w:t>24</w:t>
+        <w:t>25</w:t>
       </w:r>
     </w:p>
     <w:p>
@@ -220,7 +220,7 @@
           <w:b/>
           <w:bCs/>
         </w:rPr>
-        <w:t>26</w:t>
+        <w:t>27</w:t>
       </w:r>
     </w:p>
     <w:p>
@@ -271,7 +271,7 @@
         <w:spacing w:after="100"/>
       </w:pPr>
       <w:r>
-        <w:t>Delivery Partner App — go online, accept ready orders, and work them through to delivery, with a History screen for finished jobs.</w:t>
+        <w:t>Delivery Partner App — go online, accept ready orders and mark them picked up (the customer's app then completes the delivery), with a History screen for finished jobs.</w:t>
       </w:r>
     </w:p>
     <w:p>
@@ -312,6 +312,14 @@
       </w:pPr>
       <w:r>
         <w:t>What's new for version 4.0 (order visibility): (1) Checkout now asks for a required Phone number. (2) The Orders tab shows richer rows — store, a colored status pill, date and time, up to three item thumbnails with an item count, and the total. (3) The order screen is now a full order detail: a six-step tracker (Placed, Accepted, Preparing, Ready, On the way, Delivered) with a single "Step N of 6" caption, a Deliver-to card, an Items card with photos, totals and payment, and a timeline of times. (4) Status wording changed: the old single "Out for delivery" is now two statuses, Partner assigned (a delivery partner accepted the order) and On the way (the order was picked up); status colors now match the web portals. (5) The Delivery Partner dashboard now shows only active work — Your active deliveries with the full drop-off details, then Available orders with an Accept button — and a new History screen lists finished deliveries. The old View address button and the "Claim" wording are gone. (6) Customers also receive an email when the restaurant accepts an order and when it is delivered. (7) You can now create a Customer account inside the app: the customer sign-in screen has a Log in / Sign up toggle (full name, email, password of at least 6 characters), and after sign-up you are signed in automatically.</w:t>
+      </w:r>
+    </w:p>
+    <w:p>
+      <w:pPr>
+        <w:spacing w:after="160"/>
+      </w:pPr>
+      <w:r>
+        <w:t>What's new for version 4.1 (customer-completed delivery): delivery partners no longer mark an order delivered; they only tap Mark picked up, and their card then says "Customer is receiving the order…". After pickup, the customer's order detail screen plays a 15-second courier animation ("Your order is on the way!", counting down "Arriving in 15s") and the order is then marked Delivered automatically, which also sends the delivered email. If the customer never opens the order, the system completes the delivery 5 minutes after pickup. See §3.6.1 and §4.4.</w:t>
       </w:r>
     </w:p>
     <w:p>
@@ -1650,6 +1658,38 @@
           <w:szCs w:val="18"/>
         </w:rPr>
         <w:t>Screenshot — Order detail scrolled down: items, totals and payment, and the timeline of times (Placed, Accepted, Picked up, Delivered). Personal details blurred.</w:t>
+      </w:r>
+    </w:p>
+    <w:p>
+      <w:pPr>
+        <w:pStyle w:val="Heading3"/>
+      </w:pPr>
+      <w:r>
+        <w:t>3.6.1 Courier Animation and Automatic Delivery</w:t>
+      </w:r>
+    </w:p>
+    <w:p>
+      <w:pPr>
+        <w:spacing w:after="160"/>
+      </w:pPr>
+      <w:r>
+        <w:t>Delivery partners only mark an order picked up; they cannot mark it delivered. Once your order is On the way, its detail screen opens a "Your order is on the way!" modal with an animated courier scene and a countdown that reads "Arriving in 15s". The animation always plays for a full 15 seconds from the moment the modal first appears, however long ago the partner picked the order up.</w:t>
+      </w:r>
+    </w:p>
+    <w:p>
+      <w:pPr>
+        <w:spacing w:after="160"/>
+      </w:pPr>
+      <w:r>
+        <w:t>When the countdown ends the modal briefly shows "Confirming delivery…", then "Delivered! Enjoy your meal.", and the order becomes Delivered (step 6 of 6); tap Done to close it. The delivered email is sent at that moment, once per order. If you leave the screen part-way through and come back while the app stays open, the animation resumes where it left off. If delivery could not be confirmed straight away, the modal says "We couldn't confirm delivery just yet — your order will be marked delivered shortly."</w:t>
+      </w:r>
+    </w:p>
+    <w:p>
+      <w:pPr>
+        <w:spacing w:after="160"/>
+      </w:pPr>
+      <w:r>
+        <w:t>If you never open the order after pickup, nothing is lost: the platform completes the delivery by itself 5 minutes after pickup and sends the same single delivered email. Either way an order is delivered exactly once.</w:t>
       </w:r>
     </w:p>
     <w:p>
@@ -1979,7 +2019,7 @@
         <w:spacing w:after="160"/>
       </w:pPr>
       <w:r>
-        <w:t>The Your active deliveries section lists the orders you have accepted that are not finished yet (status Partner assigned or On the way); with none it says "No active deliveries." Each card shows the order number, a status pill, the amount, the Pickup store and its address, the Drop-off details (see §4.5), and the items with photos. A single action button advances the order: Mark picked up while the order is Partner assigned, then Mark delivered once it is On the way. Each button reflects the correct next step; there is no way to skip a step or move an order backward. A delivered order leaves this list and moves to History.</w:t>
+        <w:t>The Your active deliveries section lists the orders you have accepted that are not finished yet (status Partner assigned or On the way); with none it says "No active deliveries." Each card shows the order number, a status pill, the amount, the Pickup store and its address, the Drop-off details (see §4.5), and the items with photos. A single action button advances the order: Mark picked up while the order is Partner assigned. After you mark it picked up the order is On the way and the card shows "Customer is receiving the order…" in place of a button — there is no Mark delivered button. The customer's app plays a 15-second courier animation and then marks the order Delivered automatically (or the system does it 5 minutes after pickup if the customer never opens the order). There is no way to skip a step or move an order backward. A delivered order leaves this list and moves to History.</w:t>
       </w:r>
     </w:p>
     <w:p>
@@ -2115,7 +2155,7 @@
           <w:sz w:val="18"/>
           <w:szCs w:val="18"/>
         </w:rPr>
-        <w:t>Screenshot — The same card after Mark picked up: status On the way, with the Mark delivered button (shown dimmed while the update is being sent). Recipient name and phone blurred.</w:t>
+        <w:t>Screenshot — The same card after Mark picked up, captured with an earlier build (before version 4.1): status On the way, with a Mark delivered button (shown dimmed while the update is being sent). In the current app this button is replaced by the text "Customer is receiving the order…". Recipient name and phone blurred.</w:t>
       </w:r>
     </w:p>
     <w:p>
@@ -2624,6 +2664,32 @@
           </w:p>
         </w:tc>
       </w:tr>
+      <w:tr>
+        <w:tc>
+          <w:tcPr>
+            <w:tcW w:type="dxa" w:w="3200"/>
+          </w:tcPr>
+          <w:p>
+            <w:r>
+              <w:rPr>
+                <w:b/>
+                <w:bCs/>
+              </w:rPr>
+              <w:t>Why did my order turn Delivered by itself?</w:t>
+            </w:r>
+          </w:p>
+        </w:tc>
+        <w:tc>
+          <w:tcPr>
+            <w:tcW w:type="dxa" w:w="5800"/>
+          </w:tcPr>
+          <w:p>
+            <w:r>
+              <w:t>Delivery partners only mark an order picked up. After pickup, your order screen plays a 15-second courier animation ("Arriving in 15s") and the order is then marked Delivered automatically, and the delivered email is sent. If you never open the order, the system marks it Delivered 5 minutes after pickup. See §3.6.1.</w:t>
+            </w:r>
+          </w:p>
+        </w:tc>
+      </w:tr>
     </w:tbl>
     <w:p>
       <w:pPr>
@@ -2846,7 +2912,7 @@
           </w:tcPr>
           <w:p>
             <w:r>
-              <w:t>Tracker step 5 of 6. The delivery partner has collected the order and is on the way to the customer.</w:t>
+              <w:t>Tracker step 5 of 6. The delivery partner has collected the order and is on the way to the customer. The customer's order screen then plays a 15-second courier animation, after which the order becomes Delivered automatically.</w:t>
             </w:r>
           </w:p>
         </w:tc>
@@ -2872,7 +2938,7 @@
           </w:tcPr>
           <w:p>
             <w:r>
-              <w:t>Tracker step 6 of 6. The order has been handed to the customer. Final state.</w:t>
+              <w:t>Tracker step 6 of 6. The order has been handed to the customer. Final state. It is set by the customer's app after the animation (or by the system 5 minutes after pickup); delivery partners cannot set it.</w:t>
             </w:r>
           </w:p>
         </w:tc>

</xml_diff>

<commit_message>
feat: delivery auto-completes after 20 s, animation auto-closes, no Done button
n8n workflow 05's fallback wait drops from 5 minutes to 20 seconds so delivery
no longer depends on the customer having the order screen open. Web and mobile
animation dialogs lose the Done button and close 3 s after "Delivered!". Also
removes the Reduce Motion freeze, makes Metro start with -c, and refreshes both
manuals (web v3.3, mobile v4.4) and project docs.

Co-Authored-By: Claude Sonnet 5.5 <noreply@anthropic.com>
</commit_message>
<xml_diff>
--- a/docs/Mobile_App_User_Manual.docx
+++ b/docs/Mobile_App_User_Manual.docx
@@ -67,7 +67,7 @@
           <w:sz w:val="22"/>
           <w:szCs w:val="22"/>
         </w:rPr>
-        <w:t>Version 4.1 — Customer-completed delivery</w:t>
+        <w:t>Version 4.4 — Customer-completed delivery, real phone figures</w:t>
       </w:r>
     </w:p>
     <w:p>
@@ -103,7 +103,7 @@
         <w:t xml:space="preserve">Chapter 1 — Introduction</w:t>
       </w:r>
       <w:r>
-        <w:ptab w:alignment="right" w:relativeTo="margin" w:leader="dot"/>
+        <w:tab/>
       </w:r>
       <w:r>
         <w:rPr>
@@ -125,7 +125,7 @@
         <w:t xml:space="preserve">Chapter 2 — Getting Started</w:t>
       </w:r>
       <w:r>
-        <w:ptab w:alignment="right" w:relativeTo="margin" w:leader="dot"/>
+        <w:tab/>
       </w:r>
       <w:r>
         <w:rPr>
@@ -147,7 +147,7 @@
         <w:t xml:space="preserve">Chapter 3 — Customer App</w:t>
       </w:r>
       <w:r>
-        <w:ptab w:alignment="right" w:relativeTo="margin" w:leader="dot"/>
+        <w:tab/>
       </w:r>
       <w:r>
         <w:rPr>
@@ -169,14 +169,14 @@
         <w:t xml:space="preserve">Chapter 4 — Delivery Partner App</w:t>
       </w:r>
       <w:r>
-        <w:ptab w:alignment="right" w:relativeTo="margin" w:leader="dot"/>
+        <w:tab/>
       </w:r>
       <w:r>
         <w:rPr>
           <w:b/>
           <w:bCs/>
         </w:rPr>
-        <w:t>20</w:t>
+        <w:t>22</w:t>
       </w:r>
     </w:p>
     <w:p>
@@ -191,14 +191,14 @@
         <w:t xml:space="preserve">Chapter 5 — FAQ &amp; Troubleshooting</w:t>
       </w:r>
       <w:r>
-        <w:ptab w:alignment="right" w:relativeTo="margin" w:leader="dot"/>
+        <w:tab/>
       </w:r>
       <w:r>
         <w:rPr>
           <w:b/>
           <w:bCs/>
         </w:rPr>
-        <w:t>25</w:t>
+        <w:t>27</w:t>
       </w:r>
     </w:p>
     <w:p>
@@ -213,14 +213,14 @@
         <w:t xml:space="preserve">Appendix A — Order Status Reference</w:t>
       </w:r>
       <w:r>
-        <w:ptab w:alignment="right" w:relativeTo="margin" w:leader="dot"/>
+        <w:tab/>
       </w:r>
       <w:r>
         <w:rPr>
           <w:b/>
           <w:bCs/>
         </w:rPr>
-        <w:t>27</w:t>
+        <w:t>29</w:t>
       </w:r>
     </w:p>
     <w:p>
@@ -319,7 +319,31 @@
         <w:spacing w:after="160"/>
       </w:pPr>
       <w:r>
-        <w:t>What's new for version 4.1 (customer-completed delivery): delivery partners no longer mark an order delivered; they only tap Mark picked up, and their card then says "Customer is receiving the order…". After pickup, the customer's order detail screen plays a 15-second courier animation ("Your order is on the way!", counting down "Arriving in 15s") and the order is then marked Delivered automatically, which also sends the delivered email. If the customer never opens the order, the system completes the delivery 5 minutes after pickup. See §3.6.1 and §4.4.</w:t>
+        <w:t>What's new for version 4.1 (customer-completed delivery): delivery partners no longer mark an order delivered; they only tap Mark picked up, and their card then says "Customer is receiving the order…". After pickup, the customer's order detail screen plays a 15-second courier animation ("Your order is on the way!", counting down "Arriving in 15s") and the order is then marked Delivered automatically, which also sends the delivered email. If the customer never opens the order, the system completes the delivery 20 seconds after pickup. See §3.6.1 and §4.4.</w:t>
+      </w:r>
+    </w:p>
+    <w:p>
+      <w:pPr>
+        <w:spacing w:after="160"/>
+      </w:pPr>
+      <w:r>
+        <w:t>What's new for version 4.2: the courier animation now always plays, even when the phone's Reduce Motion accessibility setting is on, and the animation and the automatically delivered order are shown with real screenshots from an iPhone (see §3.6.1).</w:t>
+      </w:r>
+    </w:p>
+    <w:p>
+      <w:pPr>
+        <w:spacing w:after="160"/>
+      </w:pPr>
+      <w:r>
+        <w:t>What's new for version 4.3: the Delivery Partner chapter now shows real phone screenshots of an assigned delivery with the Mark picked up button and of the same delivery after pickup ("Customer is receiving the order…"); the old screenshot with a Mark delivered button has been removed.</w:t>
+      </w:r>
+    </w:p>
+    <w:p>
+      <w:pPr>
+        <w:spacing w:after="160"/>
+      </w:pPr>
+      <w:r>
+        <w:t>What's new for version 4.4: if the customer never opens the order, the system now marks it Delivered 20 seconds after pickup (it was 5 minutes), and the order screen does not need to be open for that to happen; the "Delivered! Enjoy your meal." modal no longer has a Done button and closes itself 3 seconds after it shows (a Close button appears only if delivery could not be confirmed). An older duplicate screenshot of the partner dashboard was removed from section 4.5.</w:t>
       </w:r>
     </w:p>
     <w:p>
@@ -1673,23 +1697,135 @@
         <w:spacing w:after="160"/>
       </w:pPr>
       <w:r>
-        <w:t>Delivery partners only mark an order picked up; they cannot mark it delivered. Once your order is On the way, its detail screen opens a "Your order is on the way!" modal with an animated courier scene and a countdown that reads "Arriving in 15s". The animation always plays for a full 15 seconds from the moment the modal first appears, however long ago the partner picked the order up.</w:t>
-      </w:r>
-    </w:p>
-    <w:p>
-      <w:pPr>
-        <w:spacing w:after="160"/>
-      </w:pPr>
-      <w:r>
-        <w:t>When the countdown ends the modal briefly shows "Confirming delivery…", then "Delivered! Enjoy your meal.", and the order becomes Delivered (step 6 of 6); tap Done to close it. The delivered email is sent at that moment, once per order. If you leave the screen part-way through and come back while the app stays open, the animation resumes where it left off. If delivery could not be confirmed straight away, the modal says "We couldn't confirm delivery just yet — your order will be marked delivered shortly."</w:t>
-      </w:r>
-    </w:p>
-    <w:p>
-      <w:pPr>
-        <w:spacing w:after="160"/>
-      </w:pPr>
-      <w:r>
-        <w:t>If you never open the order after pickup, nothing is lost: the platform completes the delivery by itself 5 minutes after pickup and sends the same single delivered email. Either way an order is delivered exactly once.</w:t>
+        <w:t>Delivery partners only mark an order picked up; they cannot mark it delivered. Once your order is On the way, its detail screen opens a "Your order is on the way!" modal with an animated courier scene and a countdown that reads "Arriving in 15s". The animation always plays for a full 15 seconds from the moment the modal first appears, however long ago the partner picked the order up. The animation always plays, even if the phone's Reduce Motion accessibility setting is on.</w:t>
+      </w:r>
+    </w:p>
+    <w:p>
+      <w:pPr>
+        <w:spacing w:after="80" w:before="120"/>
+        <w:jc w:val="center"/>
+      </w:pPr>
+      <w:r>
+        <w:drawing>
+          <wp:inline xmlns:a="http://schemas.openxmlformats.org/drawingml/2006/main" xmlns:pic="http://schemas.openxmlformats.org/drawingml/2006/picture">
+            <wp:extent cx="3900000" cy="3417018"/>
+            <wp:docPr id="9102" name="Picture 9102"/>
+            <wp:cNvGraphicFramePr>
+              <a:graphicFrameLocks noChangeAspect="1"/>
+            </wp:cNvGraphicFramePr>
+            <a:graphic>
+              <a:graphicData uri="http://schemas.openxmlformats.org/drawingml/2006/picture">
+                <pic:pic>
+                  <pic:nvPicPr>
+                    <pic:cNvPr id="0" name="fig_animation.png"/>
+                    <pic:cNvPicPr/>
+                  </pic:nvPicPr>
+                  <pic:blipFill>
+                    <a:blip r:embed="rId23"/>
+                    <a:stretch>
+                      <a:fillRect/>
+                    </a:stretch>
+                  </pic:blipFill>
+                  <pic:spPr>
+                    <a:xfrm>
+                      <a:off x="0" y="0"/>
+                      <a:ext cx="3900000" cy="3417018"/>
+                    </a:xfrm>
+                    <a:prstGeom prst="rect"/>
+                  </pic:spPr>
+                </pic:pic>
+              </a:graphicData>
+            </a:graphic>
+          </wp:inline>
+        </w:drawing>
+      </w:r>
+    </w:p>
+    <w:p>
+      <w:pPr>
+        <w:spacing w:after="240"/>
+        <w:jc w:val="center"/>
+      </w:pPr>
+      <w:r>
+        <w:rPr>
+          <w:i/>
+          <w:iCs/>
+          <w:color w:val="6B6A5F"/>
+          <w:sz w:val="18"/>
+          <w:szCs w:val="18"/>
+        </w:rPr>
+        <w:t>Screenshot — The courier animation modal on a phone: "Your order is on the way!", the rider scene and the 15-second countdown (here "Arriving in 8s").</w:t>
+      </w:r>
+    </w:p>
+    <w:p>
+      <w:pPr>
+        <w:spacing w:after="160"/>
+      </w:pPr>
+      <w:r>
+        <w:t>When the countdown ends the modal briefly shows "Confirming delivery…", then "Delivered! Enjoy your meal.", and the order becomes Delivered (step 6 of 6); there is no Done button: the modal closes itself 3 seconds after it shows. The delivered email is sent at that moment, once per order. If you leave the screen part-way through and come back while the app stays open, the animation resumes where it left off. If delivery could not be confirmed straight away, the modal says "We couldn't confirm delivery just yet — your order will be marked delivered shortly." and shows a Close button. This flow has been checked on a real iPhone.</w:t>
+      </w:r>
+    </w:p>
+    <w:p>
+      <w:pPr>
+        <w:spacing w:after="80" w:before="120"/>
+        <w:jc w:val="center"/>
+      </w:pPr>
+      <w:r>
+        <w:drawing>
+          <wp:inline xmlns:a="http://schemas.openxmlformats.org/drawingml/2006/main" xmlns:pic="http://schemas.openxmlformats.org/drawingml/2006/picture">
+            <wp:extent cx="2103120" cy="4240477"/>
+            <wp:docPr id="9103" name="Picture 9103"/>
+            <wp:cNvGraphicFramePr>
+              <a:graphicFrameLocks noChangeAspect="1"/>
+            </wp:cNvGraphicFramePr>
+            <a:graphic>
+              <a:graphicData uri="http://schemas.openxmlformats.org/drawingml/2006/picture">
+                <pic:pic>
+                  <pic:nvPicPr>
+                    <pic:cNvPr id="0" name="fig_delivered.png"/>
+                    <pic:cNvPicPr/>
+                  </pic:nvPicPr>
+                  <pic:blipFill>
+                    <a:blip r:embed="rId25"/>
+                    <a:stretch>
+                      <a:fillRect/>
+                    </a:stretch>
+                  </pic:blipFill>
+                  <pic:spPr>
+                    <a:xfrm>
+                      <a:off x="0" y="0"/>
+                      <a:ext cx="2103120" cy="4240477"/>
+                    </a:xfrm>
+                    <a:prstGeom prst="rect"/>
+                  </pic:spPr>
+                </pic:pic>
+              </a:graphicData>
+            </a:graphic>
+          </wp:inline>
+        </w:drawing>
+      </w:r>
+    </w:p>
+    <w:p>
+      <w:pPr>
+        <w:spacing w:after="240"/>
+        <w:jc w:val="center"/>
+      </w:pPr>
+      <w:r>
+        <w:rPr>
+          <w:i/>
+          <w:iCs/>
+          <w:color w:val="6B6A5F"/>
+          <w:sz w:val="18"/>
+          <w:szCs w:val="18"/>
+        </w:rPr>
+        <w:t>Screenshot — The order marked Delivered automatically when the animation ends: status pill "Delivered" and "Step 6 of 6 · Delivered". Personal details blurred.</w:t>
+      </w:r>
+    </w:p>
+    <w:p>
+      <w:pPr>
+        <w:spacing w:after="160"/>
+      </w:pPr>
+      <w:r>
+        <w:t>If you never open the order after pickup, nothing is lost: the platform completes the delivery by itself 20 seconds after pickup and sends the same single delivered email, so the order screen does not need to be open for delivery to complete. Either way an order is delivered exactly once.</w:t>
       </w:r>
     </w:p>
     <w:p>
@@ -2019,31 +2155,7 @@
         <w:spacing w:after="160"/>
       </w:pPr>
       <w:r>
-        <w:t>The Your active deliveries section lists the orders you have accepted that are not finished yet (status Partner assigned or On the way); with none it says "No active deliveries." Each card shows the order number, a status pill, the amount, the Pickup store and its address, the Drop-off details (see §4.5), and the items with photos. A single action button advances the order: Mark picked up while the order is Partner assigned. After you mark it picked up the order is On the way and the card shows "Customer is receiving the order…" in place of a button — there is no Mark delivered button. The customer's app plays a 15-second courier animation and then marks the order Delivered automatically (or the system does it 5 minutes after pickup if the customer never opens the order). There is no way to skip a step or move an order backward. A delivered order leaves this list and moves to History.</w:t>
-      </w:r>
-    </w:p>
-    <w:p>
-      <w:pPr>
-        <w:pStyle w:val="Heading2"/>
-      </w:pPr>
-      <w:r>
-        <w:t>4.5 Drop-off Details and History</w:t>
-      </w:r>
-    </w:p>
-    <w:p>
-      <w:pPr>
-        <w:spacing w:after="160"/>
-      </w:pPr>
-      <w:r>
-        <w:t>Once you have accepted an order, its active card shows the drop-off details: the recipient's name, their phone number (tap it to call when it is a normal +91 number), the full delivery address and the delivery note, if there is one. You can see a customer's phone and address only while the order is Partner assigned or On the way for you; the old View address button no longer exists because the details are shown directly on the card. This build has no Google Maps key configured, matching the Customer App's own coordinate-only tracking view.</w:t>
-      </w:r>
-    </w:p>
-    <w:p>
-      <w:pPr>
-        <w:spacing w:after="160"/>
-      </w:pPr>
-      <w:r>
-        <w:t>The History link in the dashboard header opens the History screen: your finished orders, newest first, up to your 50 most recent. Each card shows the pickup store, who the order was delivered to, when it happened and a short summary of the items — no phone number or address is shown for finished orders. A Refresh button reloads the list and a Back to dashboard link returns you to the dashboard; with nothing finished yet it says "No completed deliveries yet."</w:t>
+        <w:t>The Your active deliveries section lists the orders you have accepted that are not finished yet (status Partner assigned or On the way); with none it says "No active deliveries." Each card shows the order number, a status pill, the amount, the Pickup store and its address, the Drop-off details (see §4.5), and the items with photos. A single action button advances the order: Mark picked up while the order is Partner assigned. After you mark it picked up the order is On the way and the card shows "Customer is receiving the order…" in place of a button — there is no Mark delivered button. The customer's app plays a 15-second courier animation and then marks the order Delivered automatically (or the system does it 20 seconds after pickup if the customer never opens the order). There is no way to skip a step or move an order backward. A delivered order leaves this list and moves to History. (The first figure below shows an assigned delivery with the Mark picked up button; the second shows the same delivery after pickup.)</w:t>
       </w:r>
     </w:p>
     <w:p>
@@ -2054,8 +2166,8 @@
       <w:r>
         <w:drawing>
           <wp:inline xmlns:a="http://schemas.openxmlformats.org/drawingml/2006/main" xmlns:pic="http://schemas.openxmlformats.org/drawingml/2006/picture">
-            <wp:extent cx="2103120" cy="4558390"/>
-            <wp:docPr id="9006" name="Figure 9006"/>
+            <wp:extent cx="2103120" cy="3692687"/>
+            <wp:docPr id="9104" name="Picture 9104"/>
             <wp:cNvGraphicFramePr>
               <a:graphicFrameLocks noChangeAspect="1"/>
             </wp:cNvGraphicFramePr>
@@ -2063,11 +2175,11 @@
               <a:graphicData uri="http://schemas.openxmlformats.org/drawingml/2006/picture">
                 <pic:pic>
                   <pic:nvPicPr>
-                    <pic:cNvPr id="9006" name="wf_delivery_active.png"/>
+                    <pic:cNvPr id="0" name="fig_partner_assigned.png"/>
                     <pic:cNvPicPr/>
                   </pic:nvPicPr>
                   <pic:blipFill>
-                    <a:blip r:embed="rId13"/>
+                    <a:blip r:embed="rId26"/>
                     <a:stretch>
                       <a:fillRect/>
                     </a:stretch>
@@ -2075,7 +2187,7 @@
                   <pic:spPr>
                     <a:xfrm>
                       <a:off x="0" y="0"/>
-                      <a:ext cx="2103120" cy="4558390"/>
+                      <a:ext cx="2103120" cy="3692687"/>
                     </a:xfrm>
                     <a:prstGeom prst="rect"/>
                   </pic:spPr>
@@ -2099,7 +2211,31 @@
           <w:sz w:val="18"/>
           <w:szCs w:val="18"/>
         </w:rPr>
-        <w:t>Screenshot — Delivery dashboard with a Your active deliveries card (status Partner assigned): pickup store, drop-off details (recipient name and phone blurred here), items, and the Mark picked up button. Available orders shows "None right now." because the order was assigned to this partner automatically.</w:t>
+        <w:t>Screenshot — An assigned delivery on the partner dashboard, with the Mark picked up button. Drop-off details masked.</w:t>
+      </w:r>
+    </w:p>
+    <w:p>
+      <w:pPr>
+        <w:pStyle w:val="Heading2"/>
+      </w:pPr>
+      <w:r>
+        <w:t>4.5 Drop-off Details and History</w:t>
+      </w:r>
+    </w:p>
+    <w:p>
+      <w:pPr>
+        <w:spacing w:after="160"/>
+      </w:pPr>
+      <w:r>
+        <w:t>Once you have accepted an order, its active card shows the drop-off details: the recipient's name, their phone number (tap it to call when it is a normal +91 number), the full delivery address and the delivery note, if there is one. You can see a customer's phone and address only while the order is Partner assigned or On the way for you; the old View address button no longer exists because the details are shown directly on the card. This build has no Google Maps key configured, matching the Customer App's own coordinate-only tracking view.</w:t>
+      </w:r>
+    </w:p>
+    <w:p>
+      <w:pPr>
+        <w:spacing w:after="160"/>
+      </w:pPr>
+      <w:r>
+        <w:t>The History link in the dashboard header opens the History screen: your finished orders, newest first, up to your 50 most recent. Each card shows the pickup store, who the order was delivered to, when it happened and a short summary of the items — no phone number or address is shown for finished orders. A Refresh button reloads the list and a Back to dashboard link returns you to the dashboard; with nothing finished yet it says "No completed deliveries yet."</w:t>
       </w:r>
     </w:p>
     <w:p>
@@ -2110,7 +2246,7 @@
       <w:r>
         <w:drawing>
           <wp:inline xmlns:a="http://schemas.openxmlformats.org/drawingml/2006/main" xmlns:pic="http://schemas.openxmlformats.org/drawingml/2006/picture">
-            <wp:extent cx="2103120" cy="4558390"/>
+            <wp:extent cx="2103120" cy="3692687"/>
             <wp:docPr id="9101" name="Figure 9101"/>
             <wp:cNvGraphicFramePr>
               <a:graphicFrameLocks noChangeAspect="1"/>
@@ -2131,7 +2267,7 @@
                   <pic:spPr>
                     <a:xfrm>
                       <a:off x="0" y="0"/>
-                      <a:ext cx="2103120" cy="4558390"/>
+                      <a:ext cx="2103120" cy="3692687"/>
                     </a:xfrm>
                     <a:prstGeom prst="rect"/>
                   </pic:spPr>
@@ -2155,7 +2291,7 @@
           <w:sz w:val="18"/>
           <w:szCs w:val="18"/>
         </w:rPr>
-        <w:t>Screenshot — The same card after Mark picked up, captured with an earlier build (before version 4.1): status On the way, with a Mark delivered button (shown dimmed while the update is being sent). In the current app this button is replaced by the text "Customer is receiving the order…". Recipient name and phone blurred.</w:t>
+        <w:t>Screenshot — The active delivery after Mark picked up: status "On the way" and the note "Customer is receiving the order…". The partner has no further button; the customer's phone completes the delivery. Drop-off details masked.</w:t>
       </w:r>
     </w:p>
     <w:p>
@@ -2685,7 +2821,7 @@
           </w:tcPr>
           <w:p>
             <w:r>
-              <w:t>Delivery partners only mark an order picked up. After pickup, your order screen plays a 15-second courier animation ("Arriving in 15s") and the order is then marked Delivered automatically, and the delivered email is sent. If you never open the order, the system marks it Delivered 5 minutes after pickup. See §3.6.1.</w:t>
+              <w:t>Delivery partners only mark an order picked up. After pickup, your order screen plays a 15-second courier animation ("Arriving in 15s") and the order is then marked Delivered automatically, and the delivered email is sent. If you never open the order, the system marks it Delivered 20 seconds after pickup. See §3.6.1.</w:t>
             </w:r>
           </w:p>
         </w:tc>
@@ -2938,7 +3074,7 @@
           </w:tcPr>
           <w:p>
             <w:r>
-              <w:t>Tracker step 6 of 6. The order has been handed to the customer. Final state. It is set by the customer's app after the animation (or by the system 5 minutes after pickup); delivery partners cannot set it.</w:t>
+              <w:t>Tracker step 6 of 6. The order has been handed to the customer. Final state. It is set by the customer's app after the animation (or by the system 20 seconds after pickup); delivery partners cannot set it.</w:t>
             </w:r>
           </w:p>
         </w:tc>

</xml_diff>

<commit_message>
docs: add Ask Zippy chapter to both manuals, soften retention wording, extend eval
Web manual gets Chapter 8 and the mobile manual Chapter 6 (edited in place,
static TOCs renumbered, PDFs regenerated). The policy knowledge file now says
orders and chats "may be deleted after 30 days" since no deletion job exists,
and gives wrong-or-missing items its own heading so Zippy retrieves it. Five
policy cases added to the eval fixture (40/41). CLAUDE.md and MEMORY.md
updated; README needed no change.

Co-Authored-By: Claude Sonnet 5.5 <noreply@anthropic.com>
</commit_message>
<xml_diff>
--- a/docs/Mobile_App_User_Manual.docx
+++ b/docs/Mobile_App_User_Manual.docx
@@ -210,7 +210,7 @@
           <w:b/>
           <w:bCs/>
         </w:rPr>
-        <w:t xml:space="preserve">Appendix A — Order Status Reference</w:t>
+        <w:t>Chapter 6 — Ask Zippy</w:t>
       </w:r>
       <w:r>
         <w:tab/>
@@ -221,6 +221,28 @@
           <w:bCs/>
         </w:rPr>
         <w:t>29</w:t>
+      </w:r>
+    </w:p>
+    <w:p>
+      <w:pPr>
+        <w:spacing w:after="120"/>
+      </w:pPr>
+      <w:r>
+        <w:rPr>
+          <w:b/>
+          <w:bCs/>
+        </w:rPr>
+        <w:t xml:space="preserve">Appendix A — Order Status Reference</w:t>
+      </w:r>
+      <w:r>
+        <w:tab/>
+      </w:r>
+      <w:r>
+        <w:rPr>
+          <w:b/>
+          <w:bCs/>
+        </w:rPr>
+        <w:t>31</w:t>
       </w:r>
     </w:p>
     <w:p>
@@ -2827,6 +2849,203 @@
         </w:tc>
       </w:tr>
     </w:tbl>
+    <w:p>
+      <w:pPr>
+        <w:pStyle w:val="Heading1"/>
+        <w:pageBreakBefore/>
+      </w:pPr>
+      <w:r>
+        <w:t>Chapter 6 — Ask Zippy</w:t>
+      </w:r>
+    </w:p>
+    <w:p>
+      <w:pPr>
+        <w:pStyle w:val="Heading2"/>
+      </w:pPr>
+      <w:r>
+        <w:t>6.1 What Ask Zippy Is</w:t>
+      </w:r>
+    </w:p>
+    <w:p>
+      <w:pPr>
+        <w:spacing w:after="160"/>
+      </w:pPr>
+      <w:r>
+        <w:t>Ask Zippy is the platform's built-in help assistant. You type a question in plain words and Zippy answers it in a chat sheet, so you do not have to leave your order or search the manual. It is available in both the Customer App and the Delivery Partner App.</w:t>
+      </w:r>
+    </w:p>
+    <w:p>
+      <w:pPr>
+        <w:pStyle w:val="Heading2"/>
+      </w:pPr>
+      <w:r>
+        <w:t>6.2 Opening Zippy and Asking a Question</w:t>
+      </w:r>
+    </w:p>
+    <w:p>
+      <w:pPr>
+        <w:spacing w:after="160"/>
+      </w:pPr>
+      <w:r>
+        <w:t>An orange Ask Zippy button (marked with a lightning bolt) floats near the bottom-right of the Customer App and Delivery Partner App screens. Tap it to open the chat sheet, which slides up over the screen, and tap the close button to dismiss it. A new chat opens with a short welcome message and three suggested questions; tap one or type your own and send it. The whole answer appears at once after a moment, and it ends with a short note naming the guide it came from.</w:t>
+      </w:r>
+    </w:p>
+    <w:p>
+      <w:pPr>
+        <w:spacing w:after="80" w:before="120"/>
+        <w:jc w:val="center"/>
+      </w:pPr>
+      <w:r>
+        <w:drawing>
+          <wp:inline xmlns:a="http://schemas.openxmlformats.org/drawingml/2006/main" xmlns:pic="http://schemas.openxmlformats.org/drawingml/2006/picture">
+            <wp:extent cx="5715000" cy="3980852"/>
+            <wp:docPr id="9105" name="Picture 9105" descr="Customer App home with the Ask Zippy button, a new chat with suggested questions, and Zippy's answer to How do I place an order"/>
+            <wp:cNvGraphicFramePr>
+              <a:graphicFrameLocks noChangeAspect="1"/>
+            </wp:cNvGraphicFramePr>
+            <a:graphic>
+              <a:graphicData uri="http://schemas.openxmlformats.org/drawingml/2006/picture">
+                <pic:pic>
+                  <pic:nvPicPr>
+                    <pic:cNvPr id="0" name="zippy-mobile-fig.png"/>
+                    <pic:cNvPicPr/>
+                  </pic:nvPicPr>
+                  <pic:blipFill>
+                    <a:blip r:embed="rId27"/>
+                    <a:stretch>
+                      <a:fillRect/>
+                    </a:stretch>
+                  </pic:blipFill>
+                  <pic:spPr>
+                    <a:xfrm>
+                      <a:off x="0" y="0"/>
+                      <a:ext cx="5715000" cy="3980852"/>
+                    </a:xfrm>
+                    <a:prstGeom prst="rect"/>
+                  </pic:spPr>
+                </pic:pic>
+              </a:graphicData>
+            </a:graphic>
+          </wp:inline>
+        </w:drawing>
+      </w:r>
+    </w:p>
+    <w:p>
+      <w:pPr>
+        <w:spacing w:after="240"/>
+        <w:jc w:val="center"/>
+      </w:pPr>
+      <w:r>
+        <w:rPr>
+          <w:i/>
+          <w:iCs/>
+          <w:color w:val="6B6A5F"/>
+          <w:sz w:val="18"/>
+          <w:szCs w:val="18"/>
+        </w:rPr>
+        <w:t>Screenshot — Ask Zippy in the Customer App: the button on the Home tab (left), a new chat with suggested questions (middle) and Zippy's answer to "How do I place an order?" (right).</w:t>
+      </w:r>
+    </w:p>
+    <w:p>
+      <w:pPr>
+        <w:pStyle w:val="Heading2"/>
+      </w:pPr>
+      <w:r>
+        <w:t>6.3 Chats, History and New Chat</w:t>
+      </w:r>
+    </w:p>
+    <w:p>
+      <w:pPr>
+        <w:spacing w:after="160"/>
+      </w:pPr>
+      <w:r>
+        <w:t>Tap New chat to start a fresh conversation. When you are signed in, your chats are saved and a history button lets you see earlier chats and continue one. History is shared with the website, so a chat started there can be continued on your phone and the other way round.</w:t>
+      </w:r>
+    </w:p>
+    <w:p>
+      <w:pPr>
+        <w:pStyle w:val="Heading2"/>
+      </w:pPr>
+      <w:r>
+        <w:t>6.4 What it can and cannot do</w:t>
+      </w:r>
+    </w:p>
+    <w:p>
+      <w:pPr>
+        <w:spacing w:after="160"/>
+      </w:pPr>
+      <w:r>
+        <w:t>Zippy answers how-to questions about using Fresh &amp; Quick, such as placing an order, tracking it, what each order status means, payments, and managing your account. It answers from the platform's own guides and says which guide the answer came from. Zippy is role-aware: a customer is shown customer guides, and a vendor, delivery partner or admin is shown the guides for their own portal.</w:t>
+      </w:r>
+    </w:p>
+    <w:p>
+      <w:pPr>
+        <w:spacing w:after="160"/>
+      </w:pPr>
+      <w:r>
+        <w:t>Zippy cannot look up live information, such as a particular store's menu, today's prices or whether a store is open, and it cannot see your orders. It cannot place, change, cancel or pay for an order, and it never acts on your behalf. If the guides do not cover a question, Zippy says so instead of guessing.</w:t>
+      </w:r>
+    </w:p>
+    <w:p>
+      <w:pPr>
+        <w:pStyle w:val="Heading2"/>
+      </w:pPr>
+      <w:r>
+        <w:t>6.5 Limits, privacy and support</w:t>
+      </w:r>
+    </w:p>
+    <w:p>
+      <w:pPr>
+        <w:pStyle w:val="ListParagraph"/>
+        <w:numPr>
+          <w:ilvl w:val="0"/>
+          <w:numId w:val="2"/>
+        </w:numPr>
+        <w:spacing w:after="100"/>
+      </w:pPr>
+      <w:r>
+        <w:t>Each question can be up to 1,000 characters.</w:t>
+      </w:r>
+    </w:p>
+    <w:p>
+      <w:pPr>
+        <w:pStyle w:val="ListParagraph"/>
+        <w:numPr>
+          <w:ilvl w:val="0"/>
+          <w:numId w:val="2"/>
+        </w:numPr>
+        <w:spacing w:after="100"/>
+      </w:pPr>
+      <w:r>
+        <w:t>Signed-in users can send up to 20 questions per minute and 100 per day. Visitors are limited to 10 per minute and 40 per day. If you go over, Zippy asks you to wait a moment.</w:t>
+      </w:r>
+    </w:p>
+    <w:p>
+      <w:pPr>
+        <w:pStyle w:val="ListParagraph"/>
+        <w:numPr>
+          <w:ilvl w:val="0"/>
+          <w:numId w:val="2"/>
+        </w:numPr>
+        <w:spacing w:after="100"/>
+      </w:pPr>
+      <w:r>
+        <w:t>Your questions are sent to Anthropic (Claude) and OpenAI to produce the answer. Do not type passwords or card numbers into the chat.</w:t>
+      </w:r>
+    </w:p>
+    <w:p>
+      <w:pPr>
+        <w:pStyle w:val="ListParagraph"/>
+        <w:numPr>
+          <w:ilvl w:val="0"/>
+          <w:numId w:val="2"/>
+        </w:numPr>
+        <w:spacing w:after="100"/>
+      </w:pPr>
+      <w:r>
+        <w:t>Under the platform's policy, orders and saved Zippy chats may be deleted after 30 days. Deletion is not automatic, so to have your data deleted, or for a problem Zippy cannot solve, contact support at vishalshah1973@gmail.com or +919820020000.</w:t>
+      </w:r>
+    </w:p>
     <w:p>
       <w:pPr>
         <w:pStyle w:val="Heading1"/>

</xml_diff>

<commit_message>
docs: Zippy Z2 knowledge, manuals and project docs
Co-Authored-By: Claude Sonnet 5.5 <noreply@anthropic.com>
</commit_message>
<xml_diff>
--- a/docs/Mobile_App_User_Manual.docx
+++ b/docs/Mobile_App_User_Manual.docx
@@ -2951,7 +2951,75 @@
         <w:pStyle w:val="Heading2"/>
       </w:pPr>
       <w:r>
-        <w:t>6.3 Chats, History and New Chat</w:t>
+        <w:t>6.3 Asking about stores and menus</w:t>
+      </w:r>
+    </w:p>
+    <w:p>
+      <w:pPr>
+        <w:spacing w:after="160"/>
+      </w:pPr>
+      <w:r>
+        <w:t>Zippy can answer questions about stores and dishes using their current details. Examples: "Is Dosa Corner open right now?", "What does the Cheese Dosa cost?", "Which stores have free delivery?", "Which dishes have extra options?"</w:t>
+      </w:r>
+    </w:p>
+    <w:p>
+      <w:pPr>
+        <w:pStyle w:val="ListParagraph"/>
+        <w:numPr>
+          <w:ilvl w:val="0"/>
+          <w:numId w:val="2"/>
+        </w:numPr>
+        <w:spacing w:after="100"/>
+      </w:pPr>
+      <w:r>
+        <w:t>Prices, delivery fees and open or closed status are looked up when you ask and can change at any time, so check them again in the cart and at checkout before you pay.</w:t>
+      </w:r>
+    </w:p>
+    <w:p>
+      <w:pPr>
+        <w:pStyle w:val="ListParagraph"/>
+        <w:numPr>
+          <w:ilvl w:val="0"/>
+          <w:numId w:val="2"/>
+        </w:numPr>
+        <w:spacing w:after="100"/>
+      </w:pPr>
+      <w:r>
+        <w:t>The answer appears in one piece after Zippy has looked things up, not word by word, so a store question can take several seconds.</w:t>
+      </w:r>
+    </w:p>
+    <w:p>
+      <w:pPr>
+        <w:pStyle w:val="ListParagraph"/>
+        <w:numPr>
+          <w:ilvl w:val="0"/>
+          <w:numId w:val="2"/>
+        </w:numPr>
+        <w:spacing w:after="100"/>
+      </w:pPr>
+      <w:r>
+        <w:t>The mobile app does not have a delivery location yet, so Zippy cannot sort stores by distance there. You can still ask about ratings, delivery fees and which stores are open.</w:t>
+      </w:r>
+    </w:p>
+    <w:p>
+      <w:pPr>
+        <w:pStyle w:val="ListParagraph"/>
+        <w:numPr>
+          <w:ilvl w:val="0"/>
+          <w:numId w:val="2"/>
+        </w:numPr>
+        <w:spacing w:after="100"/>
+      </w:pPr>
+      <w:r>
+        <w:t>Zippy still cannot see or place orders, and it cannot pay for or change anything. For your orders, use the Orders tab or page.</w:t>
+      </w:r>
+    </w:p>
+    <w:p>
+      <w:pPr>
+        <w:pStyle w:val="Heading2"/>
+      </w:pPr>
+      <w:r>
+        <w:t>6.4 Chats, History and New Chat</w:t>
       </w:r>
     </w:p>
     <w:p>
@@ -2967,7 +3035,7 @@
         <w:pStyle w:val="Heading2"/>
       </w:pPr>
       <w:r>
-        <w:t>6.4 What it can and cannot do</w:t>
+        <w:t>6.5 What it can and cannot do</w:t>
       </w:r>
     </w:p>
     <w:p>
@@ -2983,7 +3051,7 @@
         <w:spacing w:after="160"/>
       </w:pPr>
       <w:r>
-        <w:t>Zippy cannot look up live information, such as a particular store's menu, today's prices or whether a store is open, and it cannot see your orders. It cannot place, change, cancel or pay for an order, and it never acts on your behalf. If the guides do not cover a question, Zippy says so instead of guessing.</w:t>
+        <w:t>Zippy can look up stores, dishes, prices, options and whether a store is open, using their current details (see the section on asking about stores and menus). It still cannot see your orders. It cannot place, change, cancel or pay for an order, and it never acts on your behalf. If the guides do not cover a question, Zippy says so instead of guessing.</w:t>
       </w:r>
     </w:p>
     <w:p>
@@ -2991,7 +3059,7 @@
         <w:pStyle w:val="Heading2"/>
       </w:pPr>
       <w:r>
-        <w:t>6.5 Limits, privacy and support</w:t>
+        <w:t>6.6 Limits, privacy and support</w:t>
       </w:r>
     </w:p>
     <w:p>

</xml_diff>

<commit_message>
feat: tighten Zippy rate limits and send phone location from the mobile app
Signed-in users now get 10/min and 60/day, visitors 5/min and 20/day per
IP, because one chat can cost up to five model calls. The global visitor
backstop is unchanged.

The mobile chat now sends the phone's foreground GPS fix so "nearest"
works there. Permission is requested only when the question is about
nearby stores, nothing is stored, and any failure sends no location.
Knowledge, the no-location tool note, the mobile manual (PDF regenerated)
and project docs updated. Both manuals' example "Which dishes have extra
options?" is replaced by a per-dish question.

Co-Authored-By: Claude Sonnet 5.5 <noreply@anthropic.com>
</commit_message>
<xml_diff>
--- a/docs/Mobile_App_User_Manual.docx
+++ b/docs/Mobile_App_User_Manual.docx
@@ -2959,7 +2959,7 @@
         <w:spacing w:after="160"/>
       </w:pPr>
       <w:r>
-        <w:t>Zippy can answer questions about stores and dishes using their current details. Examples: "Is Dosa Corner open right now?", "What does the Cheese Dosa cost?", "Which stores have free delivery?", "Which dishes have extra options?"</w:t>
+        <w:t>Zippy can answer questions about stores and dishes using their current details. Examples: "Is Dosa Corner open right now?", "What does the Cheese Dosa cost?", "Which stores have free delivery?", "What options does the Cheese Dosa have?"</w:t>
       </w:r>
     </w:p>
     <w:p>
@@ -2998,7 +2998,7 @@
         <w:spacing w:after="100"/>
       </w:pPr>
       <w:r>
-        <w:t>The mobile app does not have a delivery location yet, so Zippy cannot sort stores by distance there. You can still ask about ratings, delivery fees and which stores are open.</w:t>
+        <w:t>For questions about nearby stores, Zippy uses your phone’s location. The first time you ask, your phone asks permission to share it while the app is open; if you say no, Zippy cannot sort by distance but can still answer about ratings, delivery fees and which stores are open. The location is used only for that question and is not saved.</w:t>
       </w:r>
     </w:p>
     <w:p>

</xml_diff>

<commit_message>
docs: Ask Zippy Z3 in the manuals, README, CLAUDE.md and MEMORY.md
Co-Authored-By: Claude Sonnet 5.5 <noreply@anthropic.com>
</commit_message>
<xml_diff>
--- a/docs/Mobile_App_User_Manual.docx
+++ b/docs/Mobile_App_User_Manual.docx
@@ -3011,7 +3011,7 @@
         <w:spacing w:after="100"/>
       </w:pPr>
       <w:r>
-        <w:t>Zippy still cannot see or place orders, and it cannot pay for or change anything. For your orders, use the Orders tab or page.</w:t>
+        <w:t>Zippy can also look up your own orders when you are signed in as a customer and ask about them: the status, what was in the order, the totals, the payment, and the delivery details on it. Example: "Where is my order?" It cannot see anyone else's orders, and it cannot place, change, cancel or pay for an order. Order details are used only to answer the question you asked.</w:t>
       </w:r>
     </w:p>
     <w:p>
@@ -3051,7 +3051,7 @@
         <w:spacing w:after="160"/>
       </w:pPr>
       <w:r>
-        <w:t>Zippy can look up stores, dishes, prices, options and whether a store is open, using their current details (see the section on asking about stores and menus). It still cannot see your orders. It cannot place, change, cancel or pay for an order, and it never acts on your behalf. If the guides do not cover a question, Zippy says so instead of guessing.</w:t>
+        <w:t>Zippy can look up stores, dishes, prices, options and whether a store is open, using their current details (see the section on asking about stores and menus). When you are signed in as a customer it can also look up your own orders, and it cannot see anyone else's. It cannot place, change, cancel or pay for an order, and it never acts on your behalf. If the guides do not cover a question, Zippy says so instead of guessing.</w:t>
       </w:r>
     </w:p>
     <w:p>
@@ -3098,7 +3098,7 @@
         <w:spacing w:after="100"/>
       </w:pPr>
       <w:r>
-        <w:t>Your questions are sent to Anthropic (Claude) and OpenAI to produce the answer. Do not type passwords or card numbers into the chat.</w:t>
+        <w:t>Your questions are sent to Anthropic (Claude) and OpenAI to produce the answer. Do not type passwords or card numbers into the chat. When a question needs your order details, those details are sent too.</w:t>
       </w:r>
     </w:p>
     <w:p>

</xml_diff>

<commit_message>
docs: Ask Zippy Z4a in the manuals, README, CLAUDE.md and MEMORY.md
Manuals edited in place (web v3.4, mobile v4.5) with the cart-action
section; PDFs regenerated, mobile Appendix A TOC line renumbered.
Project docs record the Z4a build, live results, the three live-found
defects as rules, and fix stale Z2/Z3 merge status.

Co-Authored-By: Claude Sonnet 5.5 <noreply@anthropic.com>
</commit_message>
<xml_diff>
--- a/docs/Mobile_App_User_Manual.docx
+++ b/docs/Mobile_App_User_Manual.docx
@@ -67,7 +67,7 @@
           <w:sz w:val="22"/>
           <w:szCs w:val="22"/>
         </w:rPr>
-        <w:t>Version 4.4 — Customer-completed delivery, real phone figures</w:t>
+        <w:t>Version 4.5 – Ask Zippy can change your cart</w:t>
       </w:r>
     </w:p>
     <w:p>
@@ -79,7 +79,7 @@
           <w:sz w:val="22"/>
           <w:szCs w:val="22"/>
         </w:rPr>
-        <w:t>2 October 2026</w:t>
+        <w:t>4 October 2026</w:t>
       </w:r>
     </w:p>
     <w:p>
@@ -242,7 +242,7 @@
           <w:b/>
           <w:bCs/>
         </w:rPr>
-        <w:t>31</w:t>
+        <w:t>32</w:t>
       </w:r>
     </w:p>
     <w:p>
@@ -365,7 +365,7 @@
         <w:spacing w:after="160"/>
       </w:pPr>
       <w:r>
-        <w:t>What's new for version 4.4: if the customer never opens the order, the system now marks it Delivered 20 seconds after pickup (it was 5 minutes), and the order screen does not need to be open for that to happen; the "Delivered! Enjoy your meal." modal no longer has a Done button and closes itself 3 seconds after it shows (a Close button appears only if delivery could not be confirmed). An older duplicate screenshot of the partner dashboard was removed from section 4.5.</w:t>
+        <w:t>What's new for version 4.5: Ask Zippy can change your cart. Signed in as a customer, you can ask Zippy to add a dish, repeat a past order, change a quantity, remove a line or empty the cart, and tap Confirm on a card to apply it (section 6.3); Zippy still does not place or pay for orders. This edition has no new screenshot for the cards. What's new for version 4.4: if the customer never opens the order, the system now marks it Delivered 20 seconds after pickup (it was 5 minutes), and the order screen does not need to be open for that to happen; the "Delivered! Enjoy your meal." modal no longer has a Done button and closes itself 3 seconds after it shows (a Close button appears only if delivery could not be confirmed). An older duplicate screenshot of the partner dashboard was removed from section 4.5.</w:t>
       </w:r>
     </w:p>
     <w:p>
@@ -3016,6 +3016,45 @@
     </w:p>
     <w:p>
       <w:pPr>
+        <w:pStyle w:val="ListParagraph"/>
+        <w:numPr>
+          <w:ilvl w:val="0"/>
+          <w:numId w:val="2"/>
+        </w:numPr>
+        <w:spacing w:after="100"/>
+      </w:pPr>
+      <w:r>
+        <w:t>When you are signed in as a customer, Zippy can also change your cart for you. Ask, for example, "Add two Cheese Dosas to my cart", "Order what I had last time", "Make the Cheese Dosa three", "Remove the lassi" or "Empty my cart". Zippy does not change the cart by itself: it shows a card describing the change, and nothing happens until you tap Confirm. Tap Dismiss to ignore the card. Each card can be confirmed once.</w:t>
+      </w:r>
+    </w:p>
+    <w:p>
+      <w:pPr>
+        <w:pStyle w:val="ListParagraph"/>
+        <w:numPr>
+          <w:ilvl w:val="0"/>
+          <w:numId w:val="2"/>
+        </w:numPr>
+        <w:spacing w:after="100"/>
+      </w:pPr>
+      <w:r>
+        <w:t>Adding from a different store than the one already in your cart replaces the cart when you confirm, and the card says so beforehand, for example "Confirming replaces the 3 items from Dosa Corner in your cart." Closed or suspended stores and unavailable dishes are refused; when you ask to repeat a past order, unavailable dishes are skipped and listed. Quantities are 1 to 20, a reply shows at most 3 cards, and for a dish with a required choice (such as a size) Zippy asks which option you want before showing the card.</w:t>
+      </w:r>
+    </w:p>
+    <w:p>
+      <w:pPr>
+        <w:pStyle w:val="ListParagraph"/>
+        <w:numPr>
+          <w:ilvl w:val="0"/>
+          <w:numId w:val="2"/>
+        </w:numPr>
+        <w:spacing w:after="100"/>
+      </w:pPr>
+      <w:r>
+        <w:t>Zippy does not place, pay for or cancel orders and does not edit the order note. After confirming a change you still review the cart and check out yourself. Cart changes are available only to signed-in customers; visitors, stores, delivery partners and admins get none. Confirm works anywhere in the Customer App.</w:t>
+      </w:r>
+    </w:p>
+    <w:p>
+      <w:pPr>
         <w:pStyle w:val="Heading2"/>
       </w:pPr>
       <w:r>
@@ -3051,7 +3090,7 @@
         <w:spacing w:after="160"/>
       </w:pPr>
       <w:r>
-        <w:t>Zippy can look up stores, dishes, prices, options and whether a store is open, using their current details (see the section on asking about stores and menus). When you are signed in as a customer it can also look up your own orders, and it cannot see anyone else's. It cannot place, change, cancel or pay for an order, and it never acts on your behalf. If the guides do not cover a question, Zippy says so instead of guessing.</w:t>
+        <w:t>Zippy can look up stores, dishes, prices, options and whether a store is open, using their current details (see the section on asking about stores and menus). When you are signed in as a customer it can also look up your own orders, and it cannot see anyone else's. It cannot place, change, cancel or pay for an order. The only thing it can change is your cart, and only after you tap Confirm on a card (see section 6.3). If the guides do not cover a question, Zippy says so instead of guessing.</w:t>
       </w:r>
     </w:p>
     <w:p>

</xml_diff>

<commit_message>
docs: Ask Zippy Z4b (go to checkout card) in the manuals, README, CLAUDE.md and MEMORY.md
Web manual v3.5, mobile manual v4.6 (edited in place, no TOC page changes).

Co-Authored-By: Claude Sonnet 5.5 <noreply@anthropic.com>
</commit_message>
<xml_diff>
--- a/docs/Mobile_App_User_Manual.docx
+++ b/docs/Mobile_App_User_Manual.docx
@@ -67,7 +67,7 @@
           <w:sz w:val="22"/>
           <w:szCs w:val="22"/>
         </w:rPr>
-        <w:t>Version 4.5 – Ask Zippy can change your cart</w:t>
+        <w:t>Version 4.6 – Ask Zippy can take you to checkout</w:t>
       </w:r>
     </w:p>
     <w:p>
@@ -365,7 +365,7 @@
         <w:spacing w:after="160"/>
       </w:pPr>
       <w:r>
-        <w:t>What's new for version 4.5: Ask Zippy can change your cart. Signed in as a customer, you can ask Zippy to add a dish, repeat a past order, change a quantity, remove a line or empty the cart, and tap Confirm on a card to apply it (section 6.3); Zippy still does not place or pay for orders. This edition has no new screenshot for the cards. What's new for version 4.4: if the customer never opens the order, the system now marks it Delivered 20 seconds after pickup (it was 5 minutes), and the order screen does not need to be open for that to happen; the "Delivered! Enjoy your meal." modal no longer has a Done button and closes itself 3 seconds after it shows (a Close button appears only if delivery could not be confirmed). An older duplicate screenshot of the partner dashboard was removed from section 4.5.</w:t>
+        <w:t>What's new for version 4.6: Ask Zippy can take you to checkout. Signed in as a customer, ask Zippy to check out and tap the Go to checkout card to open the Checkout screen for your current cart (section 6.3); you still enter your details and pay yourself, and Zippy never places or pays for an order. What's new for version 4.5: Ask Zippy can change your cart. Signed in as a customer, you can ask Zippy to add a dish, repeat a past order, change a quantity, remove a line or empty the cart, and tap Confirm on a card to apply it (section 6.3); this edition has no new screenshot for the cards. What's new for version 4.4: if the customer never opens the order, the system now marks it Delivered 20 seconds after pickup (it was 5 minutes), and the order screen does not need to be open for that to happen; the "Delivered! Enjoy your meal." modal no longer has a Done button and closes itself 3 seconds after it shows (a Close button appears only if delivery could not be confirmed). An older duplicate screenshot of the partner dashboard was removed from section 4.5.</w:t>
       </w:r>
     </w:p>
     <w:p>
@@ -3050,7 +3050,20 @@
         <w:spacing w:after="100"/>
       </w:pPr>
       <w:r>
-        <w:t>Zippy does not place, pay for or cancel orders and does not edit the order note. After confirming a change you still review the cart and check out yourself. Cart changes are available only to signed-in customers; visitors, stores, delivery partners and admins get none. Confirm works anywhere in the Customer App.</w:t>
+        <w:t>Zippy does not place, pay for or cancel orders and does not edit the order note. After confirming a change you still review the cart and check out yourself (or ask Zippy for the Go to checkout card, below). Cart changes are available only to signed-in customers; visitors, stores, delivery partners and admins get none. Confirm works anywhere in the Customer App.</w:t>
+      </w:r>
+    </w:p>
+    <w:p>
+      <w:pPr>
+        <w:pStyle w:val="ListParagraph"/>
+        <w:numPr>
+          <w:ilvl w:val="0"/>
+          <w:numId w:val="2"/>
+        </w:numPr>
+        <w:spacing w:after="100"/>
+      </w:pPr>
+      <w:r>
+        <w:t>Checkout from chat: when you are signed in as a customer, ask Zippy to check out, for example "Check out for me" or "Take me to checkout", and it shows a Go to checkout card. Tap it once and the chat sheet closes and the Checkout screen opens for your current cart. Zippy refuses, with no card, if your cart is empty, the store is closed or suspended, or a dish is unavailable. You enter your own name, contact details and delivery address and pay on the Checkout screen; Zippy never places or pays for an order and never asks for those details or card numbers. If your cart changed to a different store after the card was shown, the card says "Your cart changed, ask me again."</w:t>
       </w:r>
     </w:p>
     <w:p>
@@ -3090,7 +3103,7 @@
         <w:spacing w:after="160"/>
       </w:pPr>
       <w:r>
-        <w:t>Zippy can look up stores, dishes, prices, options and whether a store is open, using their current details (see the section on asking about stores and menus). When you are signed in as a customer it can also look up your own orders, and it cannot see anyone else's. It cannot place, change, cancel or pay for an order. The only thing it can change is your cart, and only after you tap Confirm on a card (see section 6.3). If the guides do not cover a question, Zippy says so instead of guessing.</w:t>
+        <w:t>Zippy can look up stores, dishes, prices, options and whether a store is open, using their current details (see the section on asking about stores and menus). When you are signed in as a customer it can also look up your own orders, and it cannot see anyone else's. It cannot place, change, cancel or pay for an order. The only thing it can change is your cart, and only after you tap Confirm on a card, and it can open the Checkout screen for you with a Go to checkout card (see section 6.3). If the guides do not cover a question, Zippy says so instead of guessing.</w:t>
       </w:r>
     </w:p>
     <w:p>

</xml_diff>

<commit_message>
docs: Ask Zippy streaming in the manuals (web v3.6, mobile v4.7), knowledge, README, CLAUDE.md and MEMORY.md
Co-Authored-By: Claude Sonnet 5.5 <noreply@anthropic.com>
</commit_message>
<xml_diff>
--- a/docs/Mobile_App_User_Manual.docx
+++ b/docs/Mobile_App_User_Manual.docx
@@ -67,7 +67,7 @@
           <w:sz w:val="22"/>
           <w:szCs w:val="22"/>
         </w:rPr>
-        <w:t>Version 4.6 – Ask Zippy can take you to checkout</w:t>
+        <w:t>Version 4.7 – Ask Zippy answers appear word by word</w:t>
       </w:r>
     </w:p>
     <w:p>
@@ -366,6 +366,14 @@
       </w:pPr>
       <w:r>
         <w:t>What's new for version 4.6: Ask Zippy can take you to checkout. Signed in as a customer, ask Zippy to check out and tap the Go to checkout card to open the Checkout screen for your current cart (section 6.3); you still enter your details and pay yourself, and Zippy never places or pays for an order. What's new for version 4.5: Ask Zippy can change your cart. Signed in as a customer, you can ask Zippy to add a dish, repeat a past order, change a quantity, remove a line or empty the cart, and tap Confirm on a card to apply it (section 6.3); this edition has no new screenshot for the cards. What's new for version 4.4: if the customer never opens the order, the system now marks it Delivered 20 seconds after pickup (it was 5 minutes), and the order screen does not need to be open for that to happen; the "Delivered! Enjoy your meal." modal no longer has a Done button and closes itself 3 seconds after it shows (a Close button appears only if delivery could not be confirmed). An older duplicate screenshot of the partner dashboard was removed from section 4.5.</w:t>
+      </w:r>
+    </w:p>
+    <w:p>
+      <w:pPr>
+        <w:spacing w:after="160"/>
+      </w:pPr>
+      <w:r>
+        <w:t>What's new for version 4.7: Ask Zippy answers now appear word by word as they are written, instead of all at once at the end. When Zippy needs to look something up, a short lead-in line may appear and then disappear before the real answer; the Confirm, Dismiss and Go to checkout cards appear once the answer has finished.</w:t>
       </w:r>
     </w:p>
     <w:p>
@@ -2887,7 +2895,7 @@
         <w:spacing w:after="160"/>
       </w:pPr>
       <w:r>
-        <w:t>An orange Ask Zippy button (marked with a lightning bolt) floats near the bottom-right of the Customer App and Delivery Partner App screens. Tap it to open the chat sheet, which slides up over the screen, and tap the close button to dismiss it. A new chat opens with a short welcome message and three suggested questions; tap one or type your own and send it. The whole answer appears at once after a moment, and it ends with a short note naming the guide it came from.</w:t>
+        <w:t>An orange Ask Zippy button (marked with a lightning bolt) floats near the bottom-right of the Customer App and Delivery Partner App screens. Tap it to open the chat sheet, which slides up over the screen, and tap the close button to dismiss it. A new chat opens with a short welcome message and three suggested questions; tap one or type your own and send it. The answer appears word by word as Zippy writes it, and it ends with a short note naming the guide it came from.</w:t>
       </w:r>
     </w:p>
     <w:p>
@@ -2985,7 +2993,7 @@
         <w:spacing w:after="100"/>
       </w:pPr>
       <w:r>
-        <w:t>The answer appears in one piece after Zippy has looked things up, not word by word, so a store question can take several seconds.</w:t>
+        <w:t>When Zippy needs to look up store details, a short lead-in line may appear and then disappear before the real answer starts appearing word by word, so a store question can still take a few seconds to begin. Any card appears when the answer has finished. If you close the chat while an answer is still being written, that answer is not saved.</w:t>
       </w:r>
     </w:p>
     <w:p>

</xml_diff>

<commit_message>
docs: Zippy chat retention policy text, manuals (v3.5.1 / v4.6.1), README, CLAUDE.md, MEMORY.md
Co-Authored-By: Claude Sonnet 5.5 <noreply@anthropic.com>
</commit_message>
<xml_diff>
--- a/docs/Mobile_App_User_Manual.docx
+++ b/docs/Mobile_App_User_Manual.docx
@@ -67,7 +67,7 @@
           <w:sz w:val="22"/>
           <w:szCs w:val="22"/>
         </w:rPr>
-        <w:t>Version 4.6 – Ask Zippy can take you to checkout</w:t>
+        <w:t>Version 4.6.1 – Ask Zippy can take you to checkout</w:t>
       </w:r>
     </w:p>
     <w:p>
@@ -3163,7 +3163,7 @@
         <w:spacing w:after="100"/>
       </w:pPr>
       <w:r>
-        <w:t>Under the platform's policy, orders and saved Zippy chats may be deleted after 30 days. Deletion is not automatic, so to have your data deleted, or for a problem Zippy cannot solve, contact support at vishalshah1973@gmail.com or +919820020000.</w:t>
+        <w:t>Under the platform's policy, saved Zippy chats are deleted automatically 30 days after their last message. Orders are kept, and may be deleted on request. To have your orders deleted, or for a problem Zippy cannot solve, contact support at vishalshah1973@gmail.com or +919820020000.</w:t>
       </w:r>
     </w:p>
     <w:p>

</xml_diff>

<commit_message>
docs: Zippy rate limits and public deployment checklist, manuals' limits corrected
Co-Authored-By: Claude Sonnet 5.5 <noreply@anthropic.com>
</commit_message>
<xml_diff>
--- a/docs/Mobile_App_User_Manual.docx
+++ b/docs/Mobile_App_User_Manual.docx
@@ -67,7 +67,7 @@
           <w:sz w:val="22"/>
           <w:szCs w:val="22"/>
         </w:rPr>
-        <w:t>Version 4.6 – Ask Zippy can take you to checkout</w:t>
+        <w:t>Version 4.6.2 – Ask Zippy can take you to checkout</w:t>
       </w:r>
     </w:p>
     <w:p>
@@ -3137,7 +3137,7 @@
         <w:spacing w:after="100"/>
       </w:pPr>
       <w:r>
-        <w:t>Signed-in users can send up to 20 questions per minute and 100 per day. Visitors are limited to 10 per minute and 40 per day. If you go over, Zippy asks you to wait a moment.</w:t>
+        <w:t>By default, signed-in users can send up to 10 questions per minute and 60 per day, and visitors are limited to 5 per minute and 20 per day (the site owner can change these). If you go over, Zippy tells you how many seconds to wait, or to try again tomorrow; if Zippy is busy for everyone, it asks you to try again in a few minutes.</w:t>
       </w:r>
     </w:p>
     <w:p>

</xml_diff>

<commit_message>
docs(zippy): order note knowledge, eval cases, manuals, local-only and npm audit notes (Z5 task 5)
Co-Authored-By: Claude Sonnet 5.5 <noreply@anthropic.com>
</commit_message>
<xml_diff>
--- a/docs/Mobile_App_User_Manual.docx
+++ b/docs/Mobile_App_User_Manual.docx
@@ -67,7 +67,7 @@
           <w:sz w:val="22"/>
           <w:szCs w:val="22"/>
         </w:rPr>
-        <w:t>Version 4.7 – Ask Zippy answers appear word by word</w:t>
+        <w:t>Version 4.7.1 – Ask Zippy answers appear word by word</w:t>
       </w:r>
     </w:p>
     <w:p>
@@ -3058,7 +3058,7 @@
         <w:spacing w:after="100"/>
       </w:pPr>
       <w:r>
-        <w:t>Zippy does not place, pay for or cancel orders and does not edit the order note. After confirming a change you still review the cart and check out yourself (or ask Zippy for the Go to checkout card, below). Cart changes are available only to signed-in customers; visitors, stores, delivery partners and admins get none. Confirm works anywhere in the Customer App.</w:t>
+        <w:t>Zippy does not place, pay for or cancel orders. (Order notes are covered below.) After confirming a change you still review the cart and check out yourself (or ask Zippy for the Go to checkout card, below). Cart changes are available only to signed-in customers; visitors, stores, delivery partners and admins get none. Confirm works anywhere in the Customer App.</w:t>
       </w:r>
     </w:p>
     <w:p>
@@ -3072,6 +3072,19 @@
       </w:pPr>
       <w:r>
         <w:t>Checkout from chat: when you are signed in as a customer, ask Zippy to check out, for example "Check out for me" or "Take me to checkout", and it shows a Go to checkout card. Tap it once and the chat sheet closes and the Checkout screen opens for your current cart. Zippy refuses, with no card, if your cart is empty, the store is closed or suspended, or a dish is unavailable. You enter your own name, contact details and delivery address and pay on the Checkout screen; Zippy never places or pays for an order and never asks for those details or card numbers. If your cart changed to a different store after the card was shown, the card says "Your cart changed, ask me again."</w:t>
+      </w:r>
+    </w:p>
+    <w:p>
+      <w:pPr>
+        <w:pStyle w:val="ListParagraph"/>
+        <w:numPr>
+          <w:ilvl w:val="0"/>
+          <w:numId w:val="2"/>
+        </w:numPr>
+        <w:spacing w:after="100"/>
+      </w:pPr>
+      <w:r>
+        <w:t>Order note from chat: when you are signed in as a customer and your cart is not empty, ask Zippy to add, change or remove a note for the store, for example "No onions please". Zippy shows a card with the exact note and nothing changes until you tap Confirm. The note is the order's delivery note, so the store and the delivery partner can read it. It can be at most 500 characters; a longer note is refused, not cut, so shorten it and ask again. Double quotes in the note are saved as single quotes, and Zippy uses only your own words. If your cart changed after the card appeared, the tap says "Your cart changed, ask me again." If confirming fails unexpectedly, a Try again button appears. Option prices now show on cards, for example "Spice level: Extra spicy (+₹20)".</w:t>
       </w:r>
     </w:p>
     <w:p>

</xml_diff>

<commit_message>
docs(zippy): manuals name the 3.6.1 / 4.7.1 changes in subtitle and what's-new (Z5 review M10)
Co-Authored-By: Claude Sonnet 5.5 <noreply@anthropic.com>
</commit_message>
<xml_diff>
--- a/docs/Mobile_App_User_Manual.docx
+++ b/docs/Mobile_App_User_Manual.docx
@@ -67,7 +67,7 @@
           <w:sz w:val="22"/>
           <w:szCs w:val="22"/>
         </w:rPr>
-        <w:t>Version 4.7.1 – Ask Zippy answers appear word by word</w:t>
+        <w:t>Version 4.7.1 – Ask Zippy can set your order note, cards show option prices, and a Try again button appears after an error</w:t>
       </w:r>
     </w:p>
     <w:p>
@@ -374,6 +374,14 @@
       </w:pPr>
       <w:r>
         <w:t>What's new for version 4.7: Ask Zippy answers now appear word by word as they are written, instead of all at once at the end. When Zippy needs to look something up, a short lead-in line may appear and then disappear before the real answer; the Confirm, Dismiss and Go to checkout cards appear once the answer has finished.</w:t>
+      </w:r>
+    </w:p>
+    <w:p>
+      <w:pPr>
+        <w:spacing w:after="160"/>
+      </w:pPr>
+      <w:r>
+        <w:t>What's new for version 4.7.1: Ask Zippy can now set, replace or clear your order note after you confirm a card (see the order note item in the Ask Zippy chapter). Cards now show option prices, for example "Spice level: Extra spicy (+₹20)", and a Try again button appears when confirming fails with an unexpected error.</w:t>
       </w:r>
     </w:p>
     <w:p>
@@ -3084,7 +3092,7 @@
         <w:spacing w:after="100"/>
       </w:pPr>
       <w:r>
-        <w:t>Order note from chat: when you are signed in as a customer and your cart is not empty, ask Zippy to add, change or remove a note for the store, for example "No onions please". Zippy shows a card with the exact note and nothing changes until you tap Confirm. The note is the order's delivery note, so the store and the delivery partner can read it. It can be at most 500 characters; a longer note is refused, not cut, so shorten it and ask again. Double quotes in the note are saved as single quotes, and Zippy uses only your own words. If your cart changed after the card appeared, the tap says "Your cart changed, ask me again." If confirming fails unexpectedly, a Try again button appears. Option prices now show on cards, for example "Spice level: Extra spicy (+₹20)".</w:t>
+        <w:t>Order note from chat: when you are signed in as a customer and your cart is not empty, ask Zippy to add, change or remove a note for the store, for example "No onions please". Zippy shows a card with the exact note and nothing changes until you tap Confirm. The note is the order's delivery note, so the store and the delivery partner can read it. It can be at most 500 characters; a longer note is refused, not cut, so shorten it and ask again. Double quotes in the note are saved as single quotes, and Zippy uses only your own words. If your cart changed after the card appeared, the tap says "Your cart changed, ask me again."</w:t>
       </w:r>
     </w:p>
     <w:p>

</xml_diff>

<commit_message>
docs(maps): phone map in knowledge, manuals (mobile v4.8) and project notes
Co-Authored-By: Claude Sonnet 5.5 <noreply@anthropic.com>
</commit_message>
<xml_diff>
--- a/docs/Mobile_App_User_Manual.docx
+++ b/docs/Mobile_App_User_Manual.docx
@@ -67,7 +67,7 @@
           <w:sz w:val="22"/>
           <w:szCs w:val="22"/>
         </w:rPr>
-        <w:t>Version 4.7.1 – Ask Zippy can set your order note, cards show option prices, and a Try again button appears after an error</w:t>
+        <w:t>Version 4.8 – Ask Zippy can set your order note, cards show option prices, and a Try again button appears after an error</w:t>
       </w:r>
     </w:p>
     <w:p>
@@ -1495,7 +1495,7 @@
         <w:spacing w:after="160"/>
       </w:pPr>
       <w:r>
-        <w:t>While a partner is assigned or on the way, a bordered box below the courier card shows their last-known coordinates as plain text (e.g. “12.9716, 77.5946”) with a timestamp, and an explicit “Live map coming soon” line — there is no Google Maps key configured, so this is a coordinate readout, not an interactive map. The whole detail screen refreshes automatically every 3 seconds while it's open, and stops refreshing once the order reaches a final status (Delivered, Cancelled or Rejected).</w:t>
+        <w:t>While a partner is assigned or on the way, a map below the courier card shows the store (S), your delivery address (H) and, once the partner has reported a position, the partner (D), joined by a dashed straight line. Under it the screen says when the position was last updated and about how far the partner is from your address; a position older than 5 minutes is marked as possibly out of date. The distance is a straight-line estimate, not the road route, and there is no arrival time on the phone. After delivery the map stays as a final store-to-address view. The map is drawn by the phone's own maps (Apple Maps on iPhone, Google Maps on Android); if it cannot be shown, the partner's coordinates are shown as text instead. The whole detail screen refreshes automatically every 3 seconds while it's open, and stops refreshing once the order reaches a final status (Delivered, Cancelled or Rejected).</w:t>
       </w:r>
     </w:p>
     <w:p>

</xml_diff>